<commit_message>
Add ER diagram; refresh report (with ER diagram + populated TOC) and deck
</commit_message>
<xml_diff>
--- a/submission/P19_Team19_5BTCSB.docx
+++ b/submission/P19_Team19_5BTCSB.docx
@@ -1323,7 +1323,7 @@
       <w:pPr>
         <w:pStyle w:val="Heading1"/>
       </w:pPr>
-      <w:bookmarkStart w:id="0" w:name="_Toc239870682"/>
+      <w:bookmarkStart w:id="0" w:name="_Toc239915155"/>
       <w:r>
         <w:t>Table of Contents</w:t>
       </w:r>
@@ -1332,7 +1332,7 @@
     <w:sdt>
       <w:sdtPr>
         <w:alias w:val="Table of Contents"/>
-        <w:id w:val="-1186895273"/>
+        <w:id w:val="-1072348088"/>
       </w:sdtPr>
       <w:sdtEndPr/>
       <w:sdtContent>
@@ -1360,7 +1360,7 @@
           <w:r>
             <w:fldChar w:fldCharType="separate"/>
           </w:r>
-          <w:hyperlink w:anchor="_Toc239870682" w:history="1">
+          <w:hyperlink w:anchor="_Toc239915155" w:history="1">
             <w:r>
               <w:rPr>
                 <w:rStyle w:val="Hyperlink"/>
@@ -1384,7 +1384,7 @@
               <w:rPr>
                 <w:noProof/>
               </w:rPr>
-              <w:instrText xml:space="preserve"> PAGEREF _Toc239870682 \h </w:instrText>
+              <w:instrText xml:space="preserve"> PAGEREF _Toc239915155 \h </w:instrText>
             </w:r>
             <w:r>
               <w:rPr>
@@ -1426,7 +1426,7 @@
               <w14:ligatures w14:val="standardContextual"/>
             </w:rPr>
           </w:pPr>
-          <w:hyperlink w:anchor="_Toc239870683" w:history="1">
+          <w:hyperlink w:anchor="_Toc239915156" w:history="1">
             <w:r>
               <w:rPr>
                 <w:rStyle w:val="Hyperlink"/>
@@ -1450,7 +1450,7 @@
               <w:rPr>
                 <w:noProof/>
               </w:rPr>
-              <w:instrText xml:space="preserve"> PAGEREF _Toc239870683 \h </w:instrText>
+              <w:instrText xml:space="preserve"> PAGEREF _Toc239915156 \h </w:instrText>
             </w:r>
             <w:r>
               <w:rPr>
@@ -1492,7 +1492,7 @@
               <w14:ligatures w14:val="standardContextual"/>
             </w:rPr>
           </w:pPr>
-          <w:hyperlink w:anchor="_Toc239870684" w:history="1">
+          <w:hyperlink w:anchor="_Toc239915157" w:history="1">
             <w:r>
               <w:rPr>
                 <w:rStyle w:val="Hyperlink"/>
@@ -1516,7 +1516,7 @@
               <w:rPr>
                 <w:noProof/>
               </w:rPr>
-              <w:instrText xml:space="preserve"> PAGEREF _Toc239870684 \h </w:instrText>
+              <w:instrText xml:space="preserve"> PAGEREF _Toc239915157 \h </w:instrText>
             </w:r>
             <w:r>
               <w:rPr>
@@ -1558,7 +1558,7 @@
               <w14:ligatures w14:val="standardContextual"/>
             </w:rPr>
           </w:pPr>
-          <w:hyperlink w:anchor="_Toc239870685" w:history="1">
+          <w:hyperlink w:anchor="_Toc239915158" w:history="1">
             <w:r>
               <w:rPr>
                 <w:rStyle w:val="Hyperlink"/>
@@ -1582,7 +1582,7 @@
               <w:rPr>
                 <w:noProof/>
               </w:rPr>
-              <w:instrText xml:space="preserve"> PAGEREF _Toc239870685 \h </w:instrText>
+              <w:instrText xml:space="preserve"> PAGEREF _Toc239915158 \h </w:instrText>
             </w:r>
             <w:r>
               <w:rPr>
@@ -1624,7 +1624,7 @@
               <w14:ligatures w14:val="standardContextual"/>
             </w:rPr>
           </w:pPr>
-          <w:hyperlink w:anchor="_Toc239870686" w:history="1">
+          <w:hyperlink w:anchor="_Toc239915159" w:history="1">
             <w:r>
               <w:rPr>
                 <w:rStyle w:val="Hyperlink"/>
@@ -1648,7 +1648,7 @@
               <w:rPr>
                 <w:noProof/>
               </w:rPr>
-              <w:instrText xml:space="preserve"> PAGEREF _Toc239870686 \h </w:instrText>
+              <w:instrText xml:space="preserve"> PAGEREF _Toc239915159 \h </w:instrText>
             </w:r>
             <w:r>
               <w:rPr>
@@ -1690,7 +1690,7 @@
               <w14:ligatures w14:val="standardContextual"/>
             </w:rPr>
           </w:pPr>
-          <w:hyperlink w:anchor="_Toc239870687" w:history="1">
+          <w:hyperlink w:anchor="_Toc239915160" w:history="1">
             <w:r>
               <w:rPr>
                 <w:rStyle w:val="Hyperlink"/>
@@ -1714,7 +1714,7 @@
               <w:rPr>
                 <w:noProof/>
               </w:rPr>
-              <w:instrText xml:space="preserve"> PAGEREF _Toc239870687 \h </w:instrText>
+              <w:instrText xml:space="preserve"> PAGEREF _Toc239915160 \h </w:instrText>
             </w:r>
             <w:r>
               <w:rPr>
@@ -1756,7 +1756,7 @@
               <w14:ligatures w14:val="standardContextual"/>
             </w:rPr>
           </w:pPr>
-          <w:hyperlink w:anchor="_Toc239870688" w:history="1">
+          <w:hyperlink w:anchor="_Toc239915161" w:history="1">
             <w:r>
               <w:rPr>
                 <w:rStyle w:val="Hyperlink"/>
@@ -1780,7 +1780,7 @@
               <w:rPr>
                 <w:noProof/>
               </w:rPr>
-              <w:instrText xml:space="preserve"> PAGEREF _Toc239870688 \h </w:instrText>
+              <w:instrText xml:space="preserve"> PAGEREF _Toc239915161 \h </w:instrText>
             </w:r>
             <w:r>
               <w:rPr>
@@ -1822,7 +1822,7 @@
               <w14:ligatures w14:val="standardContextual"/>
             </w:rPr>
           </w:pPr>
-          <w:hyperlink w:anchor="_Toc239870689" w:history="1">
+          <w:hyperlink w:anchor="_Toc239915162" w:history="1">
             <w:r>
               <w:rPr>
                 <w:rStyle w:val="Hyperlink"/>
@@ -1846,7 +1846,7 @@
               <w:rPr>
                 <w:noProof/>
               </w:rPr>
-              <w:instrText xml:space="preserve"> PAGEREF _Toc239870689 \h </w:instrText>
+              <w:instrText xml:space="preserve"> PAGEREF _Toc239915162 \h </w:instrText>
             </w:r>
             <w:r>
               <w:rPr>
@@ -1888,7 +1888,7 @@
               <w14:ligatures w14:val="standardContextual"/>
             </w:rPr>
           </w:pPr>
-          <w:hyperlink w:anchor="_Toc239870690" w:history="1">
+          <w:hyperlink w:anchor="_Toc239915163" w:history="1">
             <w:r>
               <w:rPr>
                 <w:rStyle w:val="Hyperlink"/>
@@ -1912,7 +1912,7 @@
               <w:rPr>
                 <w:noProof/>
               </w:rPr>
-              <w:instrText xml:space="preserve"> PAGEREF _Toc239870690 \h </w:instrText>
+              <w:instrText xml:space="preserve"> PAGEREF _Toc239915163 \h </w:instrText>
             </w:r>
             <w:r>
               <w:rPr>
@@ -1954,7 +1954,7 @@
               <w14:ligatures w14:val="standardContextual"/>
             </w:rPr>
           </w:pPr>
-          <w:hyperlink w:anchor="_Toc239870691" w:history="1">
+          <w:hyperlink w:anchor="_Toc239915164" w:history="1">
             <w:r>
               <w:rPr>
                 <w:rStyle w:val="Hyperlink"/>
@@ -1978,7 +1978,7 @@
               <w:rPr>
                 <w:noProof/>
               </w:rPr>
-              <w:instrText xml:space="preserve"> PAGEREF _Toc239870691 \h </w:instrText>
+              <w:instrText xml:space="preserve"> PAGEREF _Toc239915164 \h </w:instrText>
             </w:r>
             <w:r>
               <w:rPr>
@@ -2020,7 +2020,7 @@
               <w14:ligatures w14:val="standardContextual"/>
             </w:rPr>
           </w:pPr>
-          <w:hyperlink w:anchor="_Toc239870692" w:history="1">
+          <w:hyperlink w:anchor="_Toc239915165" w:history="1">
             <w:r>
               <w:rPr>
                 <w:rStyle w:val="Hyperlink"/>
@@ -2044,7 +2044,7 @@
               <w:rPr>
                 <w:noProof/>
               </w:rPr>
-              <w:instrText xml:space="preserve"> PAGEREF _Toc239870692 \h </w:instrText>
+              <w:instrText xml:space="preserve"> PAGEREF _Toc239915165 \h </w:instrText>
             </w:r>
             <w:r>
               <w:rPr>
@@ -2086,7 +2086,7 @@
               <w14:ligatures w14:val="standardContextual"/>
             </w:rPr>
           </w:pPr>
-          <w:hyperlink w:anchor="_Toc239870693" w:history="1">
+          <w:hyperlink w:anchor="_Toc239915166" w:history="1">
             <w:r>
               <w:rPr>
                 <w:rStyle w:val="Hyperlink"/>
@@ -2110,7 +2110,7 @@
               <w:rPr>
                 <w:noProof/>
               </w:rPr>
-              <w:instrText xml:space="preserve"> PAGEREF _Toc239870693 \h </w:instrText>
+              <w:instrText xml:space="preserve"> PAGEREF _Toc239915166 \h </w:instrText>
             </w:r>
             <w:r>
               <w:rPr>
@@ -2152,7 +2152,7 @@
               <w14:ligatures w14:val="standardContextual"/>
             </w:rPr>
           </w:pPr>
-          <w:hyperlink w:anchor="_Toc239870694" w:history="1">
+          <w:hyperlink w:anchor="_Toc239915167" w:history="1">
             <w:r>
               <w:rPr>
                 <w:rStyle w:val="Hyperlink"/>
@@ -2176,7 +2176,7 @@
               <w:rPr>
                 <w:noProof/>
               </w:rPr>
-              <w:instrText xml:space="preserve"> PAGEREF _Toc239870694 \h </w:instrText>
+              <w:instrText xml:space="preserve"> PAGEREF _Toc239915167 \h </w:instrText>
             </w:r>
             <w:r>
               <w:rPr>
@@ -2218,7 +2218,7 @@
               <w14:ligatures w14:val="standardContextual"/>
             </w:rPr>
           </w:pPr>
-          <w:hyperlink w:anchor="_Toc239870695" w:history="1">
+          <w:hyperlink w:anchor="_Toc239915168" w:history="1">
             <w:r>
               <w:rPr>
                 <w:rStyle w:val="Hyperlink"/>
@@ -2242,7 +2242,7 @@
               <w:rPr>
                 <w:noProof/>
               </w:rPr>
-              <w:instrText xml:space="preserve"> PAGEREF _Toc239870695 \h </w:instrText>
+              <w:instrText xml:space="preserve"> PAGEREF _Toc239915168 \h </w:instrText>
             </w:r>
             <w:r>
               <w:rPr>
@@ -2259,7 +2259,7 @@
               <w:rPr>
                 <w:noProof/>
               </w:rPr>
-              <w:t>7</w:t>
+              <w:t>8</w:t>
             </w:r>
             <w:r>
               <w:rPr>
@@ -2284,7 +2284,7 @@
               <w14:ligatures w14:val="standardContextual"/>
             </w:rPr>
           </w:pPr>
-          <w:hyperlink w:anchor="_Toc239870696" w:history="1">
+          <w:hyperlink w:anchor="_Toc239915169" w:history="1">
             <w:r>
               <w:rPr>
                 <w:rStyle w:val="Hyperlink"/>
@@ -2308,7 +2308,7 @@
               <w:rPr>
                 <w:noProof/>
               </w:rPr>
-              <w:instrText xml:space="preserve"> PAGEREF _Toc239870696 \h </w:instrText>
+              <w:instrText xml:space="preserve"> PAGEREF _Toc239915169 \h </w:instrText>
             </w:r>
             <w:r>
               <w:rPr>
@@ -2350,7 +2350,7 @@
               <w14:ligatures w14:val="standardContextual"/>
             </w:rPr>
           </w:pPr>
-          <w:hyperlink w:anchor="_Toc239870697" w:history="1">
+          <w:hyperlink w:anchor="_Toc239915170" w:history="1">
             <w:r>
               <w:rPr>
                 <w:rStyle w:val="Hyperlink"/>
@@ -2374,7 +2374,7 @@
               <w:rPr>
                 <w:noProof/>
               </w:rPr>
-              <w:instrText xml:space="preserve"> PAGEREF _Toc239870697 \h </w:instrText>
+              <w:instrText xml:space="preserve"> PAGEREF _Toc239915170 \h </w:instrText>
             </w:r>
             <w:r>
               <w:rPr>
@@ -2416,7 +2416,7 @@
               <w14:ligatures w14:val="standardContextual"/>
             </w:rPr>
           </w:pPr>
-          <w:hyperlink w:anchor="_Toc239870698" w:history="1">
+          <w:hyperlink w:anchor="_Toc239915171" w:history="1">
             <w:r>
               <w:rPr>
                 <w:rStyle w:val="Hyperlink"/>
@@ -2440,7 +2440,7 @@
               <w:rPr>
                 <w:noProof/>
               </w:rPr>
-              <w:instrText xml:space="preserve"> PAGEREF _Toc239870698 \h </w:instrText>
+              <w:instrText xml:space="preserve"> PAGEREF _Toc239915171 \h </w:instrText>
             </w:r>
             <w:r>
               <w:rPr>
@@ -2457,7 +2457,7 @@
               <w:rPr>
                 <w:noProof/>
               </w:rPr>
-              <w:t>8</w:t>
+              <w:t>9</w:t>
             </w:r>
             <w:r>
               <w:rPr>
@@ -2482,7 +2482,7 @@
               <w14:ligatures w14:val="standardContextual"/>
             </w:rPr>
           </w:pPr>
-          <w:hyperlink w:anchor="_Toc239870699" w:history="1">
+          <w:hyperlink w:anchor="_Toc239915172" w:history="1">
             <w:r>
               <w:rPr>
                 <w:rStyle w:val="Hyperlink"/>
@@ -2506,7 +2506,7 @@
               <w:rPr>
                 <w:noProof/>
               </w:rPr>
-              <w:instrText xml:space="preserve"> PAGEREF _Toc239870699 \h </w:instrText>
+              <w:instrText xml:space="preserve"> PAGEREF _Toc239915172 \h </w:instrText>
             </w:r>
             <w:r>
               <w:rPr>
@@ -2523,7 +2523,7 @@
               <w:rPr>
                 <w:noProof/>
               </w:rPr>
-              <w:t>9</w:t>
+              <w:t>10</w:t>
             </w:r>
             <w:r>
               <w:rPr>
@@ -2548,7 +2548,7 @@
               <w14:ligatures w14:val="standardContextual"/>
             </w:rPr>
           </w:pPr>
-          <w:hyperlink w:anchor="_Toc239870700" w:history="1">
+          <w:hyperlink w:anchor="_Toc239915173" w:history="1">
             <w:r>
               <w:rPr>
                 <w:rStyle w:val="Hyperlink"/>
@@ -2572,7 +2572,7 @@
               <w:rPr>
                 <w:noProof/>
               </w:rPr>
-              <w:instrText xml:space="preserve"> PAGEREF _Toc239870700 \h </w:instrText>
+              <w:instrText xml:space="preserve"> PAGEREF _Toc239915173 \h </w:instrText>
             </w:r>
             <w:r>
               <w:rPr>
@@ -2589,7 +2589,7 @@
               <w:rPr>
                 <w:noProof/>
               </w:rPr>
-              <w:t>9</w:t>
+              <w:t>10</w:t>
             </w:r>
             <w:r>
               <w:rPr>
@@ -2614,7 +2614,7 @@
               <w14:ligatures w14:val="standardContextual"/>
             </w:rPr>
           </w:pPr>
-          <w:hyperlink w:anchor="_Toc239870701" w:history="1">
+          <w:hyperlink w:anchor="_Toc239915174" w:history="1">
             <w:r>
               <w:rPr>
                 <w:rStyle w:val="Hyperlink"/>
@@ -2638,7 +2638,7 @@
               <w:rPr>
                 <w:noProof/>
               </w:rPr>
-              <w:instrText xml:space="preserve"> PAGEREF _Toc239870701 \h </w:instrText>
+              <w:instrText xml:space="preserve"> PAGEREF _Toc239915174 \h </w:instrText>
             </w:r>
             <w:r>
               <w:rPr>
@@ -2655,7 +2655,7 @@
               <w:rPr>
                 <w:noProof/>
               </w:rPr>
-              <w:t>11</w:t>
+              <w:t>12</w:t>
             </w:r>
             <w:r>
               <w:rPr>
@@ -2680,7 +2680,7 @@
               <w14:ligatures w14:val="standardContextual"/>
             </w:rPr>
           </w:pPr>
-          <w:hyperlink w:anchor="_Toc239870702" w:history="1">
+          <w:hyperlink w:anchor="_Toc239915175" w:history="1">
             <w:r>
               <w:rPr>
                 <w:rStyle w:val="Hyperlink"/>
@@ -2704,7 +2704,7 @@
               <w:rPr>
                 <w:noProof/>
               </w:rPr>
-              <w:instrText xml:space="preserve"> PAGEREF _Toc239870702 \h </w:instrText>
+              <w:instrText xml:space="preserve"> PAGEREF _Toc239915175 \h </w:instrText>
             </w:r>
             <w:r>
               <w:rPr>
@@ -2721,7 +2721,7 @@
               <w:rPr>
                 <w:noProof/>
               </w:rPr>
-              <w:t>12</w:t>
+              <w:t>13</w:t>
             </w:r>
             <w:r>
               <w:rPr>
@@ -2746,7 +2746,7 @@
               <w14:ligatures w14:val="standardContextual"/>
             </w:rPr>
           </w:pPr>
-          <w:hyperlink w:anchor="_Toc239870703" w:history="1">
+          <w:hyperlink w:anchor="_Toc239915176" w:history="1">
             <w:r>
               <w:rPr>
                 <w:rStyle w:val="Hyperlink"/>
@@ -2770,7 +2770,7 @@
               <w:rPr>
                 <w:noProof/>
               </w:rPr>
-              <w:instrText xml:space="preserve"> PAGEREF _Toc239870703 \h </w:instrText>
+              <w:instrText xml:space="preserve"> PAGEREF _Toc239915176 \h </w:instrText>
             </w:r>
             <w:r>
               <w:rPr>
@@ -2787,7 +2787,7 @@
               <w:rPr>
                 <w:noProof/>
               </w:rPr>
-              <w:t>13</w:t>
+              <w:t>14</w:t>
             </w:r>
             <w:r>
               <w:rPr>
@@ -2812,7 +2812,7 @@
               <w14:ligatures w14:val="standardContextual"/>
             </w:rPr>
           </w:pPr>
-          <w:hyperlink w:anchor="_Toc239870704" w:history="1">
+          <w:hyperlink w:anchor="_Toc239915177" w:history="1">
             <w:r>
               <w:rPr>
                 <w:rStyle w:val="Hyperlink"/>
@@ -2836,7 +2836,7 @@
               <w:rPr>
                 <w:noProof/>
               </w:rPr>
-              <w:instrText xml:space="preserve"> PAGEREF _Toc239870704 \h </w:instrText>
+              <w:instrText xml:space="preserve"> PAGEREF _Toc239915177 \h </w:instrText>
             </w:r>
             <w:r>
               <w:rPr>
@@ -2853,7 +2853,7 @@
               <w:rPr>
                 <w:noProof/>
               </w:rPr>
-              <w:t>15</w:t>
+              <w:t>16</w:t>
             </w:r>
             <w:r>
               <w:rPr>
@@ -2878,7 +2878,7 @@
               <w14:ligatures w14:val="standardContextual"/>
             </w:rPr>
           </w:pPr>
-          <w:hyperlink w:anchor="_Toc239870705" w:history="1">
+          <w:hyperlink w:anchor="_Toc239915178" w:history="1">
             <w:r>
               <w:rPr>
                 <w:rStyle w:val="Hyperlink"/>
@@ -2902,7 +2902,7 @@
               <w:rPr>
                 <w:noProof/>
               </w:rPr>
-              <w:instrText xml:space="preserve"> PAGEREF _Toc239870705 \h </w:instrText>
+              <w:instrText xml:space="preserve"> PAGEREF _Toc239915178 \h </w:instrText>
             </w:r>
             <w:r>
               <w:rPr>
@@ -2919,7 +2919,7 @@
               <w:rPr>
                 <w:noProof/>
               </w:rPr>
-              <w:t>16</w:t>
+              <w:t>17</w:t>
             </w:r>
             <w:r>
               <w:rPr>
@@ -2944,7 +2944,7 @@
               <w14:ligatures w14:val="standardContextual"/>
             </w:rPr>
           </w:pPr>
-          <w:hyperlink w:anchor="_Toc239870706" w:history="1">
+          <w:hyperlink w:anchor="_Toc239915179" w:history="1">
             <w:r>
               <w:rPr>
                 <w:rStyle w:val="Hyperlink"/>
@@ -2968,7 +2968,7 @@
               <w:rPr>
                 <w:noProof/>
               </w:rPr>
-              <w:instrText xml:space="preserve"> PAGEREF _Toc239870706 \h </w:instrText>
+              <w:instrText xml:space="preserve"> PAGEREF _Toc239915179 \h </w:instrText>
             </w:r>
             <w:r>
               <w:rPr>
@@ -2985,7 +2985,7 @@
               <w:rPr>
                 <w:noProof/>
               </w:rPr>
-              <w:t>17</w:t>
+              <w:t>18</w:t>
             </w:r>
             <w:r>
               <w:rPr>
@@ -3010,7 +3010,7 @@
               <w14:ligatures w14:val="standardContextual"/>
             </w:rPr>
           </w:pPr>
-          <w:hyperlink w:anchor="_Toc239870707" w:history="1">
+          <w:hyperlink w:anchor="_Toc239915180" w:history="1">
             <w:r>
               <w:rPr>
                 <w:rStyle w:val="Hyperlink"/>
@@ -3034,7 +3034,7 @@
               <w:rPr>
                 <w:noProof/>
               </w:rPr>
-              <w:instrText xml:space="preserve"> PAGEREF _Toc239870707 \h </w:instrText>
+              <w:instrText xml:space="preserve"> PAGEREF _Toc239915180 \h </w:instrText>
             </w:r>
             <w:r>
               <w:rPr>
@@ -3051,7 +3051,7 @@
               <w:rPr>
                 <w:noProof/>
               </w:rPr>
-              <w:t>19</w:t>
+              <w:t>20</w:t>
             </w:r>
             <w:r>
               <w:rPr>
@@ -3076,7 +3076,7 @@
               <w14:ligatures w14:val="standardContextual"/>
             </w:rPr>
           </w:pPr>
-          <w:hyperlink w:anchor="_Toc239870708" w:history="1">
+          <w:hyperlink w:anchor="_Toc239915181" w:history="1">
             <w:r>
               <w:rPr>
                 <w:rStyle w:val="Hyperlink"/>
@@ -3100,7 +3100,7 @@
               <w:rPr>
                 <w:noProof/>
               </w:rPr>
-              <w:instrText xml:space="preserve"> PAGEREF _Toc239870708 \h </w:instrText>
+              <w:instrText xml:space="preserve"> PAGEREF _Toc239915181 \h </w:instrText>
             </w:r>
             <w:r>
               <w:rPr>
@@ -3117,7 +3117,7 @@
               <w:rPr>
                 <w:noProof/>
               </w:rPr>
-              <w:t>21</w:t>
+              <w:t>22</w:t>
             </w:r>
             <w:r>
               <w:rPr>
@@ -3142,7 +3142,7 @@
               <w14:ligatures w14:val="standardContextual"/>
             </w:rPr>
           </w:pPr>
-          <w:hyperlink w:anchor="_Toc239870709" w:history="1">
+          <w:hyperlink w:anchor="_Toc239915182" w:history="1">
             <w:r>
               <w:rPr>
                 <w:rStyle w:val="Hyperlink"/>
@@ -3166,7 +3166,7 @@
               <w:rPr>
                 <w:noProof/>
               </w:rPr>
-              <w:instrText xml:space="preserve"> PAGEREF _Toc239870709 \h </w:instrText>
+              <w:instrText xml:space="preserve"> PAGEREF _Toc239915182 \h </w:instrText>
             </w:r>
             <w:r>
               <w:rPr>
@@ -3183,7 +3183,7 @@
               <w:rPr>
                 <w:noProof/>
               </w:rPr>
-              <w:t>22</w:t>
+              <w:t>23</w:t>
             </w:r>
             <w:r>
               <w:rPr>
@@ -3208,7 +3208,7 @@
               <w14:ligatures w14:val="standardContextual"/>
             </w:rPr>
           </w:pPr>
-          <w:hyperlink w:anchor="_Toc239870710" w:history="1">
+          <w:hyperlink w:anchor="_Toc239915183" w:history="1">
             <w:r>
               <w:rPr>
                 <w:rStyle w:val="Hyperlink"/>
@@ -3232,7 +3232,7 @@
               <w:rPr>
                 <w:noProof/>
               </w:rPr>
-              <w:instrText xml:space="preserve"> PAGEREF _Toc239870710 \h </w:instrText>
+              <w:instrText xml:space="preserve"> PAGEREF _Toc239915183 \h </w:instrText>
             </w:r>
             <w:r>
               <w:rPr>
@@ -3249,7 +3249,7 @@
               <w:rPr>
                 <w:noProof/>
               </w:rPr>
-              <w:t>23</w:t>
+              <w:t>24</w:t>
             </w:r>
             <w:r>
               <w:rPr>
@@ -3274,7 +3274,7 @@
               <w14:ligatures w14:val="standardContextual"/>
             </w:rPr>
           </w:pPr>
-          <w:hyperlink w:anchor="_Toc239870711" w:history="1">
+          <w:hyperlink w:anchor="_Toc239915184" w:history="1">
             <w:r>
               <w:rPr>
                 <w:rStyle w:val="Hyperlink"/>
@@ -3298,7 +3298,7 @@
               <w:rPr>
                 <w:noProof/>
               </w:rPr>
-              <w:instrText xml:space="preserve"> PAGEREF _Toc239870711 \h </w:instrText>
+              <w:instrText xml:space="preserve"> PAGEREF _Toc239915184 \h </w:instrText>
             </w:r>
             <w:r>
               <w:rPr>
@@ -3315,7 +3315,7 @@
               <w:rPr>
                 <w:noProof/>
               </w:rPr>
-              <w:t>24</w:t>
+              <w:t>25</w:t>
             </w:r>
             <w:r>
               <w:rPr>
@@ -3340,7 +3340,7 @@
               <w14:ligatures w14:val="standardContextual"/>
             </w:rPr>
           </w:pPr>
-          <w:hyperlink w:anchor="_Toc239870712" w:history="1">
+          <w:hyperlink w:anchor="_Toc239915185" w:history="1">
             <w:r>
               <w:rPr>
                 <w:rStyle w:val="Hyperlink"/>
@@ -3364,7 +3364,7 @@
               <w:rPr>
                 <w:noProof/>
               </w:rPr>
-              <w:instrText xml:space="preserve"> PAGEREF _Toc239870712 \h </w:instrText>
+              <w:instrText xml:space="preserve"> PAGEREF _Toc239915185 \h </w:instrText>
             </w:r>
             <w:r>
               <w:rPr>
@@ -3381,7 +3381,7 @@
               <w:rPr>
                 <w:noProof/>
               </w:rPr>
-              <w:t>25</w:t>
+              <w:t>26</w:t>
             </w:r>
             <w:r>
               <w:rPr>
@@ -3406,7 +3406,7 @@
               <w14:ligatures w14:val="standardContextual"/>
             </w:rPr>
           </w:pPr>
-          <w:hyperlink w:anchor="_Toc239870713" w:history="1">
+          <w:hyperlink w:anchor="_Toc239915186" w:history="1">
             <w:r>
               <w:rPr>
                 <w:rStyle w:val="Hyperlink"/>
@@ -3430,7 +3430,7 @@
               <w:rPr>
                 <w:noProof/>
               </w:rPr>
-              <w:instrText xml:space="preserve"> PAGEREF _Toc239870713 \h </w:instrText>
+              <w:instrText xml:space="preserve"> PAGEREF _Toc239915186 \h </w:instrText>
             </w:r>
             <w:r>
               <w:rPr>
@@ -3447,7 +3447,7 @@
               <w:rPr>
                 <w:noProof/>
               </w:rPr>
-              <w:t>28</w:t>
+              <w:t>29</w:t>
             </w:r>
             <w:r>
               <w:rPr>
@@ -3472,7 +3472,7 @@
               <w14:ligatures w14:val="standardContextual"/>
             </w:rPr>
           </w:pPr>
-          <w:hyperlink w:anchor="_Toc239870714" w:history="1">
+          <w:hyperlink w:anchor="_Toc239915187" w:history="1">
             <w:r>
               <w:rPr>
                 <w:rStyle w:val="Hyperlink"/>
@@ -3496,7 +3496,7 @@
               <w:rPr>
                 <w:noProof/>
               </w:rPr>
-              <w:instrText xml:space="preserve"> PAGEREF _Toc239870714 \h </w:instrText>
+              <w:instrText xml:space="preserve"> PAGEREF _Toc239915187 \h </w:instrText>
             </w:r>
             <w:r>
               <w:rPr>
@@ -3513,7 +3513,7 @@
               <w:rPr>
                 <w:noProof/>
               </w:rPr>
-              <w:t>28</w:t>
+              <w:t>29</w:t>
             </w:r>
             <w:r>
               <w:rPr>
@@ -3538,7 +3538,7 @@
               <w14:ligatures w14:val="standardContextual"/>
             </w:rPr>
           </w:pPr>
-          <w:hyperlink w:anchor="_Toc239870715" w:history="1">
+          <w:hyperlink w:anchor="_Toc239915188" w:history="1">
             <w:r>
               <w:rPr>
                 <w:rStyle w:val="Hyperlink"/>
@@ -3562,7 +3562,7 @@
               <w:rPr>
                 <w:noProof/>
               </w:rPr>
-              <w:instrText xml:space="preserve"> PAGEREF _Toc239870715 \h </w:instrText>
+              <w:instrText xml:space="preserve"> PAGEREF _Toc239915188 \h </w:instrText>
             </w:r>
             <w:r>
               <w:rPr>
@@ -3579,7 +3579,7 @@
               <w:rPr>
                 <w:noProof/>
               </w:rPr>
-              <w:t>28</w:t>
+              <w:t>29</w:t>
             </w:r>
             <w:r>
               <w:rPr>
@@ -3604,7 +3604,7 @@
               <w14:ligatures w14:val="standardContextual"/>
             </w:rPr>
           </w:pPr>
-          <w:hyperlink w:anchor="_Toc239870716" w:history="1">
+          <w:hyperlink w:anchor="_Toc239915189" w:history="1">
             <w:r>
               <w:rPr>
                 <w:rStyle w:val="Hyperlink"/>
@@ -3628,7 +3628,7 @@
               <w:rPr>
                 <w:noProof/>
               </w:rPr>
-              <w:instrText xml:space="preserve"> PAGEREF _Toc239870716 \h </w:instrText>
+              <w:instrText xml:space="preserve"> PAGEREF _Toc239915189 \h </w:instrText>
             </w:r>
             <w:r>
               <w:rPr>
@@ -3645,7 +3645,7 @@
               <w:rPr>
                 <w:noProof/>
               </w:rPr>
-              <w:t>28</w:t>
+              <w:t>29</w:t>
             </w:r>
             <w:r>
               <w:rPr>
@@ -3670,7 +3670,7 @@
               <w14:ligatures w14:val="standardContextual"/>
             </w:rPr>
           </w:pPr>
-          <w:hyperlink w:anchor="_Toc239870717" w:history="1">
+          <w:hyperlink w:anchor="_Toc239915190" w:history="1">
             <w:r>
               <w:rPr>
                 <w:rStyle w:val="Hyperlink"/>
@@ -3694,7 +3694,7 @@
               <w:rPr>
                 <w:noProof/>
               </w:rPr>
-              <w:instrText xml:space="preserve"> PAGEREF _Toc239870717 \h </w:instrText>
+              <w:instrText xml:space="preserve"> PAGEREF _Toc239915190 \h </w:instrText>
             </w:r>
             <w:r>
               <w:rPr>
@@ -3711,7 +3711,7 @@
               <w:rPr>
                 <w:noProof/>
               </w:rPr>
-              <w:t>28</w:t>
+              <w:t>29</w:t>
             </w:r>
             <w:r>
               <w:rPr>
@@ -3736,7 +3736,7 @@
               <w14:ligatures w14:val="standardContextual"/>
             </w:rPr>
           </w:pPr>
-          <w:hyperlink w:anchor="_Toc239870718" w:history="1">
+          <w:hyperlink w:anchor="_Toc239915191" w:history="1">
             <w:r>
               <w:rPr>
                 <w:rStyle w:val="Hyperlink"/>
@@ -3760,7 +3760,7 @@
               <w:rPr>
                 <w:noProof/>
               </w:rPr>
-              <w:instrText xml:space="preserve"> PAGEREF _Toc239870718 \h </w:instrText>
+              <w:instrText xml:space="preserve"> PAGEREF _Toc239915191 \h </w:instrText>
             </w:r>
             <w:r>
               <w:rPr>
@@ -3777,7 +3777,7 @@
               <w:rPr>
                 <w:noProof/>
               </w:rPr>
-              <w:t>29</w:t>
+              <w:t>30</w:t>
             </w:r>
             <w:r>
               <w:rPr>
@@ -3802,7 +3802,7 @@
               <w14:ligatures w14:val="standardContextual"/>
             </w:rPr>
           </w:pPr>
-          <w:hyperlink w:anchor="_Toc239870719" w:history="1">
+          <w:hyperlink w:anchor="_Toc239915192" w:history="1">
             <w:r>
               <w:rPr>
                 <w:rStyle w:val="Hyperlink"/>
@@ -3826,7 +3826,7 @@
               <w:rPr>
                 <w:noProof/>
               </w:rPr>
-              <w:instrText xml:space="preserve"> PAGEREF _Toc239870719 \h </w:instrText>
+              <w:instrText xml:space="preserve"> PAGEREF _Toc239915192 \h </w:instrText>
             </w:r>
             <w:r>
               <w:rPr>
@@ -3843,7 +3843,7 @@
               <w:rPr>
                 <w:noProof/>
               </w:rPr>
-              <w:t>30</w:t>
+              <w:t>31</w:t>
             </w:r>
             <w:r>
               <w:rPr>
@@ -3868,7 +3868,7 @@
               <w14:ligatures w14:val="standardContextual"/>
             </w:rPr>
           </w:pPr>
-          <w:hyperlink w:anchor="_Toc239870720" w:history="1">
+          <w:hyperlink w:anchor="_Toc239915193" w:history="1">
             <w:r>
               <w:rPr>
                 <w:rStyle w:val="Hyperlink"/>
@@ -3892,7 +3892,7 @@
               <w:rPr>
                 <w:noProof/>
               </w:rPr>
-              <w:instrText xml:space="preserve"> PAGEREF _Toc239870720 \h </w:instrText>
+              <w:instrText xml:space="preserve"> PAGEREF _Toc239915193 \h </w:instrText>
             </w:r>
             <w:r>
               <w:rPr>
@@ -3909,7 +3909,7 @@
               <w:rPr>
                 <w:noProof/>
               </w:rPr>
-              <w:t>30</w:t>
+              <w:t>31</w:t>
             </w:r>
             <w:r>
               <w:rPr>
@@ -3934,7 +3934,7 @@
               <w14:ligatures w14:val="standardContextual"/>
             </w:rPr>
           </w:pPr>
-          <w:hyperlink w:anchor="_Toc239870721" w:history="1">
+          <w:hyperlink w:anchor="_Toc239915194" w:history="1">
             <w:r>
               <w:rPr>
                 <w:rStyle w:val="Hyperlink"/>
@@ -3958,7 +3958,7 @@
               <w:rPr>
                 <w:noProof/>
               </w:rPr>
-              <w:instrText xml:space="preserve"> PAGEREF _Toc239870721 \h </w:instrText>
+              <w:instrText xml:space="preserve"> PAGEREF _Toc239915194 \h </w:instrText>
             </w:r>
             <w:r>
               <w:rPr>
@@ -3975,7 +3975,7 @@
               <w:rPr>
                 <w:noProof/>
               </w:rPr>
-              <w:t>31</w:t>
+              <w:t>32</w:t>
             </w:r>
             <w:r>
               <w:rPr>
@@ -4000,7 +4000,7 @@
               <w14:ligatures w14:val="standardContextual"/>
             </w:rPr>
           </w:pPr>
-          <w:hyperlink w:anchor="_Toc239870722" w:history="1">
+          <w:hyperlink w:anchor="_Toc239915195" w:history="1">
             <w:r>
               <w:rPr>
                 <w:rStyle w:val="Hyperlink"/>
@@ -4024,7 +4024,7 @@
               <w:rPr>
                 <w:noProof/>
               </w:rPr>
-              <w:instrText xml:space="preserve"> PAGEREF _Toc239870722 \h </w:instrText>
+              <w:instrText xml:space="preserve"> PAGEREF _Toc239915195 \h </w:instrText>
             </w:r>
             <w:r>
               <w:rPr>
@@ -4041,7 +4041,7 @@
               <w:rPr>
                 <w:noProof/>
               </w:rPr>
-              <w:t>33</w:t>
+              <w:t>34</w:t>
             </w:r>
             <w:r>
               <w:rPr>
@@ -4066,7 +4066,7 @@
               <w14:ligatures w14:val="standardContextual"/>
             </w:rPr>
           </w:pPr>
-          <w:hyperlink w:anchor="_Toc239870723" w:history="1">
+          <w:hyperlink w:anchor="_Toc239915196" w:history="1">
             <w:r>
               <w:rPr>
                 <w:rStyle w:val="Hyperlink"/>
@@ -4090,7 +4090,7 @@
               <w:rPr>
                 <w:noProof/>
               </w:rPr>
-              <w:instrText xml:space="preserve"> PAGEREF _Toc239870723 \h </w:instrText>
+              <w:instrText xml:space="preserve"> PAGEREF _Toc239915196 \h </w:instrText>
             </w:r>
             <w:r>
               <w:rPr>
@@ -4107,7 +4107,7 @@
               <w:rPr>
                 <w:noProof/>
               </w:rPr>
-              <w:t>33</w:t>
+              <w:t>34</w:t>
             </w:r>
             <w:r>
               <w:rPr>
@@ -4132,7 +4132,7 @@
               <w14:ligatures w14:val="standardContextual"/>
             </w:rPr>
           </w:pPr>
-          <w:hyperlink w:anchor="_Toc239870724" w:history="1">
+          <w:hyperlink w:anchor="_Toc239915197" w:history="1">
             <w:r>
               <w:rPr>
                 <w:rStyle w:val="Hyperlink"/>
@@ -4156,7 +4156,7 @@
               <w:rPr>
                 <w:noProof/>
               </w:rPr>
-              <w:instrText xml:space="preserve"> PAGEREF _Toc239870724 \h </w:instrText>
+              <w:instrText xml:space="preserve"> PAGEREF _Toc239915197 \h </w:instrText>
             </w:r>
             <w:r>
               <w:rPr>
@@ -4173,7 +4173,7 @@
               <w:rPr>
                 <w:noProof/>
               </w:rPr>
-              <w:t>33</w:t>
+              <w:t>34</w:t>
             </w:r>
             <w:r>
               <w:rPr>
@@ -4198,7 +4198,7 @@
               <w14:ligatures w14:val="standardContextual"/>
             </w:rPr>
           </w:pPr>
-          <w:hyperlink w:anchor="_Toc239870725" w:history="1">
+          <w:hyperlink w:anchor="_Toc239915198" w:history="1">
             <w:r>
               <w:rPr>
                 <w:rStyle w:val="Hyperlink"/>
@@ -4222,7 +4222,7 @@
               <w:rPr>
                 <w:noProof/>
               </w:rPr>
-              <w:instrText xml:space="preserve"> PAGEREF _Toc239870725 \h </w:instrText>
+              <w:instrText xml:space="preserve"> PAGEREF _Toc239915198 \h </w:instrText>
             </w:r>
             <w:r>
               <w:rPr>
@@ -4239,7 +4239,7 @@
               <w:rPr>
                 <w:noProof/>
               </w:rPr>
-              <w:t>34</w:t>
+              <w:t>35</w:t>
             </w:r>
             <w:r>
               <w:rPr>
@@ -4264,7 +4264,7 @@
               <w14:ligatures w14:val="standardContextual"/>
             </w:rPr>
           </w:pPr>
-          <w:hyperlink w:anchor="_Toc239870726" w:history="1">
+          <w:hyperlink w:anchor="_Toc239915199" w:history="1">
             <w:r>
               <w:rPr>
                 <w:rStyle w:val="Hyperlink"/>
@@ -4288,7 +4288,7 @@
               <w:rPr>
                 <w:noProof/>
               </w:rPr>
-              <w:instrText xml:space="preserve"> PAGEREF _Toc239870726 \h </w:instrText>
+              <w:instrText xml:space="preserve"> PAGEREF _Toc239915199 \h </w:instrText>
             </w:r>
             <w:r>
               <w:rPr>
@@ -4305,7 +4305,7 @@
               <w:rPr>
                 <w:noProof/>
               </w:rPr>
-              <w:t>34</w:t>
+              <w:t>35</w:t>
             </w:r>
             <w:r>
               <w:rPr>
@@ -4331,7 +4331,7 @@
       <w:pPr>
         <w:pStyle w:val="Heading1"/>
       </w:pPr>
-      <w:bookmarkStart w:id="1" w:name="_Toc239870683"/>
+      <w:bookmarkStart w:id="1" w:name="_Toc239915156"/>
       <w:r>
         <w:t>1. Project Overview</w:t>
       </w:r>
@@ -4357,7 +4357,7 @@
       <w:pPr>
         <w:pStyle w:val="Heading2"/>
       </w:pPr>
-      <w:bookmarkStart w:id="2" w:name="_Toc239870684"/>
+      <w:bookmarkStart w:id="2" w:name="_Toc239915157"/>
       <w:r>
         <w:t>1.1 Problem Statement</w:t>
       </w:r>
@@ -4375,7 +4375,7 @@
       <w:pPr>
         <w:pStyle w:val="Heading2"/>
       </w:pPr>
-      <w:bookmarkStart w:id="3" w:name="_Toc239870685"/>
+      <w:bookmarkStart w:id="3" w:name="_Toc239915158"/>
       <w:r>
         <w:t>1.2 Objectives</w:t>
       </w:r>
@@ -4489,7 +4489,7 @@
       <w:pPr>
         <w:pStyle w:val="Heading2"/>
       </w:pPr>
-      <w:bookmarkStart w:id="4" w:name="_Toc239870686"/>
+      <w:bookmarkStart w:id="4" w:name="_Toc239915159"/>
       <w:r>
         <w:t>1.3 Scope &amp; Boundaries</w:t>
       </w:r>
@@ -4507,7 +4507,7 @@
       <w:pPr>
         <w:pStyle w:val="Heading2"/>
       </w:pPr>
-      <w:bookmarkStart w:id="5" w:name="_Toc239870687"/>
+      <w:bookmarkStart w:id="5" w:name="_Toc239915160"/>
       <w:r>
         <w:t>1.4 Technology Stack</w:t>
       </w:r>
@@ -5046,7 +5046,7 @@
       <w:pPr>
         <w:pStyle w:val="Heading2"/>
       </w:pPr>
-      <w:bookmarkStart w:id="6" w:name="_Toc239870688"/>
+      <w:bookmarkStart w:id="6" w:name="_Toc239915161"/>
       <w:r>
         <w:t>1.5 Summary of Implemented Modules</w:t>
       </w:r>
@@ -6353,7 +6353,7 @@
       <w:pPr>
         <w:pStyle w:val="Heading1"/>
       </w:pPr>
-      <w:bookmarkStart w:id="7" w:name="_Toc239870689"/>
+      <w:bookmarkStart w:id="7" w:name="_Toc239915162"/>
       <w:r>
         <w:t>2. System Architecture</w:t>
       </w:r>
@@ -6371,7 +6371,7 @@
       <w:pPr>
         <w:pStyle w:val="Heading2"/>
       </w:pPr>
-      <w:bookmarkStart w:id="8" w:name="_Toc239870690"/>
+      <w:bookmarkStart w:id="8" w:name="_Toc239915163"/>
       <w:r>
         <w:t>2.1 Request Pipeline</w:t>
       </w:r>
@@ -6483,7 +6483,7 @@
       <w:pPr>
         <w:pStyle w:val="Heading2"/>
       </w:pPr>
-      <w:bookmarkStart w:id="9" w:name="_Toc239870691"/>
+      <w:bookmarkStart w:id="9" w:name="_Toc239915164"/>
       <w:r>
         <w:t>2.2 Project Structure</w:t>
       </w:r>
@@ -6622,7 +6622,7 @@
       <w:pPr>
         <w:pStyle w:val="Heading2"/>
       </w:pPr>
-      <w:bookmarkStart w:id="10" w:name="_Toc239870692"/>
+      <w:bookmarkStart w:id="10" w:name="_Toc239915165"/>
       <w:r>
         <w:t>2.3 Response Envelope</w:t>
       </w:r>
@@ -6675,7 +6675,7 @@
       <w:pPr>
         <w:pStyle w:val="Heading1"/>
       </w:pPr>
-      <w:bookmarkStart w:id="11" w:name="_Toc239870693"/>
+      <w:bookmarkStart w:id="11" w:name="_Toc239915166"/>
       <w:r>
         <w:t>3. Database Design</w:t>
       </w:r>
@@ -6691,9 +6691,74 @@
     </w:p>
     <w:p>
       <w:pPr>
+        <w:spacing w:before="120" w:after="60"/>
+        <w:jc w:val="center"/>
+      </w:pPr>
+      <w:r>
+        <w:rPr>
+          <w:noProof/>
+        </w:rPr>
+        <w:drawing>
+          <wp:inline distT="0" distB="0" distL="0" distR="0" wp14:anchorId="67403E81" wp14:editId="26AAD779">
+            <wp:extent cx="6191250" cy="3533775"/>
+            <wp:effectExtent l="0" t="0" r="0" b="0"/>
+            <wp:docPr id="1" name="er-diagram.png" descr="er-diagram.png" title="er-diagram.png"/>
+            <wp:cNvGraphicFramePr>
+              <a:graphicFrameLocks xmlns:a="http://schemas.openxmlformats.org/drawingml/2006/main" noChangeAspect="1"/>
+            </wp:cNvGraphicFramePr>
+            <a:graphic xmlns:a="http://schemas.openxmlformats.org/drawingml/2006/main">
+              <a:graphicData uri="http://schemas.openxmlformats.org/drawingml/2006/picture">
+                <pic:pic xmlns:pic="http://schemas.openxmlformats.org/drawingml/2006/picture">
+                  <pic:nvPicPr>
+                    <pic:cNvPr id="0" name=""/>
+                    <pic:cNvPicPr>
+                      <a:picLocks noChangeAspect="1" noChangeArrowheads="1"/>
+                    </pic:cNvPicPr>
+                  </pic:nvPicPr>
+                  <pic:blipFill>
+                    <a:blip r:embed="rId8"/>
+                    <a:srcRect/>
+                    <a:stretch>
+                      <a:fillRect/>
+                    </a:stretch>
+                  </pic:blipFill>
+                  <pic:spPr bwMode="auto">
+                    <a:xfrm>
+                      <a:off x="0" y="0"/>
+                      <a:ext cx="6191250" cy="3533775"/>
+                    </a:xfrm>
+                    <a:prstGeom prst="rect">
+                      <a:avLst/>
+                    </a:prstGeom>
+                  </pic:spPr>
+                </pic:pic>
+              </a:graphicData>
+            </a:graphic>
+          </wp:inline>
+        </w:drawing>
+      </w:r>
+    </w:p>
+    <w:p>
+      <w:pPr>
+        <w:spacing w:after="200"/>
+        <w:jc w:val="center"/>
+      </w:pPr>
+      <w:r>
+        <w:rPr>
+          <w:i/>
+          <w:iCs/>
+          <w:color w:val="555555"/>
+          <w:sz w:val="18"/>
+          <w:szCs w:val="18"/>
+        </w:rPr>
+        <w:t>Figure 3.1 — Entity-Relationship diagram. PK = _id; FK = ObjectId reference; shaded rows are embedded sub-documents; cardinality shown as 1 : many.</w:t>
+      </w:r>
+    </w:p>
+    <w:p>
+      <w:pPr>
         <w:pStyle w:val="Heading2"/>
       </w:pPr>
-      <w:bookmarkStart w:id="12" w:name="_Toc239870694"/>
+      <w:bookmarkStart w:id="12" w:name="_Toc239915167"/>
       <w:r>
         <w:t>3.1 Collections</w:t>
       </w:r>
@@ -7364,7 +7429,7 @@
       <w:pPr>
         <w:pStyle w:val="Heading2"/>
       </w:pPr>
-      <w:bookmarkStart w:id="13" w:name="_Toc239870695"/>
+      <w:bookmarkStart w:id="13" w:name="_Toc239915168"/>
       <w:r>
         <w:t>3.2 Reference vs. Embed Reasoning</w:t>
       </w:r>
@@ -8213,7 +8278,7 @@
       <w:pPr>
         <w:pStyle w:val="Heading2"/>
       </w:pPr>
-      <w:bookmarkStart w:id="14" w:name="_Toc239870696"/>
+      <w:bookmarkStart w:id="14" w:name="_Toc239915169"/>
       <w:r>
         <w:t>3.3 Indexes</w:t>
       </w:r>
@@ -9418,7 +9483,7 @@
       <w:pPr>
         <w:pStyle w:val="Heading2"/>
       </w:pPr>
-      <w:bookmarkStart w:id="15" w:name="_Toc239870697"/>
+      <w:bookmarkStart w:id="15" w:name="_Toc239915170"/>
       <w:r>
         <w:t>3.4 Entity Relationships</w:t>
       </w:r>
@@ -9529,7 +9594,7 @@
       <w:pPr>
         <w:pStyle w:val="Heading2"/>
       </w:pPr>
-      <w:bookmarkStart w:id="16" w:name="_Toc239870698"/>
+      <w:bookmarkStart w:id="16" w:name="_Toc239915171"/>
       <w:r>
         <w:t>3.5 Order Status State Machine</w:t>
       </w:r>
@@ -9611,7 +9676,7 @@
       <w:pPr>
         <w:pStyle w:val="Heading1"/>
       </w:pPr>
-      <w:bookmarkStart w:id="17" w:name="_Toc239870699"/>
+      <w:bookmarkStart w:id="17" w:name="_Toc239915172"/>
       <w:r>
         <w:t>4. Functional Modules &amp; Evidence</w:t>
       </w:r>
@@ -9629,7 +9694,7 @@
       <w:pPr>
         <w:pStyle w:val="Heading2"/>
       </w:pPr>
-      <w:bookmarkStart w:id="18" w:name="_Toc239870700"/>
+      <w:bookmarkStart w:id="18" w:name="_Toc239915173"/>
       <w:r>
         <w:t>4.1 Module 1 — User Registration &amp; Authentication</w:t>
       </w:r>
@@ -9707,75 +9772,10 @@
           <w:noProof/>
         </w:rPr>
         <w:drawing>
-          <wp:inline distT="0" distB="0" distL="0" distR="0" wp14:anchorId="2EBDA9F5" wp14:editId="3D2DFA44">
+          <wp:inline distT="0" distB="0" distL="0" distR="0" wp14:anchorId="0318F30F" wp14:editId="6F313F78">
             <wp:extent cx="5715000" cy="3038475"/>
             <wp:effectExtent l="0" t="0" r="0" b="0"/>
-            <wp:docPr id="1" name="Auth_register.png" descr="Auth_register.png" title="Auth_register.png"/>
-            <wp:cNvGraphicFramePr>
-              <a:graphicFrameLocks xmlns:a="http://schemas.openxmlformats.org/drawingml/2006/main" noChangeAspect="1"/>
-            </wp:cNvGraphicFramePr>
-            <a:graphic xmlns:a="http://schemas.openxmlformats.org/drawingml/2006/main">
-              <a:graphicData uri="http://schemas.openxmlformats.org/drawingml/2006/picture">
-                <pic:pic xmlns:pic="http://schemas.openxmlformats.org/drawingml/2006/picture">
-                  <pic:nvPicPr>
-                    <pic:cNvPr id="0" name=""/>
-                    <pic:cNvPicPr>
-                      <a:picLocks noChangeAspect="1" noChangeArrowheads="1"/>
-                    </pic:cNvPicPr>
-                  </pic:nvPicPr>
-                  <pic:blipFill>
-                    <a:blip r:embed="rId8"/>
-                    <a:srcRect/>
-                    <a:stretch>
-                      <a:fillRect/>
-                    </a:stretch>
-                  </pic:blipFill>
-                  <pic:spPr bwMode="auto">
-                    <a:xfrm>
-                      <a:off x="0" y="0"/>
-                      <a:ext cx="5715000" cy="3038475"/>
-                    </a:xfrm>
-                    <a:prstGeom prst="rect">
-                      <a:avLst/>
-                    </a:prstGeom>
-                  </pic:spPr>
-                </pic:pic>
-              </a:graphicData>
-            </a:graphic>
-          </wp:inline>
-        </w:drawing>
-      </w:r>
-    </w:p>
-    <w:p>
-      <w:pPr>
-        <w:spacing w:after="200"/>
-        <w:jc w:val="center"/>
-      </w:pPr>
-      <w:r>
-        <w:rPr>
-          <w:i/>
-          <w:iCs/>
-          <w:color w:val="555555"/>
-          <w:sz w:val="18"/>
-          <w:szCs w:val="18"/>
-        </w:rPr>
-        <w:t>Postman — POST /api/auth/register -&gt; 201 Registered successfully (token returned)</w:t>
-      </w:r>
-    </w:p>
-    <w:p>
-      <w:pPr>
-        <w:spacing w:before="120" w:after="60"/>
-        <w:jc w:val="center"/>
-      </w:pPr>
-      <w:r>
-        <w:rPr>
-          <w:noProof/>
-        </w:rPr>
-        <w:drawing>
-          <wp:inline distT="0" distB="0" distL="0" distR="0" wp14:anchorId="27E6C983" wp14:editId="5BCD7304">
-            <wp:extent cx="5715000" cy="3105150"/>
-            <wp:effectExtent l="0" t="0" r="0" b="0"/>
-            <wp:docPr id="196280534" name="Auth_login.png" descr="Auth_login.png" title="Auth_login.png"/>
+            <wp:docPr id="737057182" name="Auth_register.png" descr="Auth_register.png" title="Auth_register.png"/>
             <wp:cNvGraphicFramePr>
               <a:graphicFrameLocks xmlns:a="http://schemas.openxmlformats.org/drawingml/2006/main" noChangeAspect="1"/>
             </wp:cNvGraphicFramePr>
@@ -9798,7 +9798,7 @@
                   <pic:spPr bwMode="auto">
                     <a:xfrm>
                       <a:off x="0" y="0"/>
-                      <a:ext cx="5715000" cy="3105150"/>
+                      <a:ext cx="5715000" cy="3038475"/>
                     </a:xfrm>
                     <a:prstGeom prst="rect">
                       <a:avLst/>
@@ -9824,7 +9824,7 @@
           <w:sz w:val="18"/>
           <w:szCs w:val="18"/>
         </w:rPr>
-        <w:t>Postman — POST /api/auth/login -&gt; 200 Login successful; token auto-captured</w:t>
+        <w:t>Postman — POST /api/auth/register -&gt; 201 Registered successfully (token returned)</w:t>
       </w:r>
     </w:p>
     <w:p>
@@ -9837,10 +9837,10 @@
           <w:noProof/>
         </w:rPr>
         <w:drawing>
-          <wp:inline distT="0" distB="0" distL="0" distR="0" wp14:anchorId="73C244C7" wp14:editId="7ED58ECF">
-            <wp:extent cx="5334000" cy="3895725"/>
+          <wp:inline distT="0" distB="0" distL="0" distR="0" wp14:anchorId="4F5CC133" wp14:editId="346CB3F2">
+            <wp:extent cx="5715000" cy="3105150"/>
             <wp:effectExtent l="0" t="0" r="0" b="0"/>
-            <wp:docPr id="542490502" name="fe-01-login.png" descr="fe-01-login.png" title="fe-01-login.png"/>
+            <wp:docPr id="338352173" name="Auth_login.png" descr="Auth_login.png" title="Auth_login.png"/>
             <wp:cNvGraphicFramePr>
               <a:graphicFrameLocks xmlns:a="http://schemas.openxmlformats.org/drawingml/2006/main" noChangeAspect="1"/>
             </wp:cNvGraphicFramePr>
@@ -9863,7 +9863,7 @@
                   <pic:spPr bwMode="auto">
                     <a:xfrm>
                       <a:off x="0" y="0"/>
-                      <a:ext cx="5334000" cy="3895725"/>
+                      <a:ext cx="5715000" cy="3105150"/>
                     </a:xfrm>
                     <a:prstGeom prst="rect">
                       <a:avLst/>
@@ -9889,7 +9889,7 @@
           <w:sz w:val="18"/>
           <w:szCs w:val="18"/>
         </w:rPr>
-        <w:t>Demo UI — login screen with seed-account hint</w:t>
+        <w:t>Postman — POST /api/auth/login -&gt; 200 Login successful; token auto-captured</w:t>
       </w:r>
     </w:p>
     <w:p>
@@ -9902,10 +9902,10 @@
           <w:noProof/>
         </w:rPr>
         <w:drawing>
-          <wp:inline distT="0" distB="0" distL="0" distR="0" wp14:anchorId="61D4999A" wp14:editId="34159345">
+          <wp:inline distT="0" distB="0" distL="0" distR="0" wp14:anchorId="49400C67" wp14:editId="39289BD1">
             <wp:extent cx="5334000" cy="3895725"/>
             <wp:effectExtent l="0" t="0" r="0" b="0"/>
-            <wp:docPr id="1429402623" name="fe-02-register.png" descr="fe-02-register.png" title="fe-02-register.png"/>
+            <wp:docPr id="1438998550" name="fe-01-login.png" descr="fe-01-login.png" title="fe-01-login.png"/>
             <wp:cNvGraphicFramePr>
               <a:graphicFrameLocks xmlns:a="http://schemas.openxmlformats.org/drawingml/2006/main" noChangeAspect="1"/>
             </wp:cNvGraphicFramePr>
@@ -9954,7 +9954,7 @@
           <w:sz w:val="18"/>
           <w:szCs w:val="18"/>
         </w:rPr>
-        <w:t>Demo UI — registration form (role selector for all four roles)</w:t>
+        <w:t>Demo UI — login screen with seed-account hint</w:t>
       </w:r>
     </w:p>
     <w:p>
@@ -9967,10 +9967,10 @@
           <w:noProof/>
         </w:rPr>
         <w:drawing>
-          <wp:inline distT="0" distB="0" distL="0" distR="0" wp14:anchorId="3ABF8E3E" wp14:editId="61C0A1A2">
-            <wp:extent cx="5715000" cy="3105150"/>
+          <wp:inline distT="0" distB="0" distL="0" distR="0" wp14:anchorId="65EE76F1" wp14:editId="0855E979">
+            <wp:extent cx="5334000" cy="3895725"/>
             <wp:effectExtent l="0" t="0" r="0" b="0"/>
-            <wp:docPr id="1016858637" name="Current_user.png" descr="Current_user.png" title="Current_user.png"/>
+            <wp:docPr id="1427131530" name="fe-02-register.png" descr="fe-02-register.png" title="fe-02-register.png"/>
             <wp:cNvGraphicFramePr>
               <a:graphicFrameLocks xmlns:a="http://schemas.openxmlformats.org/drawingml/2006/main" noChangeAspect="1"/>
             </wp:cNvGraphicFramePr>
@@ -9993,7 +9993,7 @@
                   <pic:spPr bwMode="auto">
                     <a:xfrm>
                       <a:off x="0" y="0"/>
-                      <a:ext cx="5715000" cy="3105150"/>
+                      <a:ext cx="5334000" cy="3895725"/>
                     </a:xfrm>
                     <a:prstGeom prst="rect">
                       <a:avLst/>
@@ -10019,121 +10019,7 @@
           <w:sz w:val="18"/>
           <w:szCs w:val="18"/>
         </w:rPr>
-        <w:t>Postman — GET /api/auth/me -&gt; 200 Current user</w:t>
-      </w:r>
-    </w:p>
-    <w:p>
-      <w:pPr>
-        <w:pStyle w:val="Heading2"/>
-      </w:pPr>
-      <w:bookmarkStart w:id="19" w:name="_Toc239870701"/>
-      <w:r>
-        <w:t>4.2 Module 2 — Dark-Store Management</w:t>
-      </w:r>
-      <w:bookmarkEnd w:id="19"/>
-    </w:p>
-    <w:p>
-      <w:pPr>
-        <w:spacing w:after="120"/>
-      </w:pPr>
-      <w:r>
-        <w:t>Admin CRUD over dark-stores. Browsing is open to any authenticated user so a customer can resolve their nearest store; writes are admin-only. Delete is a soft delete (isActive:false) so historical orders and stock rows stay intact.</w:t>
-      </w:r>
-    </w:p>
-    <w:p>
-      <w:pPr>
-        <w:spacing w:after="120"/>
-      </w:pPr>
-      <w:r>
-        <w:rPr>
-          <w:b/>
-          <w:bCs/>
-        </w:rPr>
-        <w:t>Endpoints:</w:t>
-      </w:r>
-    </w:p>
-    <w:p>
-      <w:pPr>
-        <w:shd w:val="clear" w:color="auto" w:fill="F4F4F4"/>
-        <w:spacing w:after="120"/>
-      </w:pPr>
-      <w:r>
-        <w:rPr>
-          <w:rFonts w:ascii="Consolas" w:eastAsia="Consolas" w:hAnsi="Consolas" w:cs="Consolas"/>
-          <w:sz w:val="18"/>
-          <w:szCs w:val="18"/>
-        </w:rPr>
-        <w:t>POST   /api/stores            Admin   Create a dark-store</w:t>
-      </w:r>
-    </w:p>
-    <w:p>
-      <w:pPr>
-        <w:shd w:val="clear" w:color="auto" w:fill="F4F4F4"/>
-        <w:spacing w:after="120"/>
-      </w:pPr>
-      <w:r>
-        <w:rPr>
-          <w:rFonts w:ascii="Consolas" w:eastAsia="Consolas" w:hAnsi="Consolas" w:cs="Consolas"/>
-          <w:sz w:val="18"/>
-          <w:szCs w:val="18"/>
-        </w:rPr>
-        <w:t>GET    /api/stores            Any     List dark-stores</w:t>
-      </w:r>
-    </w:p>
-    <w:p>
-      <w:pPr>
-        <w:shd w:val="clear" w:color="auto" w:fill="F4F4F4"/>
-        <w:spacing w:after="120"/>
-      </w:pPr>
-      <w:r>
-        <w:rPr>
-          <w:rFonts w:ascii="Consolas" w:eastAsia="Consolas" w:hAnsi="Consolas" w:cs="Consolas"/>
-          <w:sz w:val="18"/>
-          <w:szCs w:val="18"/>
-        </w:rPr>
-        <w:t>GET    /api/stores/:id        Any     Get one store</w:t>
-      </w:r>
-    </w:p>
-    <w:p>
-      <w:pPr>
-        <w:shd w:val="clear" w:color="auto" w:fill="F4F4F4"/>
-        <w:spacing w:after="120"/>
-      </w:pPr>
-      <w:r>
-        <w:rPr>
-          <w:rFonts w:ascii="Consolas" w:eastAsia="Consolas" w:hAnsi="Consolas" w:cs="Consolas"/>
-          <w:sz w:val="18"/>
-          <w:szCs w:val="18"/>
-        </w:rPr>
-        <w:t>PUT    /api/stores/:id        Admin   Update a store</w:t>
-      </w:r>
-    </w:p>
-    <w:p>
-      <w:pPr>
-        <w:shd w:val="clear" w:color="auto" w:fill="F4F4F4"/>
-        <w:spacing w:after="120"/>
-      </w:pPr>
-      <w:r>
-        <w:rPr>
-          <w:rFonts w:ascii="Consolas" w:eastAsia="Consolas" w:hAnsi="Consolas" w:cs="Consolas"/>
-          <w:sz w:val="18"/>
-          <w:szCs w:val="18"/>
-        </w:rPr>
-        <w:t>DELETE /api/stores/:id        Admin   Deactivate a store (soft delete)</w:t>
-      </w:r>
-    </w:p>
-    <w:p>
-      <w:pPr>
-        <w:shd w:val="clear" w:color="auto" w:fill="F4F4F4"/>
-        <w:spacing w:after="120"/>
-      </w:pPr>
-      <w:r>
-        <w:rPr>
-          <w:rFonts w:ascii="Consolas" w:eastAsia="Consolas" w:hAnsi="Consolas" w:cs="Consolas"/>
-          <w:sz w:val="18"/>
-          <w:szCs w:val="18"/>
-        </w:rPr>
-        <w:t>GET    /api/stores/nearest?pincode=   Any   Nearest-store check by pincode</w:t>
+        <w:t>Demo UI — registration form (role selector for all four roles)</w:t>
       </w:r>
     </w:p>
     <w:p>
@@ -10146,10 +10032,10 @@
           <w:noProof/>
         </w:rPr>
         <w:drawing>
-          <wp:inline distT="0" distB="0" distL="0" distR="0" wp14:anchorId="3605BE23" wp14:editId="155C08FA">
-            <wp:extent cx="5715000" cy="3076575"/>
+          <wp:inline distT="0" distB="0" distL="0" distR="0" wp14:anchorId="62EA8C57" wp14:editId="5B16C716">
+            <wp:extent cx="5715000" cy="3105150"/>
             <wp:effectExtent l="0" t="0" r="0" b="0"/>
-            <wp:docPr id="2098470495" name="List_store_1.png" descr="List_store_1.png" title="List_store_1.png"/>
+            <wp:docPr id="1040008753" name="Current_user.png" descr="Current_user.png" title="Current_user.png"/>
             <wp:cNvGraphicFramePr>
               <a:graphicFrameLocks xmlns:a="http://schemas.openxmlformats.org/drawingml/2006/main" noChangeAspect="1"/>
             </wp:cNvGraphicFramePr>
@@ -10172,7 +10058,7 @@
                   <pic:spPr bwMode="auto">
                     <a:xfrm>
                       <a:off x="0" y="0"/>
-                      <a:ext cx="5715000" cy="3076575"/>
+                      <a:ext cx="5715000" cy="3105150"/>
                     </a:xfrm>
                     <a:prstGeom prst="rect">
                       <a:avLst/>
@@ -10198,25 +10084,25 @@
           <w:sz w:val="18"/>
           <w:szCs w:val="18"/>
         </w:rPr>
-        <w:t>Postman — GET /api/stores -&gt; 200 Stores fetched successfully</w:t>
+        <w:t>Postman — GET /api/auth/me -&gt; 200 Current user</w:t>
       </w:r>
     </w:p>
     <w:p>
       <w:pPr>
         <w:pStyle w:val="Heading2"/>
       </w:pPr>
-      <w:bookmarkStart w:id="20" w:name="_Toc239870702"/>
-      <w:r>
-        <w:t>4.3 Module 3 — Product Catalog &amp; Store-Wise Stock</w:t>
-      </w:r>
-      <w:bookmarkEnd w:id="20"/>
+      <w:bookmarkStart w:id="19" w:name="_Toc239915174"/>
+      <w:r>
+        <w:t>4.2 Module 2 — Dark-Store Management</w:t>
+      </w:r>
+      <w:bookmarkEnd w:id="19"/>
     </w:p>
     <w:p>
       <w:pPr>
         <w:spacing w:after="120"/>
       </w:pPr>
       <w:r>
-        <w:t>A store-agnostic master catalog (products) plus a separate storeStock collection holding quantity and reorderPoint for each (store, product) pair. Catalog browse/search is open to any authenticated role; catalog writes are admin-only; stock is managed by admin and the staff of that store. A unique compound index on (storeId, productId) guarantees exactly one stock row per pair.</w:t>
+        <w:t>Admin CRUD over dark-stores. Browsing is open to any authenticated user so a customer can resolve their nearest store; writes are admin-only. Delete is a soft delete (isActive:false) so historical orders and stock rows stay intact.</w:t>
       </w:r>
     </w:p>
     <w:p>
@@ -10242,7 +10128,7 @@
           <w:sz w:val="18"/>
           <w:szCs w:val="18"/>
         </w:rPr>
-        <w:t>GET  /api/products?category=&amp;search=            Any          Browse / search products</w:t>
+        <w:t>POST   /api/stores            Admin   Create a dark-store</w:t>
       </w:r>
     </w:p>
     <w:p>
@@ -10256,7 +10142,7 @@
           <w:sz w:val="18"/>
           <w:szCs w:val="18"/>
         </w:rPr>
-        <w:t>POST /api/products                              Admin        Create a product</w:t>
+        <w:t>GET    /api/stores            Any     List dark-stores</w:t>
       </w:r>
     </w:p>
     <w:p>
@@ -10270,7 +10156,7 @@
           <w:sz w:val="18"/>
           <w:szCs w:val="18"/>
         </w:rPr>
-        <w:t>GET  /api/stores/:storeId/stock                 Admin/Staff  List a store's stock</w:t>
+        <w:t>GET    /api/stores/:id        Any     Get one store</w:t>
       </w:r>
     </w:p>
     <w:p>
@@ -10284,7 +10170,7 @@
           <w:sz w:val="18"/>
           <w:szCs w:val="18"/>
         </w:rPr>
-        <w:t>POST /api/stores/:storeId/stock                 Admin/Staff  Upsert stock for a product</w:t>
+        <w:t>PUT    /api/stores/:id        Admin   Update a store</w:t>
       </w:r>
     </w:p>
     <w:p>
@@ -10298,7 +10184,21 @@
           <w:sz w:val="18"/>
           <w:szCs w:val="18"/>
         </w:rPr>
-        <w:t>PUT  /api/stores/:storeId/stock/:productId      Admin/Staff  Update quantity / reorderPoint</w:t>
+        <w:t>DELETE /api/stores/:id        Admin   Deactivate a store (soft delete)</w:t>
+      </w:r>
+    </w:p>
+    <w:p>
+      <w:pPr>
+        <w:shd w:val="clear" w:color="auto" w:fill="F4F4F4"/>
+        <w:spacing w:after="120"/>
+      </w:pPr>
+      <w:r>
+        <w:rPr>
+          <w:rFonts w:ascii="Consolas" w:eastAsia="Consolas" w:hAnsi="Consolas" w:cs="Consolas"/>
+          <w:sz w:val="18"/>
+          <w:szCs w:val="18"/>
+        </w:rPr>
+        <w:t>GET    /api/stores/nearest?pincode=   Any   Nearest-store check by pincode</w:t>
       </w:r>
     </w:p>
     <w:p>
@@ -10311,10 +10211,10 @@
           <w:noProof/>
         </w:rPr>
         <w:drawing>
-          <wp:inline distT="0" distB="0" distL="0" distR="0" wp14:anchorId="06D12482" wp14:editId="20723FDB">
-            <wp:extent cx="5715000" cy="3048000"/>
+          <wp:inline distT="0" distB="0" distL="0" distR="0" wp14:anchorId="13E07CE6" wp14:editId="2624383B">
+            <wp:extent cx="5715000" cy="3076575"/>
             <wp:effectExtent l="0" t="0" r="0" b="0"/>
-            <wp:docPr id="732762069" name="List_products.png" descr="List_products.png" title="List_products.png"/>
+            <wp:docPr id="276890320" name="List_store_1.png" descr="List_store_1.png" title="List_store_1.png"/>
             <wp:cNvGraphicFramePr>
               <a:graphicFrameLocks xmlns:a="http://schemas.openxmlformats.org/drawingml/2006/main" noChangeAspect="1"/>
             </wp:cNvGraphicFramePr>
@@ -10337,7 +10237,7 @@
                   <pic:spPr bwMode="auto">
                     <a:xfrm>
                       <a:off x="0" y="0"/>
-                      <a:ext cx="5715000" cy="3048000"/>
+                      <a:ext cx="5715000" cy="3076575"/>
                     </a:xfrm>
                     <a:prstGeom prst="rect">
                       <a:avLst/>
@@ -10363,7 +10263,107 @@
           <w:sz w:val="18"/>
           <w:szCs w:val="18"/>
         </w:rPr>
-        <w:t>Postman — GET /api/products -&gt; 200 Products fetched successfully</w:t>
+        <w:t>Postman — GET /api/stores -&gt; 200 Stores fetched successfully</w:t>
+      </w:r>
+    </w:p>
+    <w:p>
+      <w:pPr>
+        <w:pStyle w:val="Heading2"/>
+      </w:pPr>
+      <w:bookmarkStart w:id="20" w:name="_Toc239915175"/>
+      <w:r>
+        <w:t>4.3 Module 3 — Product Catalog &amp; Store-Wise Stock</w:t>
+      </w:r>
+      <w:bookmarkEnd w:id="20"/>
+    </w:p>
+    <w:p>
+      <w:pPr>
+        <w:spacing w:after="120"/>
+      </w:pPr>
+      <w:r>
+        <w:t>A store-agnostic master catalog (products) plus a separate storeStock collection holding quantity and reorderPoint for each (store, product) pair. Catalog browse/search is open to any authenticated role; catalog writes are admin-only; stock is managed by admin and the staff of that store. A unique compound index on (storeId, productId) guarantees exactly one stock row per pair.</w:t>
+      </w:r>
+    </w:p>
+    <w:p>
+      <w:pPr>
+        <w:spacing w:after="120"/>
+      </w:pPr>
+      <w:r>
+        <w:rPr>
+          <w:b/>
+          <w:bCs/>
+        </w:rPr>
+        <w:t>Endpoints:</w:t>
+      </w:r>
+    </w:p>
+    <w:p>
+      <w:pPr>
+        <w:shd w:val="clear" w:color="auto" w:fill="F4F4F4"/>
+        <w:spacing w:after="120"/>
+      </w:pPr>
+      <w:r>
+        <w:rPr>
+          <w:rFonts w:ascii="Consolas" w:eastAsia="Consolas" w:hAnsi="Consolas" w:cs="Consolas"/>
+          <w:sz w:val="18"/>
+          <w:szCs w:val="18"/>
+        </w:rPr>
+        <w:t>GET  /api/products?category=&amp;search=            Any          Browse / search products</w:t>
+      </w:r>
+    </w:p>
+    <w:p>
+      <w:pPr>
+        <w:shd w:val="clear" w:color="auto" w:fill="F4F4F4"/>
+        <w:spacing w:after="120"/>
+      </w:pPr>
+      <w:r>
+        <w:rPr>
+          <w:rFonts w:ascii="Consolas" w:eastAsia="Consolas" w:hAnsi="Consolas" w:cs="Consolas"/>
+          <w:sz w:val="18"/>
+          <w:szCs w:val="18"/>
+        </w:rPr>
+        <w:t>POST /api/products                              Admin        Create a product</w:t>
+      </w:r>
+    </w:p>
+    <w:p>
+      <w:pPr>
+        <w:shd w:val="clear" w:color="auto" w:fill="F4F4F4"/>
+        <w:spacing w:after="120"/>
+      </w:pPr>
+      <w:r>
+        <w:rPr>
+          <w:rFonts w:ascii="Consolas" w:eastAsia="Consolas" w:hAnsi="Consolas" w:cs="Consolas"/>
+          <w:sz w:val="18"/>
+          <w:szCs w:val="18"/>
+        </w:rPr>
+        <w:t>GET  /api/stores/:storeId/stock                 Admin/Staff  List a store's stock</w:t>
+      </w:r>
+    </w:p>
+    <w:p>
+      <w:pPr>
+        <w:shd w:val="clear" w:color="auto" w:fill="F4F4F4"/>
+        <w:spacing w:after="120"/>
+      </w:pPr>
+      <w:r>
+        <w:rPr>
+          <w:rFonts w:ascii="Consolas" w:eastAsia="Consolas" w:hAnsi="Consolas" w:cs="Consolas"/>
+          <w:sz w:val="18"/>
+          <w:szCs w:val="18"/>
+        </w:rPr>
+        <w:t>POST /api/stores/:storeId/stock                 Admin/Staff  Upsert stock for a product</w:t>
+      </w:r>
+    </w:p>
+    <w:p>
+      <w:pPr>
+        <w:shd w:val="clear" w:color="auto" w:fill="F4F4F4"/>
+        <w:spacing w:after="120"/>
+      </w:pPr>
+      <w:r>
+        <w:rPr>
+          <w:rFonts w:ascii="Consolas" w:eastAsia="Consolas" w:hAnsi="Consolas" w:cs="Consolas"/>
+          <w:sz w:val="18"/>
+          <w:szCs w:val="18"/>
+        </w:rPr>
+        <w:t>PUT  /api/stores/:storeId/stock/:productId      Admin/Staff  Update quantity / reorderPoint</w:t>
       </w:r>
     </w:p>
     <w:p>
@@ -10376,10 +10376,10 @@
           <w:noProof/>
         </w:rPr>
         <w:drawing>
-          <wp:inline distT="0" distB="0" distL="0" distR="0" wp14:anchorId="5A0889FA" wp14:editId="14A2185C">
-            <wp:extent cx="5715000" cy="3124200"/>
+          <wp:inline distT="0" distB="0" distL="0" distR="0" wp14:anchorId="568DFD82" wp14:editId="20434868">
+            <wp:extent cx="5715000" cy="3048000"/>
             <wp:effectExtent l="0" t="0" r="0" b="0"/>
-            <wp:docPr id="937023514" name="List_store_stock_1 (1).png" descr="List_store_stock_1 (1).png" title="List_store_stock_1 (1).png"/>
+            <wp:docPr id="1557916720" name="List_products.png" descr="List_products.png" title="List_products.png"/>
             <wp:cNvGraphicFramePr>
               <a:graphicFrameLocks xmlns:a="http://schemas.openxmlformats.org/drawingml/2006/main" noChangeAspect="1"/>
             </wp:cNvGraphicFramePr>
@@ -10402,7 +10402,7 @@
                   <pic:spPr bwMode="auto">
                     <a:xfrm>
                       <a:off x="0" y="0"/>
-                      <a:ext cx="5715000" cy="3124200"/>
+                      <a:ext cx="5715000" cy="3048000"/>
                     </a:xfrm>
                     <a:prstGeom prst="rect">
                       <a:avLst/>
@@ -10428,54 +10428,7 @@
           <w:sz w:val="18"/>
           <w:szCs w:val="18"/>
         </w:rPr>
-        <w:t>Postman — GET /api/stores/:storeId/stock -&gt; 200 Stock fetched successfully (6 rows)</w:t>
-      </w:r>
-    </w:p>
-    <w:p>
-      <w:pPr>
-        <w:pStyle w:val="Heading2"/>
-      </w:pPr>
-      <w:bookmarkStart w:id="21" w:name="_Toc239870703"/>
-      <w:r>
-        <w:t>4.4 Module 4 — Order Placement with Nearest-Store Check</w:t>
-      </w:r>
-      <w:bookmarkEnd w:id="21"/>
-    </w:p>
-    <w:p>
-      <w:pPr>
-        <w:spacing w:after="120"/>
-      </w:pPr>
-      <w:r>
-        <w:t>Customer-only. The controller (a) optionally validates the chosen delivery slot, (b) resolves the serviceable store for the pincode, (c) checks live stock for every requested line item at that store and rejects the whole order if any item is short (409 OUT_OF_STOCK, with a message naming the product, store, requested and available quantity), (d) computes pricing (flat Rs 30 delivery fee, free above Rs 499), (e) decrements stock, and (f) writes the order with a frozen item snapshot and an initial 'placed' st</w:t>
-      </w:r>
-      <w:r>
-        <w:t>atus event.</w:t>
-      </w:r>
-    </w:p>
-    <w:p>
-      <w:pPr>
-        <w:spacing w:after="120"/>
-      </w:pPr>
-      <w:r>
-        <w:rPr>
-          <w:b/>
-          <w:bCs/>
-        </w:rPr>
-        <w:t>Endpoints:</w:t>
-      </w:r>
-    </w:p>
-    <w:p>
-      <w:pPr>
-        <w:shd w:val="clear" w:color="auto" w:fill="F4F4F4"/>
-        <w:spacing w:after="120"/>
-      </w:pPr>
-      <w:r>
-        <w:rPr>
-          <w:rFonts w:ascii="Consolas" w:eastAsia="Consolas" w:hAnsi="Consolas" w:cs="Consolas"/>
-          <w:sz w:val="18"/>
-          <w:szCs w:val="18"/>
-        </w:rPr>
-        <w:t>POST /api/orders    Customer   Place an order (nearest-store + stock check)</w:t>
+        <w:t>Postman — GET /api/products -&gt; 200 Products fetched successfully</w:t>
       </w:r>
     </w:p>
     <w:p>
@@ -10488,10 +10441,10 @@
           <w:noProof/>
         </w:rPr>
         <w:drawing>
-          <wp:inline distT="0" distB="0" distL="0" distR="0" wp14:anchorId="298D416A" wp14:editId="2B1337A1">
-            <wp:extent cx="5715000" cy="3105150"/>
+          <wp:inline distT="0" distB="0" distL="0" distR="0" wp14:anchorId="503D9200" wp14:editId="6516EA22">
+            <wp:extent cx="5715000" cy="3124200"/>
             <wp:effectExtent l="0" t="0" r="0" b="0"/>
-            <wp:docPr id="875942118" name="Place_order_1.png" descr="Place_order_1.png" title="Place_order_1.png"/>
+            <wp:docPr id="2064652117" name="List_store_stock_1 (1).png" descr="List_store_stock_1 (1).png" title="List_store_stock_1 (1).png"/>
             <wp:cNvGraphicFramePr>
               <a:graphicFrameLocks xmlns:a="http://schemas.openxmlformats.org/drawingml/2006/main" noChangeAspect="1"/>
             </wp:cNvGraphicFramePr>
@@ -10514,7 +10467,7 @@
                   <pic:spPr bwMode="auto">
                     <a:xfrm>
                       <a:off x="0" y="0"/>
-                      <a:ext cx="5715000" cy="3105150"/>
+                      <a:ext cx="5715000" cy="3124200"/>
                     </a:xfrm>
                     <a:prstGeom prst="rect">
                       <a:avLst/>
@@ -10540,7 +10493,54 @@
           <w:sz w:val="18"/>
           <w:szCs w:val="18"/>
         </w:rPr>
-        <w:t>Postman — POST /api/orders -&gt; 201 Order placed successfully (itemsTotal 132, deliveryFee 30, total 162)</w:t>
+        <w:t>Postman — GET /api/stores/:storeId/stock -&gt; 200 Stock fetched successfully (6 rows)</w:t>
+      </w:r>
+    </w:p>
+    <w:p>
+      <w:pPr>
+        <w:pStyle w:val="Heading2"/>
+      </w:pPr>
+      <w:bookmarkStart w:id="21" w:name="_Toc239915176"/>
+      <w:r>
+        <w:t>4.4 Module 4 — Order Placement with Nearest-Store Check</w:t>
+      </w:r>
+      <w:bookmarkEnd w:id="21"/>
+    </w:p>
+    <w:p>
+      <w:pPr>
+        <w:spacing w:after="120"/>
+      </w:pPr>
+      <w:r>
+        <w:t>Customer-only. The controller (a) optionally validates the chosen delivery slot, (b) resolves the serviceable store for the pincode, (c) checks live stock for every requested line item at that store and rejects the whole order if any item is short (409 OUT_OF_STOCK, with a message naming the product, store, requested and available quantity), (d) computes pricing (flat Rs 30 delivery fee, free above Rs 499), (e) decrements stock, and (f) writes the order with a frozen item snapshot and an initial 'placed' st</w:t>
+      </w:r>
+      <w:r>
+        <w:t>atus event.</w:t>
+      </w:r>
+    </w:p>
+    <w:p>
+      <w:pPr>
+        <w:spacing w:after="120"/>
+      </w:pPr>
+      <w:r>
+        <w:rPr>
+          <w:b/>
+          <w:bCs/>
+        </w:rPr>
+        <w:t>Endpoints:</w:t>
+      </w:r>
+    </w:p>
+    <w:p>
+      <w:pPr>
+        <w:shd w:val="clear" w:color="auto" w:fill="F4F4F4"/>
+        <w:spacing w:after="120"/>
+      </w:pPr>
+      <w:r>
+        <w:rPr>
+          <w:rFonts w:ascii="Consolas" w:eastAsia="Consolas" w:hAnsi="Consolas" w:cs="Consolas"/>
+          <w:sz w:val="18"/>
+          <w:szCs w:val="18"/>
+        </w:rPr>
+        <w:t>POST /api/orders    Customer   Place an order (nearest-store + stock check)</w:t>
       </w:r>
     </w:p>
     <w:p>
@@ -10553,10 +10553,10 @@
           <w:noProof/>
         </w:rPr>
         <w:drawing>
-          <wp:inline distT="0" distB="0" distL="0" distR="0" wp14:anchorId="1B49F734" wp14:editId="7F9D45F3">
-            <wp:extent cx="5715000" cy="4171950"/>
+          <wp:inline distT="0" distB="0" distL="0" distR="0" wp14:anchorId="3B20F5EA" wp14:editId="7A86EA7F">
+            <wp:extent cx="5715000" cy="3105150"/>
             <wp:effectExtent l="0" t="0" r="0" b="0"/>
-            <wp:docPr id="1517577622" name="fe-03-customer-browse.png" descr="fe-03-customer-browse.png" title="fe-03-customer-browse.png"/>
+            <wp:docPr id="1927153509" name="Place_order_1.png" descr="Place_order_1.png" title="Place_order_1.png"/>
             <wp:cNvGraphicFramePr>
               <a:graphicFrameLocks xmlns:a="http://schemas.openxmlformats.org/drawingml/2006/main" noChangeAspect="1"/>
             </wp:cNvGraphicFramePr>
@@ -10579,7 +10579,7 @@
                   <pic:spPr bwMode="auto">
                     <a:xfrm>
                       <a:off x="0" y="0"/>
-                      <a:ext cx="5715000" cy="4171950"/>
+                      <a:ext cx="5715000" cy="3105150"/>
                     </a:xfrm>
                     <a:prstGeom prst="rect">
                       <a:avLst/>
@@ -10605,79 +10605,7 @@
           <w:sz w:val="18"/>
           <w:szCs w:val="18"/>
         </w:rPr>
-        <w:t>Demo UI — customer finds nearest store by pincode, browses products, builds a cart and checks out</w:t>
-      </w:r>
-    </w:p>
-    <w:p>
-      <w:pPr>
-        <w:pStyle w:val="Heading2"/>
-      </w:pPr>
-      <w:bookmarkStart w:id="22" w:name="_Toc239870704"/>
-      <w:r>
-        <w:t>4.5 Module 5 — Order Picking &amp; Packing Workflow</w:t>
-      </w:r>
-      <w:bookmarkEnd w:id="22"/>
-    </w:p>
-    <w:p>
-      <w:pPr>
-        <w:spacing w:after="120"/>
-      </w:pPr>
-      <w:r>
-        <w:t>Store staff (and admin) move an order through picking -&gt; packed via two guarded transitions. Packing stamps packedAt (used later by the performance report). Staff also have a per-store order queue filtered by status. Every transition is checked against ORDER_STATUS_FLOW and against the record-level canAccessOrder guard (staff can only act on their own store's orders).</w:t>
-      </w:r>
-    </w:p>
-    <w:p>
-      <w:pPr>
-        <w:spacing w:after="120"/>
-      </w:pPr>
-      <w:r>
-        <w:rPr>
-          <w:b/>
-          <w:bCs/>
-        </w:rPr>
-        <w:t>Endpoints:</w:t>
-      </w:r>
-    </w:p>
-    <w:p>
-      <w:pPr>
-        <w:shd w:val="clear" w:color="auto" w:fill="F4F4F4"/>
-        <w:spacing w:after="120"/>
-      </w:pPr>
-      <w:r>
-        <w:rPr>
-          <w:rFonts w:ascii="Consolas" w:eastAsia="Consolas" w:hAnsi="Consolas" w:cs="Consolas"/>
-          <w:sz w:val="18"/>
-          <w:szCs w:val="18"/>
-        </w:rPr>
-        <w:t>GET /api/stores/:storeId/orders?status=   Admin/Staff   Store picking / packing queue</w:t>
-      </w:r>
-    </w:p>
-    <w:p>
-      <w:pPr>
-        <w:shd w:val="clear" w:color="auto" w:fill="F4F4F4"/>
-        <w:spacing w:after="120"/>
-      </w:pPr>
-      <w:r>
-        <w:rPr>
-          <w:rFonts w:ascii="Consolas" w:eastAsia="Consolas" w:hAnsi="Consolas" w:cs="Consolas"/>
-          <w:sz w:val="18"/>
-          <w:szCs w:val="18"/>
-        </w:rPr>
-        <w:t>PUT /api/orders/:id/pick                   Staff/Admin   Mark items being picked  (-&gt; picking)</w:t>
-      </w:r>
-    </w:p>
-    <w:p>
-      <w:pPr>
-        <w:shd w:val="clear" w:color="auto" w:fill="F4F4F4"/>
-        <w:spacing w:after="120"/>
-      </w:pPr>
-      <w:r>
-        <w:rPr>
-          <w:rFonts w:ascii="Consolas" w:eastAsia="Consolas" w:hAnsi="Consolas" w:cs="Consolas"/>
-          <w:sz w:val="18"/>
-          <w:szCs w:val="18"/>
-        </w:rPr>
-        <w:t>PUT /api/orders/:id/pack                   Staff/Admin   Mark order packed        (-&gt; packed)</w:t>
+        <w:t>Postman — POST /api/orders -&gt; 201 Order placed successfully (itemsTotal 132, deliveryFee 30, total 162)</w:t>
       </w:r>
     </w:p>
     <w:p>
@@ -10690,10 +10618,10 @@
           <w:noProof/>
         </w:rPr>
         <w:drawing>
-          <wp:inline distT="0" distB="0" distL="0" distR="0" wp14:anchorId="4F918718" wp14:editId="1CF87B76">
-            <wp:extent cx="5715000" cy="3133725"/>
+          <wp:inline distT="0" distB="0" distL="0" distR="0" wp14:anchorId="24DEF7D5" wp14:editId="18D67D39">
+            <wp:extent cx="5715000" cy="4171950"/>
             <wp:effectExtent l="0" t="0" r="0" b="0"/>
-            <wp:docPr id="341669596" name="Pick_order_1 (1).png" descr="Pick_order_1 (1).png" title="Pick_order_1 (1).png"/>
+            <wp:docPr id="2109177000" name="fe-03-customer-browse.png" descr="fe-03-customer-browse.png" title="fe-03-customer-browse.png"/>
             <wp:cNvGraphicFramePr>
               <a:graphicFrameLocks xmlns:a="http://schemas.openxmlformats.org/drawingml/2006/main" noChangeAspect="1"/>
             </wp:cNvGraphicFramePr>
@@ -10716,7 +10644,7 @@
                   <pic:spPr bwMode="auto">
                     <a:xfrm>
                       <a:off x="0" y="0"/>
-                      <a:ext cx="5715000" cy="3133725"/>
+                      <a:ext cx="5715000" cy="4171950"/>
                     </a:xfrm>
                     <a:prstGeom prst="rect">
                       <a:avLst/>
@@ -10742,7 +10670,79 @@
           <w:sz w:val="18"/>
           <w:szCs w:val="18"/>
         </w:rPr>
-        <w:t>Postman — PUT /api/orders/:id/pick -&gt; 200 Order moved to picking</w:t>
+        <w:t>Demo UI — customer finds nearest store by pincode, browses products, builds a cart and checks out</w:t>
+      </w:r>
+    </w:p>
+    <w:p>
+      <w:pPr>
+        <w:pStyle w:val="Heading2"/>
+      </w:pPr>
+      <w:bookmarkStart w:id="22" w:name="_Toc239915177"/>
+      <w:r>
+        <w:t>4.5 Module 5 — Order Picking &amp; Packing Workflow</w:t>
+      </w:r>
+      <w:bookmarkEnd w:id="22"/>
+    </w:p>
+    <w:p>
+      <w:pPr>
+        <w:spacing w:after="120"/>
+      </w:pPr>
+      <w:r>
+        <w:t>Store staff (and admin) move an order through picking -&gt; packed via two guarded transitions. Packing stamps packedAt (used later by the performance report). Staff also have a per-store order queue filtered by status. Every transition is checked against ORDER_STATUS_FLOW and against the record-level canAccessOrder guard (staff can only act on their own store's orders).</w:t>
+      </w:r>
+    </w:p>
+    <w:p>
+      <w:pPr>
+        <w:spacing w:after="120"/>
+      </w:pPr>
+      <w:r>
+        <w:rPr>
+          <w:b/>
+          <w:bCs/>
+        </w:rPr>
+        <w:t>Endpoints:</w:t>
+      </w:r>
+    </w:p>
+    <w:p>
+      <w:pPr>
+        <w:shd w:val="clear" w:color="auto" w:fill="F4F4F4"/>
+        <w:spacing w:after="120"/>
+      </w:pPr>
+      <w:r>
+        <w:rPr>
+          <w:rFonts w:ascii="Consolas" w:eastAsia="Consolas" w:hAnsi="Consolas" w:cs="Consolas"/>
+          <w:sz w:val="18"/>
+          <w:szCs w:val="18"/>
+        </w:rPr>
+        <w:t>GET /api/stores/:storeId/orders?status=   Admin/Staff   Store picking / packing queue</w:t>
+      </w:r>
+    </w:p>
+    <w:p>
+      <w:pPr>
+        <w:shd w:val="clear" w:color="auto" w:fill="F4F4F4"/>
+        <w:spacing w:after="120"/>
+      </w:pPr>
+      <w:r>
+        <w:rPr>
+          <w:rFonts w:ascii="Consolas" w:eastAsia="Consolas" w:hAnsi="Consolas" w:cs="Consolas"/>
+          <w:sz w:val="18"/>
+          <w:szCs w:val="18"/>
+        </w:rPr>
+        <w:t>PUT /api/orders/:id/pick                   Staff/Admin   Mark items being picked  (-&gt; picking)</w:t>
+      </w:r>
+    </w:p>
+    <w:p>
+      <w:pPr>
+        <w:shd w:val="clear" w:color="auto" w:fill="F4F4F4"/>
+        <w:spacing w:after="120"/>
+      </w:pPr>
+      <w:r>
+        <w:rPr>
+          <w:rFonts w:ascii="Consolas" w:eastAsia="Consolas" w:hAnsi="Consolas" w:cs="Consolas"/>
+          <w:sz w:val="18"/>
+          <w:szCs w:val="18"/>
+        </w:rPr>
+        <w:t>PUT /api/orders/:id/pack                   Staff/Admin   Mark order packed        (-&gt; packed)</w:t>
       </w:r>
     </w:p>
     <w:p>
@@ -10755,10 +10755,10 @@
           <w:noProof/>
         </w:rPr>
         <w:drawing>
-          <wp:inline distT="0" distB="0" distL="0" distR="0" wp14:anchorId="03A52C3F" wp14:editId="729F2036">
-            <wp:extent cx="5715000" cy="3105150"/>
+          <wp:inline distT="0" distB="0" distL="0" distR="0" wp14:anchorId="778EBB30" wp14:editId="39B00537">
+            <wp:extent cx="5715000" cy="3133725"/>
             <wp:effectExtent l="0" t="0" r="0" b="0"/>
-            <wp:docPr id="2076237628" name="Pack_order_1 (1).png" descr="Pack_order_1 (1).png" title="Pack_order_1 (1).png"/>
+            <wp:docPr id="742001866" name="Pick_order_1 (1).png" descr="Pick_order_1 (1).png" title="Pick_order_1 (1).png"/>
             <wp:cNvGraphicFramePr>
               <a:graphicFrameLocks xmlns:a="http://schemas.openxmlformats.org/drawingml/2006/main" noChangeAspect="1"/>
             </wp:cNvGraphicFramePr>
@@ -10781,7 +10781,7 @@
                   <pic:spPr bwMode="auto">
                     <a:xfrm>
                       <a:off x="0" y="0"/>
-                      <a:ext cx="5715000" cy="3105150"/>
+                      <a:ext cx="5715000" cy="3133725"/>
                     </a:xfrm>
                     <a:prstGeom prst="rect">
                       <a:avLst/>
@@ -10807,7 +10807,7 @@
           <w:sz w:val="18"/>
           <w:szCs w:val="18"/>
         </w:rPr>
-        <w:t>Postman — PUT /api/orders/:id/pack -&gt; 200 Order packed successfully (packedAt set)</w:t>
+        <w:t>Postman — PUT /api/orders/:id/pick -&gt; 200 Order moved to picking</w:t>
       </w:r>
     </w:p>
     <w:p>
@@ -10820,10 +10820,10 @@
           <w:noProof/>
         </w:rPr>
         <w:drawing>
-          <wp:inline distT="0" distB="0" distL="0" distR="0" wp14:anchorId="5DA3A1B7" wp14:editId="697FCB1C">
-            <wp:extent cx="5715000" cy="4171950"/>
+          <wp:inline distT="0" distB="0" distL="0" distR="0" wp14:anchorId="30C4F4A9" wp14:editId="0EEABD88">
+            <wp:extent cx="5715000" cy="3105150"/>
             <wp:effectExtent l="0" t="0" r="0" b="0"/>
-            <wp:docPr id="584784156" name="fe-05-staff-queue.png" descr="fe-05-staff-queue.png" title="fe-05-staff-queue.png"/>
+            <wp:docPr id="1448608347" name="Pack_order_1 (1).png" descr="Pack_order_1 (1).png" title="Pack_order_1 (1).png"/>
             <wp:cNvGraphicFramePr>
               <a:graphicFrameLocks xmlns:a="http://schemas.openxmlformats.org/drawingml/2006/main" noChangeAspect="1"/>
             </wp:cNvGraphicFramePr>
@@ -10846,7 +10846,7 @@
                   <pic:spPr bwMode="auto">
                     <a:xfrm>
                       <a:off x="0" y="0"/>
-                      <a:ext cx="5715000" cy="4171950"/>
+                      <a:ext cx="5715000" cy="3105150"/>
                     </a:xfrm>
                     <a:prstGeom prst="rect">
                       <a:avLst/>
@@ -10872,93 +10872,7 @@
           <w:sz w:val="18"/>
           <w:szCs w:val="18"/>
         </w:rPr>
-        <w:t>Demo UI — store staff order queue with Pick / Pack actions and status pills</w:t>
-      </w:r>
-    </w:p>
-    <w:p>
-      <w:pPr>
-        <w:pStyle w:val="Heading2"/>
-      </w:pPr>
-      <w:bookmarkStart w:id="23" w:name="_Toc239870705"/>
-      <w:r>
-        <w:t>4.6 Module 6 — Delivery Partner Assignment</w:t>
-      </w:r>
-      <w:bookmarkEnd w:id="23"/>
-    </w:p>
-    <w:p>
-      <w:pPr>
-        <w:spacing w:after="120"/>
-      </w:pPr>
-      <w:r>
-        <w:t>Staff/admin dispatch a packed order to an available delivery partner. The controller verifies the target transition (packed -&gt; assigned), that the partner profile exists, and that isAvailable is true (else 409 PARTNER_UNAVAILABLE); it then sets order.deliveryPartnerId, flips the partner to unavailable, and records the partner's currentStoreId. Supporting endpoints list available partners and let a partner toggle their own availability.</w:t>
-      </w:r>
-    </w:p>
-    <w:p>
-      <w:pPr>
-        <w:spacing w:after="120"/>
-      </w:pPr>
-      <w:r>
-        <w:rPr>
-          <w:b/>
-          <w:bCs/>
-        </w:rPr>
-        <w:t>Endpoints:</w:t>
-      </w:r>
-    </w:p>
-    <w:p>
-      <w:pPr>
-        <w:shd w:val="clear" w:color="auto" w:fill="F4F4F4"/>
-        <w:spacing w:after="120"/>
-      </w:pPr>
-      <w:r>
-        <w:rPr>
-          <w:rFonts w:ascii="Consolas" w:eastAsia="Consolas" w:hAnsi="Consolas" w:cs="Consolas"/>
-          <w:sz w:val="18"/>
-          <w:szCs w:val="18"/>
-        </w:rPr>
-        <w:t>GET /api/delivery-partners/available?storeId=     Staff/Admin   List available partners</w:t>
-      </w:r>
-    </w:p>
-    <w:p>
-      <w:pPr>
-        <w:shd w:val="clear" w:color="auto" w:fill="F4F4F4"/>
-        <w:spacing w:after="120"/>
-      </w:pPr>
-      <w:r>
-        <w:rPr>
-          <w:rFonts w:ascii="Consolas" w:eastAsia="Consolas" w:hAnsi="Consolas" w:cs="Consolas"/>
-          <w:sz w:val="18"/>
-          <w:szCs w:val="18"/>
-        </w:rPr>
-        <w:t>GET /api/delivery-partners/me                     Partner       My partner profile</w:t>
-      </w:r>
-    </w:p>
-    <w:p>
-      <w:pPr>
-        <w:shd w:val="clear" w:color="auto" w:fill="F4F4F4"/>
-        <w:spacing w:after="120"/>
-      </w:pPr>
-      <w:r>
-        <w:rPr>
-          <w:rFonts w:ascii="Consolas" w:eastAsia="Consolas" w:hAnsi="Consolas" w:cs="Consolas"/>
-          <w:sz w:val="18"/>
-          <w:szCs w:val="18"/>
-        </w:rPr>
-        <w:t>PUT /api/delivery-partners/me/availability        Partner       Toggle availability</w:t>
-      </w:r>
-    </w:p>
-    <w:p>
-      <w:pPr>
-        <w:shd w:val="clear" w:color="auto" w:fill="F4F4F4"/>
-        <w:spacing w:after="120"/>
-      </w:pPr>
-      <w:r>
-        <w:rPr>
-          <w:rFonts w:ascii="Consolas" w:eastAsia="Consolas" w:hAnsi="Consolas" w:cs="Consolas"/>
-          <w:sz w:val="18"/>
-          <w:szCs w:val="18"/>
-        </w:rPr>
-        <w:t>PUT /api/orders/:id/assign                        Staff/Admin   Assign a delivery partner (-&gt; assigned)</w:t>
+        <w:t>Postman — PUT /api/orders/:id/pack -&gt; 200 Order packed successfully (packedAt set)</w:t>
       </w:r>
     </w:p>
     <w:p>
@@ -10971,10 +10885,10 @@
           <w:noProof/>
         </w:rPr>
         <w:drawing>
-          <wp:inline distT="0" distB="0" distL="0" distR="0" wp14:anchorId="669FE502" wp14:editId="1F2176E3">
-            <wp:extent cx="5715000" cy="3086100"/>
+          <wp:inline distT="0" distB="0" distL="0" distR="0" wp14:anchorId="5E75BE7B" wp14:editId="661957BD">
+            <wp:extent cx="5715000" cy="4171950"/>
             <wp:effectExtent l="0" t="0" r="0" b="0"/>
-            <wp:docPr id="256145117" name="Assign_partner_1 (1).png" descr="Assign_partner_1 (1).png" title="Assign_partner_1 (1).png"/>
+            <wp:docPr id="139290963" name="fe-05-staff-queue.png" descr="fe-05-staff-queue.png" title="fe-05-staff-queue.png"/>
             <wp:cNvGraphicFramePr>
               <a:graphicFrameLocks xmlns:a="http://schemas.openxmlformats.org/drawingml/2006/main" noChangeAspect="1"/>
             </wp:cNvGraphicFramePr>
@@ -10997,7 +10911,7 @@
                   <pic:spPr bwMode="auto">
                     <a:xfrm>
                       <a:off x="0" y="0"/>
-                      <a:ext cx="5715000" cy="3086100"/>
+                      <a:ext cx="5715000" cy="4171950"/>
                     </a:xfrm>
                     <a:prstGeom prst="rect">
                       <a:avLst/>
@@ -11023,25 +10937,25 @@
           <w:sz w:val="18"/>
           <w:szCs w:val="18"/>
         </w:rPr>
-        <w:t>Postman — PUT /api/orders/:id/assign -&gt; 200 Delivery partner assigned successfully (status: assigned)</w:t>
+        <w:t>Demo UI — store staff order queue with Pick / Pack actions and status pills</w:t>
       </w:r>
     </w:p>
     <w:p>
       <w:pPr>
         <w:pStyle w:val="Heading2"/>
       </w:pPr>
-      <w:bookmarkStart w:id="24" w:name="_Toc239870706"/>
-      <w:r>
-        <w:t>4.7 Module 7 — Delivery Status Tracking</w:t>
-      </w:r>
-      <w:bookmarkEnd w:id="24"/>
+      <w:bookmarkStart w:id="23" w:name="_Toc239915178"/>
+      <w:r>
+        <w:t>4.6 Module 6 — Delivery Partner Assignment</w:t>
+      </w:r>
+      <w:bookmarkEnd w:id="23"/>
     </w:p>
     <w:p>
       <w:pPr>
         <w:spacing w:after="120"/>
       </w:pPr>
       <w:r>
-        <w:t>The assigned delivery partner (or admin) advances the order assigned -&gt; out-for-delivery -&gt; delivered (or -&gt; failed). Reaching a terminal state stamps deliveredAt and frees the partner (isAvailable back to true). Illegal jumps are rejected with 409 INVALID_TRANSITION.</w:t>
+        <w:t>Staff/admin dispatch a packed order to an available delivery partner. The controller verifies the target transition (packed -&gt; assigned), that the partner profile exists, and that isAvailable is true (else 409 PARTNER_UNAVAILABLE); it then sets order.deliveryPartnerId, flips the partner to unavailable, and records the partner's currentStoreId. Supporting endpoints list available partners and let a partner toggle their own availability.</w:t>
       </w:r>
     </w:p>
     <w:p>
@@ -11067,7 +10981,49 @@
           <w:sz w:val="18"/>
           <w:szCs w:val="18"/>
         </w:rPr>
-        <w:t>PUT /api/orders/:id/status   Partner/Admin   Update delivery status  { status, note }</w:t>
+        <w:t>GET /api/delivery-partners/available?storeId=     Staff/Admin   List available partners</w:t>
+      </w:r>
+    </w:p>
+    <w:p>
+      <w:pPr>
+        <w:shd w:val="clear" w:color="auto" w:fill="F4F4F4"/>
+        <w:spacing w:after="120"/>
+      </w:pPr>
+      <w:r>
+        <w:rPr>
+          <w:rFonts w:ascii="Consolas" w:eastAsia="Consolas" w:hAnsi="Consolas" w:cs="Consolas"/>
+          <w:sz w:val="18"/>
+          <w:szCs w:val="18"/>
+        </w:rPr>
+        <w:t>GET /api/delivery-partners/me                     Partner       My partner profile</w:t>
+      </w:r>
+    </w:p>
+    <w:p>
+      <w:pPr>
+        <w:shd w:val="clear" w:color="auto" w:fill="F4F4F4"/>
+        <w:spacing w:after="120"/>
+      </w:pPr>
+      <w:r>
+        <w:rPr>
+          <w:rFonts w:ascii="Consolas" w:eastAsia="Consolas" w:hAnsi="Consolas" w:cs="Consolas"/>
+          <w:sz w:val="18"/>
+          <w:szCs w:val="18"/>
+        </w:rPr>
+        <w:t>PUT /api/delivery-partners/me/availability        Partner       Toggle availability</w:t>
+      </w:r>
+    </w:p>
+    <w:p>
+      <w:pPr>
+        <w:shd w:val="clear" w:color="auto" w:fill="F4F4F4"/>
+        <w:spacing w:after="120"/>
+      </w:pPr>
+      <w:r>
+        <w:rPr>
+          <w:rFonts w:ascii="Consolas" w:eastAsia="Consolas" w:hAnsi="Consolas" w:cs="Consolas"/>
+          <w:sz w:val="18"/>
+          <w:szCs w:val="18"/>
+        </w:rPr>
+        <w:t>PUT /api/orders/:id/assign                        Staff/Admin   Assign a delivery partner (-&gt; assigned)</w:t>
       </w:r>
     </w:p>
     <w:p>
@@ -11080,10 +11036,10 @@
           <w:noProof/>
         </w:rPr>
         <w:drawing>
-          <wp:inline distT="0" distB="0" distL="0" distR="0" wp14:anchorId="61DAB14A" wp14:editId="1DD04105">
-            <wp:extent cx="5715000" cy="3028950"/>
+          <wp:inline distT="0" distB="0" distL="0" distR="0" wp14:anchorId="7547CC71" wp14:editId="5E7B02A3">
+            <wp:extent cx="5715000" cy="3086100"/>
             <wp:effectExtent l="0" t="0" r="0" b="0"/>
-            <wp:docPr id="187845349" name="Out_for_delivery_1.png" descr="Out_for_delivery_1.png" title="Out_for_delivery_1.png"/>
+            <wp:docPr id="406327876" name="Assign_partner_1 (1).png" descr="Assign_partner_1 (1).png" title="Assign_partner_1 (1).png"/>
             <wp:cNvGraphicFramePr>
               <a:graphicFrameLocks xmlns:a="http://schemas.openxmlformats.org/drawingml/2006/main" noChangeAspect="1"/>
             </wp:cNvGraphicFramePr>
@@ -11106,7 +11062,7 @@
                   <pic:spPr bwMode="auto">
                     <a:xfrm>
                       <a:off x="0" y="0"/>
-                      <a:ext cx="5715000" cy="3028950"/>
+                      <a:ext cx="5715000" cy="3086100"/>
                     </a:xfrm>
                     <a:prstGeom prst="rect">
                       <a:avLst/>
@@ -11132,7 +11088,51 @@
           <w:sz w:val="18"/>
           <w:szCs w:val="18"/>
         </w:rPr>
-        <w:t>Postman — PUT /api/orders/:id/status -&gt; 200 status: out-for-delivery</w:t>
+        <w:t>Postman — PUT /api/orders/:id/assign -&gt; 200 Delivery partner assigned successfully (status: assigned)</w:t>
+      </w:r>
+    </w:p>
+    <w:p>
+      <w:pPr>
+        <w:pStyle w:val="Heading2"/>
+      </w:pPr>
+      <w:bookmarkStart w:id="24" w:name="_Toc239915179"/>
+      <w:r>
+        <w:t>4.7 Module 7 — Delivery Status Tracking</w:t>
+      </w:r>
+      <w:bookmarkEnd w:id="24"/>
+    </w:p>
+    <w:p>
+      <w:pPr>
+        <w:spacing w:after="120"/>
+      </w:pPr>
+      <w:r>
+        <w:t>The assigned delivery partner (or admin) advances the order assigned -&gt; out-for-delivery -&gt; delivered (or -&gt; failed). Reaching a terminal state stamps deliveredAt and frees the partner (isAvailable back to true). Illegal jumps are rejected with 409 INVALID_TRANSITION.</w:t>
+      </w:r>
+    </w:p>
+    <w:p>
+      <w:pPr>
+        <w:spacing w:after="120"/>
+      </w:pPr>
+      <w:r>
+        <w:rPr>
+          <w:b/>
+          <w:bCs/>
+        </w:rPr>
+        <w:t>Endpoints:</w:t>
+      </w:r>
+    </w:p>
+    <w:p>
+      <w:pPr>
+        <w:shd w:val="clear" w:color="auto" w:fill="F4F4F4"/>
+        <w:spacing w:after="120"/>
+      </w:pPr>
+      <w:r>
+        <w:rPr>
+          <w:rFonts w:ascii="Consolas" w:eastAsia="Consolas" w:hAnsi="Consolas" w:cs="Consolas"/>
+          <w:sz w:val="18"/>
+          <w:szCs w:val="18"/>
+        </w:rPr>
+        <w:t>PUT /api/orders/:id/status   Partner/Admin   Update delivery status  { status, note }</w:t>
       </w:r>
     </w:p>
     <w:p>
@@ -11145,10 +11145,10 @@
           <w:noProof/>
         </w:rPr>
         <w:drawing>
-          <wp:inline distT="0" distB="0" distL="0" distR="0" wp14:anchorId="595B2E30" wp14:editId="1A07CB52">
-            <wp:extent cx="5715000" cy="3105150"/>
+          <wp:inline distT="0" distB="0" distL="0" distR="0" wp14:anchorId="3020FD29" wp14:editId="7C9CCE7B">
+            <wp:extent cx="5715000" cy="3028950"/>
             <wp:effectExtent l="0" t="0" r="0" b="0"/>
-            <wp:docPr id="1978364760" name="Delivered_1 (1).png" descr="Delivered_1 (1).png" title="Delivered_1 (1).png"/>
+            <wp:docPr id="1046644098" name="Out_for_delivery_1.png" descr="Out_for_delivery_1.png" title="Out_for_delivery_1.png"/>
             <wp:cNvGraphicFramePr>
               <a:graphicFrameLocks xmlns:a="http://schemas.openxmlformats.org/drawingml/2006/main" noChangeAspect="1"/>
             </wp:cNvGraphicFramePr>
@@ -11171,7 +11171,7 @@
                   <pic:spPr bwMode="auto">
                     <a:xfrm>
                       <a:off x="0" y="0"/>
-                      <a:ext cx="5715000" cy="3105150"/>
+                      <a:ext cx="5715000" cy="3028950"/>
                     </a:xfrm>
                     <a:prstGeom prst="rect">
                       <a:avLst/>
@@ -11197,7 +11197,7 @@
           <w:sz w:val="18"/>
           <w:szCs w:val="18"/>
         </w:rPr>
-        <w:t>Postman — PUT /api/orders/:id/status -&gt; 200 status: delivered (deliveredAt set)</w:t>
+        <w:t>Postman — PUT /api/orders/:id/status -&gt; 200 status: out-for-delivery</w:t>
       </w:r>
     </w:p>
     <w:p>
@@ -11210,10 +11210,10 @@
           <w:noProof/>
         </w:rPr>
         <w:drawing>
-          <wp:inline distT="0" distB="0" distL="0" distR="0" wp14:anchorId="380FC123" wp14:editId="4F7125F8">
-            <wp:extent cx="5715000" cy="4171950"/>
+          <wp:inline distT="0" distB="0" distL="0" distR="0" wp14:anchorId="26AA348E" wp14:editId="6AAEE667">
+            <wp:extent cx="5715000" cy="3105150"/>
             <wp:effectExtent l="0" t="0" r="0" b="0"/>
-            <wp:docPr id="26760753" name="fe-06-partner.png" descr="fe-06-partner.png" title="fe-06-partner.png"/>
+            <wp:docPr id="98540901" name="Delivered_1 (1).png" descr="Delivered_1 (1).png" title="Delivered_1 (1).png"/>
             <wp:cNvGraphicFramePr>
               <a:graphicFrameLocks xmlns:a="http://schemas.openxmlformats.org/drawingml/2006/main" noChangeAspect="1"/>
             </wp:cNvGraphicFramePr>
@@ -11236,7 +11236,7 @@
                   <pic:spPr bwMode="auto">
                     <a:xfrm>
                       <a:off x="0" y="0"/>
-                      <a:ext cx="5715000" cy="4171950"/>
+                      <a:ext cx="5715000" cy="3105150"/>
                     </a:xfrm>
                     <a:prstGeom prst="rect">
                       <a:avLst/>
@@ -11262,51 +11262,7 @@
           <w:sz w:val="18"/>
           <w:szCs w:val="18"/>
         </w:rPr>
-        <w:t>Demo UI — delivery partner loads the assigned order and updates its status</w:t>
-      </w:r>
-    </w:p>
-    <w:p>
-      <w:pPr>
-        <w:pStyle w:val="Heading2"/>
-      </w:pPr>
-      <w:bookmarkStart w:id="25" w:name="_Toc239870707"/>
-      <w:r>
-        <w:t>4.8 Module 8 — Real-Time Order Status for Customer</w:t>
-      </w:r>
-      <w:bookmarkEnd w:id="25"/>
-    </w:p>
-    <w:p>
-      <w:pPr>
-        <w:spacing w:after="120"/>
-      </w:pPr>
-      <w:r>
-        <w:t>GET /api/orders/:id returns the order plus its full statusHistory[] — an append-only list of { status, at, by, note } events — so the customer app can render a live timeline. Access is checked inside the controller: a customer sees only their own orders, staff only their store's, a partner only the order assigned to them, admin everything.</w:t>
-      </w:r>
-    </w:p>
-    <w:p>
-      <w:pPr>
-        <w:spacing w:after="120"/>
-      </w:pPr>
-      <w:r>
-        <w:rPr>
-          <w:b/>
-          <w:bCs/>
-        </w:rPr>
-        <w:t>Endpoints:</w:t>
-      </w:r>
-    </w:p>
-    <w:p>
-      <w:pPr>
-        <w:shd w:val="clear" w:color="auto" w:fill="F4F4F4"/>
-        <w:spacing w:after="120"/>
-      </w:pPr>
-      <w:r>
-        <w:rPr>
-          <w:rFonts w:ascii="Consolas" w:eastAsia="Consolas" w:hAnsi="Consolas" w:cs="Consolas"/>
-          <w:sz w:val="18"/>
-          <w:szCs w:val="18"/>
-        </w:rPr>
-        <w:t>GET /api/orders/:id   Owner / Staff / Partner / Admin   Real-time status + full history</w:t>
+        <w:t>Postman — PUT /api/orders/:id/status -&gt; 200 status: delivered (deliveredAt set)</w:t>
       </w:r>
     </w:p>
     <w:p>
@@ -11319,10 +11275,10 @@
           <w:noProof/>
         </w:rPr>
         <w:drawing>
-          <wp:inline distT="0" distB="0" distL="0" distR="0" wp14:anchorId="42CA7528" wp14:editId="6BFD661B">
-            <wp:extent cx="5715000" cy="3067050"/>
+          <wp:inline distT="0" distB="0" distL="0" distR="0" wp14:anchorId="52C9EDCF" wp14:editId="27B509B9">
+            <wp:extent cx="5715000" cy="4171950"/>
             <wp:effectExtent l="0" t="0" r="0" b="0"/>
-            <wp:docPr id="1985268150" name="Get_order_1.png" descr="Get_order_1.png" title="Get_order_1.png"/>
+            <wp:docPr id="1599746134" name="fe-06-partner.png" descr="fe-06-partner.png" title="fe-06-partner.png"/>
             <wp:cNvGraphicFramePr>
               <a:graphicFrameLocks xmlns:a="http://schemas.openxmlformats.org/drawingml/2006/main" noChangeAspect="1"/>
             </wp:cNvGraphicFramePr>
@@ -11345,7 +11301,7 @@
                   <pic:spPr bwMode="auto">
                     <a:xfrm>
                       <a:off x="0" y="0"/>
-                      <a:ext cx="5715000" cy="3067050"/>
+                      <a:ext cx="5715000" cy="4171950"/>
                     </a:xfrm>
                     <a:prstGeom prst="rect">
                       <a:avLst/>
@@ -11371,7 +11327,51 @@
           <w:sz w:val="18"/>
           <w:szCs w:val="18"/>
         </w:rPr>
-        <w:t>Postman — GET /api/orders/:id -&gt; 200, status history (1/4): placed -&gt; picking</w:t>
+        <w:t>Demo UI — delivery partner loads the assigned order and updates its status</w:t>
+      </w:r>
+    </w:p>
+    <w:p>
+      <w:pPr>
+        <w:pStyle w:val="Heading2"/>
+      </w:pPr>
+      <w:bookmarkStart w:id="25" w:name="_Toc239915180"/>
+      <w:r>
+        <w:t>4.8 Module 8 — Real-Time Order Status for Customer</w:t>
+      </w:r>
+      <w:bookmarkEnd w:id="25"/>
+    </w:p>
+    <w:p>
+      <w:pPr>
+        <w:spacing w:after="120"/>
+      </w:pPr>
+      <w:r>
+        <w:t>GET /api/orders/:id returns the order plus its full statusHistory[] — an append-only list of { status, at, by, note } events — so the customer app can render a live timeline. Access is checked inside the controller: a customer sees only their own orders, staff only their store's, a partner only the order assigned to them, admin everything.</w:t>
+      </w:r>
+    </w:p>
+    <w:p>
+      <w:pPr>
+        <w:spacing w:after="120"/>
+      </w:pPr>
+      <w:r>
+        <w:rPr>
+          <w:b/>
+          <w:bCs/>
+        </w:rPr>
+        <w:t>Endpoints:</w:t>
+      </w:r>
+    </w:p>
+    <w:p>
+      <w:pPr>
+        <w:shd w:val="clear" w:color="auto" w:fill="F4F4F4"/>
+        <w:spacing w:after="120"/>
+      </w:pPr>
+      <w:r>
+        <w:rPr>
+          <w:rFonts w:ascii="Consolas" w:eastAsia="Consolas" w:hAnsi="Consolas" w:cs="Consolas"/>
+          <w:sz w:val="18"/>
+          <w:szCs w:val="18"/>
+        </w:rPr>
+        <w:t>GET /api/orders/:id   Owner / Staff / Partner / Admin   Real-time status + full history</w:t>
       </w:r>
     </w:p>
     <w:p>
@@ -11384,10 +11384,10 @@
           <w:noProof/>
         </w:rPr>
         <w:drawing>
-          <wp:inline distT="0" distB="0" distL="0" distR="0" wp14:anchorId="73430D32" wp14:editId="6E5E2CE0">
-            <wp:extent cx="5715000" cy="3076575"/>
+          <wp:inline distT="0" distB="0" distL="0" distR="0" wp14:anchorId="6742CAC8" wp14:editId="086A4CED">
+            <wp:extent cx="5715000" cy="3067050"/>
             <wp:effectExtent l="0" t="0" r="0" b="0"/>
-            <wp:docPr id="976200682" name="Get_order_2.png" descr="Get_order_2.png" title="Get_order_2.png"/>
+            <wp:docPr id="1472268356" name="Get_order_1.png" descr="Get_order_1.png" title="Get_order_1.png"/>
             <wp:cNvGraphicFramePr>
               <a:graphicFrameLocks xmlns:a="http://schemas.openxmlformats.org/drawingml/2006/main" noChangeAspect="1"/>
             </wp:cNvGraphicFramePr>
@@ -11410,7 +11410,7 @@
                   <pic:spPr bwMode="auto">
                     <a:xfrm>
                       <a:off x="0" y="0"/>
-                      <a:ext cx="5715000" cy="3076575"/>
+                      <a:ext cx="5715000" cy="3067050"/>
                     </a:xfrm>
                     <a:prstGeom prst="rect">
                       <a:avLst/>
@@ -11436,7 +11436,7 @@
           <w:sz w:val="18"/>
           <w:szCs w:val="18"/>
         </w:rPr>
-        <w:t>Postman — full timeline (2/4): packed -&gt; assigned</w:t>
+        <w:t>Postman — GET /api/orders/:id -&gt; 200, status history (1/4): placed -&gt; picking</w:t>
       </w:r>
     </w:p>
     <w:p>
@@ -11449,10 +11449,10 @@
           <w:noProof/>
         </w:rPr>
         <w:drawing>
-          <wp:inline distT="0" distB="0" distL="0" distR="0" wp14:anchorId="2DEC7501" wp14:editId="635162EE">
-            <wp:extent cx="5715000" cy="3105150"/>
+          <wp:inline distT="0" distB="0" distL="0" distR="0" wp14:anchorId="7115D3A5" wp14:editId="6D655FF1">
+            <wp:extent cx="5715000" cy="3076575"/>
             <wp:effectExtent l="0" t="0" r="0" b="0"/>
-            <wp:docPr id="215454489" name="Get_order_3.png" descr="Get_order_3.png" title="Get_order_3.png"/>
+            <wp:docPr id="1349464573" name="Get_order_2.png" descr="Get_order_2.png" title="Get_order_2.png"/>
             <wp:cNvGraphicFramePr>
               <a:graphicFrameLocks xmlns:a="http://schemas.openxmlformats.org/drawingml/2006/main" noChangeAspect="1"/>
             </wp:cNvGraphicFramePr>
@@ -11475,7 +11475,7 @@
                   <pic:spPr bwMode="auto">
                     <a:xfrm>
                       <a:off x="0" y="0"/>
-                      <a:ext cx="5715000" cy="3105150"/>
+                      <a:ext cx="5715000" cy="3076575"/>
                     </a:xfrm>
                     <a:prstGeom prst="rect">
                       <a:avLst/>
@@ -11501,7 +11501,7 @@
           <w:sz w:val="18"/>
           <w:szCs w:val="18"/>
         </w:rPr>
-        <w:t>Postman — full timeline (3/4): out-for-delivery</w:t>
+        <w:t>Postman — full timeline (2/4): packed -&gt; assigned</w:t>
       </w:r>
     </w:p>
     <w:p>
@@ -11514,10 +11514,10 @@
           <w:noProof/>
         </w:rPr>
         <w:drawing>
-          <wp:inline distT="0" distB="0" distL="0" distR="0" wp14:anchorId="444D2DCF" wp14:editId="5FE346DF">
-            <wp:extent cx="5715000" cy="3067050"/>
+          <wp:inline distT="0" distB="0" distL="0" distR="0" wp14:anchorId="651E9C41" wp14:editId="625D659E">
+            <wp:extent cx="5715000" cy="3105150"/>
             <wp:effectExtent l="0" t="0" r="0" b="0"/>
-            <wp:docPr id="1377985989" name="Get_order_4.png" descr="Get_order_4.png" title="Get_order_4.png"/>
+            <wp:docPr id="515004343" name="Get_order_3.png" descr="Get_order_3.png" title="Get_order_3.png"/>
             <wp:cNvGraphicFramePr>
               <a:graphicFrameLocks xmlns:a="http://schemas.openxmlformats.org/drawingml/2006/main" noChangeAspect="1"/>
             </wp:cNvGraphicFramePr>
@@ -11540,7 +11540,7 @@
                   <pic:spPr bwMode="auto">
                     <a:xfrm>
                       <a:off x="0" y="0"/>
-                      <a:ext cx="5715000" cy="3067050"/>
+                      <a:ext cx="5715000" cy="3105150"/>
                     </a:xfrm>
                     <a:prstGeom prst="rect">
                       <a:avLst/>
@@ -11566,51 +11566,7 @@
           <w:sz w:val="18"/>
           <w:szCs w:val="18"/>
         </w:rPr>
-        <w:t>Postman — full timeline (4/4): delivered — all six events present</w:t>
-      </w:r>
-    </w:p>
-    <w:p>
-      <w:pPr>
-        <w:pStyle w:val="Heading2"/>
-      </w:pPr>
-      <w:bookmarkStart w:id="26" w:name="_Toc239870708"/>
-      <w:r>
-        <w:t>4.9 Module 9 — Stock Replenishment Alerts</w:t>
-      </w:r>
-      <w:bookmarkEnd w:id="26"/>
-    </w:p>
-    <w:p>
-      <w:pPr>
-        <w:spacing w:after="120"/>
-      </w:pPr>
-      <w:r>
-        <w:t>GET /api/stores/:storeId/stock/alerts returns every stock row where quantity &lt;= reorderPoint (default reorderPoint 10), populated with product name/category/unit, so staff know what to restock.</w:t>
-      </w:r>
-    </w:p>
-    <w:p>
-      <w:pPr>
-        <w:spacing w:after="120"/>
-      </w:pPr>
-      <w:r>
-        <w:rPr>
-          <w:b/>
-          <w:bCs/>
-        </w:rPr>
-        <w:t>Endpoints:</w:t>
-      </w:r>
-    </w:p>
-    <w:p>
-      <w:pPr>
-        <w:shd w:val="clear" w:color="auto" w:fill="F4F4F4"/>
-        <w:spacing w:after="120"/>
-      </w:pPr>
-      <w:r>
-        <w:rPr>
-          <w:rFonts w:ascii="Consolas" w:eastAsia="Consolas" w:hAnsi="Consolas" w:cs="Consolas"/>
-          <w:sz w:val="18"/>
-          <w:szCs w:val="18"/>
-        </w:rPr>
-        <w:t>GET /api/stores/:storeId/stock/alerts   Admin/Staff   Items at or below reorderPoint</w:t>
+        <w:t>Postman — full timeline (3/4): out-for-delivery</w:t>
       </w:r>
     </w:p>
     <w:p>
@@ -11623,10 +11579,10 @@
           <w:noProof/>
         </w:rPr>
         <w:drawing>
-          <wp:inline distT="0" distB="0" distL="0" distR="0" wp14:anchorId="2D22CFB3" wp14:editId="2B86D514">
-            <wp:extent cx="5715000" cy="3086100"/>
+          <wp:inline distT="0" distB="0" distL="0" distR="0" wp14:anchorId="34104FD7" wp14:editId="70D3C517">
+            <wp:extent cx="5715000" cy="3067050"/>
             <wp:effectExtent l="0" t="0" r="0" b="0"/>
-            <wp:docPr id="606601376" name="Stock_replenishment_alert.png" descr="Stock_replenishment_alert.png" title="Stock_replenishment_alert.png"/>
+            <wp:docPr id="1949305494" name="Get_order_4.png" descr="Get_order_4.png" title="Get_order_4.png"/>
             <wp:cNvGraphicFramePr>
               <a:graphicFrameLocks xmlns:a="http://schemas.openxmlformats.org/drawingml/2006/main" noChangeAspect="1"/>
             </wp:cNvGraphicFramePr>
@@ -11649,7 +11605,7 @@
                   <pic:spPr bwMode="auto">
                     <a:xfrm>
                       <a:off x="0" y="0"/>
-                      <a:ext cx="5715000" cy="3086100"/>
+                      <a:ext cx="5715000" cy="3067050"/>
                     </a:xfrm>
                     <a:prstGeom prst="rect">
                       <a:avLst/>
@@ -11675,25 +11631,25 @@
           <w:sz w:val="18"/>
           <w:szCs w:val="18"/>
         </w:rPr>
-        <w:t>Postman — GET /api/stores/:storeId/stock/alerts -&gt; 200 Replenishment alerts fetched successfully</w:t>
+        <w:t>Postman — full timeline (4/4): delivered — all six events present</w:t>
       </w:r>
     </w:p>
     <w:p>
       <w:pPr>
         <w:pStyle w:val="Heading2"/>
       </w:pPr>
-      <w:bookmarkStart w:id="27" w:name="_Toc239870709"/>
-      <w:r>
-        <w:t>4.10 Module 10 — Delivery Time Slot Selection</w:t>
-      </w:r>
-      <w:bookmarkEnd w:id="27"/>
+      <w:bookmarkStart w:id="26" w:name="_Toc239915181"/>
+      <w:r>
+        <w:t>4.9 Module 9 — Stock Replenishment Alerts</w:t>
+      </w:r>
+      <w:bookmarkEnd w:id="26"/>
     </w:p>
     <w:p>
       <w:pPr>
         <w:spacing w:after="120"/>
       </w:pPr>
       <w:r>
-        <w:t>GET /api/slots generates bookable two-hour windows for today and tomorrow from DELIVERY_SLOT_WINDOWS (09:00-21:00, six windows/day = 12 slots). A slot passed at checkout is validated against this same generator before the order is accepted.</w:t>
+        <w:t>GET /api/stores/:storeId/stock/alerts returns every stock row where quantity &lt;= reorderPoint (default reorderPoint 10), populated with product name/category/unit, so staff know what to restock.</w:t>
       </w:r>
     </w:p>
     <w:p>
@@ -11719,7 +11675,7 @@
           <w:sz w:val="18"/>
           <w:szCs w:val="18"/>
         </w:rPr>
-        <w:t>GET /api/slots   Any   Bookable delivery windows (today + tomorrow)</w:t>
+        <w:t>GET /api/stores/:storeId/stock/alerts   Admin/Staff   Items at or below reorderPoint</w:t>
       </w:r>
     </w:p>
     <w:p>
@@ -11732,10 +11688,10 @@
           <w:noProof/>
         </w:rPr>
         <w:drawing>
-          <wp:inline distT="0" distB="0" distL="0" distR="0" wp14:anchorId="6EA92BF1" wp14:editId="6B07A7EC">
-            <wp:extent cx="5715000" cy="3114675"/>
+          <wp:inline distT="0" distB="0" distL="0" distR="0" wp14:anchorId="073D0955" wp14:editId="4B9BACAA">
+            <wp:extent cx="5715000" cy="3086100"/>
             <wp:effectExtent l="0" t="0" r="0" b="0"/>
-            <wp:docPr id="214911971" name="Delivery_slots_1.png" descr="Delivery_slots_1.png" title="Delivery_slots_1.png"/>
+            <wp:docPr id="689492721" name="Stock_replenishment_alert.png" descr="Stock_replenishment_alert.png" title="Stock_replenishment_alert.png"/>
             <wp:cNvGraphicFramePr>
               <a:graphicFrameLocks xmlns:a="http://schemas.openxmlformats.org/drawingml/2006/main" noChangeAspect="1"/>
             </wp:cNvGraphicFramePr>
@@ -11758,7 +11714,7 @@
                   <pic:spPr bwMode="auto">
                     <a:xfrm>
                       <a:off x="0" y="0"/>
-                      <a:ext cx="5715000" cy="3114675"/>
+                      <a:ext cx="5715000" cy="3086100"/>
                     </a:xfrm>
                     <a:prstGeom prst="rect">
                       <a:avLst/>
@@ -11784,25 +11740,25 @@
           <w:sz w:val="18"/>
           <w:szCs w:val="18"/>
         </w:rPr>
-        <w:t>Postman — GET /api/slots -&gt; 200 Available delivery slots (12 windows)</w:t>
+        <w:t>Postman — GET /api/stores/:storeId/stock/alerts -&gt; 200 Replenishment alerts fetched successfully</w:t>
       </w:r>
     </w:p>
     <w:p>
       <w:pPr>
         <w:pStyle w:val="Heading2"/>
       </w:pPr>
-      <w:bookmarkStart w:id="28" w:name="_Toc239870710"/>
-      <w:r>
-        <w:t>4.11 Module 11 — Customer Order History &amp; Reorder</w:t>
-      </w:r>
-      <w:bookmarkEnd w:id="28"/>
+      <w:bookmarkStart w:id="27" w:name="_Toc239915182"/>
+      <w:r>
+        <w:t>4.10 Module 10 — Delivery Time Slot Selection</w:t>
+      </w:r>
+      <w:bookmarkEnd w:id="27"/>
     </w:p>
     <w:p>
       <w:pPr>
         <w:spacing w:after="120"/>
       </w:pPr>
       <w:r>
-        <w:t>GET /api/orders/my lists the customer's orders newest-first (served by the { customerId, createdAt:-1 } index). POST /api/orders/:id/reorder rebuilds the request from a past order and re-runs the full placement path — so current stock and current prices are re-validated rather than blindly replaying an old snapshot; it returns a brand-new order.</w:t>
+        <w:t>GET /api/slots generates bookable two-hour windows for today and tomorrow from DELIVERY_SLOT_WINDOWS (09:00-21:00, six windows/day = 12 slots). A slot passed at checkout is validated against this same generator before the order is accepted.</w:t>
       </w:r>
     </w:p>
     <w:p>
@@ -11828,21 +11784,7 @@
           <w:sz w:val="18"/>
           <w:szCs w:val="18"/>
         </w:rPr>
-        <w:t>GET  /api/orders/my            Customer   Order history</w:t>
-      </w:r>
-    </w:p>
-    <w:p>
-      <w:pPr>
-        <w:shd w:val="clear" w:color="auto" w:fill="F4F4F4"/>
-        <w:spacing w:after="120"/>
-      </w:pPr>
-      <w:r>
-        <w:rPr>
-          <w:rFonts w:ascii="Consolas" w:eastAsia="Consolas" w:hAnsi="Consolas" w:cs="Consolas"/>
-          <w:sz w:val="18"/>
-          <w:szCs w:val="18"/>
-        </w:rPr>
-        <w:t>POST /api/orders/:id/reorder   Customer   Reorder a past order (re-validates stock &amp; price)</w:t>
+        <w:t>GET /api/slots   Any   Bookable delivery windows (today + tomorrow)</w:t>
       </w:r>
     </w:p>
     <w:p>
@@ -11855,10 +11797,10 @@
           <w:noProof/>
         </w:rPr>
         <w:drawing>
-          <wp:inline distT="0" distB="0" distL="0" distR="0" wp14:anchorId="1FC1EDD1" wp14:editId="6DCD1FBF">
-            <wp:extent cx="5715000" cy="3105150"/>
+          <wp:inline distT="0" distB="0" distL="0" distR="0" wp14:anchorId="2E3BC4BC" wp14:editId="45F72502">
+            <wp:extent cx="5715000" cy="3114675"/>
             <wp:effectExtent l="0" t="0" r="0" b="0"/>
-            <wp:docPr id="1375199928" name="Order_history_1.png" descr="Order_history_1.png" title="Order_history_1.png"/>
+            <wp:docPr id="1922507266" name="Delivery_slots_1.png" descr="Delivery_slots_1.png" title="Delivery_slots_1.png"/>
             <wp:cNvGraphicFramePr>
               <a:graphicFrameLocks xmlns:a="http://schemas.openxmlformats.org/drawingml/2006/main" noChangeAspect="1"/>
             </wp:cNvGraphicFramePr>
@@ -11881,7 +11823,7 @@
                   <pic:spPr bwMode="auto">
                     <a:xfrm>
                       <a:off x="0" y="0"/>
-                      <a:ext cx="5715000" cy="3105150"/>
+                      <a:ext cx="5715000" cy="3114675"/>
                     </a:xfrm>
                     <a:prstGeom prst="rect">
                       <a:avLst/>
@@ -11907,7 +11849,65 @@
           <w:sz w:val="18"/>
           <w:szCs w:val="18"/>
         </w:rPr>
-        <w:t>Postman — GET /api/orders/my -&gt; 200 Order history fetched successfully</w:t>
+        <w:t>Postman — GET /api/slots -&gt; 200 Available delivery slots (12 windows)</w:t>
+      </w:r>
+    </w:p>
+    <w:p>
+      <w:pPr>
+        <w:pStyle w:val="Heading2"/>
+      </w:pPr>
+      <w:bookmarkStart w:id="28" w:name="_Toc239915183"/>
+      <w:r>
+        <w:t>4.11 Module 11 — Customer Order History &amp; Reorder</w:t>
+      </w:r>
+      <w:bookmarkEnd w:id="28"/>
+    </w:p>
+    <w:p>
+      <w:pPr>
+        <w:spacing w:after="120"/>
+      </w:pPr>
+      <w:r>
+        <w:t>GET /api/orders/my lists the customer's orders newest-first (served by the { customerId, createdAt:-1 } index). POST /api/orders/:id/reorder rebuilds the request from a past order and re-runs the full placement path — so current stock and current prices are re-validated rather than blindly replaying an old snapshot; it returns a brand-new order.</w:t>
+      </w:r>
+    </w:p>
+    <w:p>
+      <w:pPr>
+        <w:spacing w:after="120"/>
+      </w:pPr>
+      <w:r>
+        <w:rPr>
+          <w:b/>
+          <w:bCs/>
+        </w:rPr>
+        <w:t>Endpoints:</w:t>
+      </w:r>
+    </w:p>
+    <w:p>
+      <w:pPr>
+        <w:shd w:val="clear" w:color="auto" w:fill="F4F4F4"/>
+        <w:spacing w:after="120"/>
+      </w:pPr>
+      <w:r>
+        <w:rPr>
+          <w:rFonts w:ascii="Consolas" w:eastAsia="Consolas" w:hAnsi="Consolas" w:cs="Consolas"/>
+          <w:sz w:val="18"/>
+          <w:szCs w:val="18"/>
+        </w:rPr>
+        <w:t>GET  /api/orders/my            Customer   Order history</w:t>
+      </w:r>
+    </w:p>
+    <w:p>
+      <w:pPr>
+        <w:shd w:val="clear" w:color="auto" w:fill="F4F4F4"/>
+        <w:spacing w:after="120"/>
+      </w:pPr>
+      <w:r>
+        <w:rPr>
+          <w:rFonts w:ascii="Consolas" w:eastAsia="Consolas" w:hAnsi="Consolas" w:cs="Consolas"/>
+          <w:sz w:val="18"/>
+          <w:szCs w:val="18"/>
+        </w:rPr>
+        <w:t>POST /api/orders/:id/reorder   Customer   Reorder a past order (re-validates stock &amp; price)</w:t>
       </w:r>
     </w:p>
     <w:p>
@@ -11920,10 +11920,10 @@
           <w:noProof/>
         </w:rPr>
         <w:drawing>
-          <wp:inline distT="0" distB="0" distL="0" distR="0" wp14:anchorId="7147E4C2" wp14:editId="6E1FE8C6">
-            <wp:extent cx="5715000" cy="3114675"/>
+          <wp:inline distT="0" distB="0" distL="0" distR="0" wp14:anchorId="355386DC" wp14:editId="60696430">
+            <wp:extent cx="5715000" cy="3105150"/>
             <wp:effectExtent l="0" t="0" r="0" b="0"/>
-            <wp:docPr id="613634931" name="Reorder_1.png" descr="Reorder_1.png" title="Reorder_1.png"/>
+            <wp:docPr id="1449631830" name="Order_history_1.png" descr="Order_history_1.png" title="Order_history_1.png"/>
             <wp:cNvGraphicFramePr>
               <a:graphicFrameLocks xmlns:a="http://schemas.openxmlformats.org/drawingml/2006/main" noChangeAspect="1"/>
             </wp:cNvGraphicFramePr>
@@ -11946,7 +11946,7 @@
                   <pic:spPr bwMode="auto">
                     <a:xfrm>
                       <a:off x="0" y="0"/>
-                      <a:ext cx="5715000" cy="3114675"/>
+                      <a:ext cx="5715000" cy="3105150"/>
                     </a:xfrm>
                     <a:prstGeom prst="rect">
                       <a:avLst/>
@@ -11972,7 +11972,7 @@
           <w:sz w:val="18"/>
           <w:szCs w:val="18"/>
         </w:rPr>
-        <w:t>Postman — POST /api/orders/:id/reorder -&gt; 201 Order placed successfully (new _id)</w:t>
+        <w:t>Postman — GET /api/orders/my -&gt; 200 Order history fetched successfully</w:t>
       </w:r>
     </w:p>
     <w:p>
@@ -11985,10 +11985,10 @@
           <w:noProof/>
         </w:rPr>
         <w:drawing>
-          <wp:inline distT="0" distB="0" distL="0" distR="0" wp14:anchorId="5931EF56" wp14:editId="6BB7965F">
-            <wp:extent cx="5715000" cy="4171950"/>
+          <wp:inline distT="0" distB="0" distL="0" distR="0" wp14:anchorId="46355D1B" wp14:editId="08419C38">
+            <wp:extent cx="5715000" cy="3114675"/>
             <wp:effectExtent l="0" t="0" r="0" b="0"/>
-            <wp:docPr id="1599312" name="fe-04-customer-orders.png" descr="fe-04-customer-orders.png" title="fe-04-customer-orders.png"/>
+            <wp:docPr id="801471259" name="Reorder_1.png" descr="Reorder_1.png" title="Reorder_1.png"/>
             <wp:cNvGraphicFramePr>
               <a:graphicFrameLocks xmlns:a="http://schemas.openxmlformats.org/drawingml/2006/main" noChangeAspect="1"/>
             </wp:cNvGraphicFramePr>
@@ -12011,7 +12011,7 @@
                   <pic:spPr bwMode="auto">
                     <a:xfrm>
                       <a:off x="0" y="0"/>
-                      <a:ext cx="5715000" cy="4171950"/>
+                      <a:ext cx="5715000" cy="3114675"/>
                     </a:xfrm>
                     <a:prstGeom prst="rect">
                       <a:avLst/>
@@ -12037,51 +12037,7 @@
           <w:sz w:val="18"/>
           <w:szCs w:val="18"/>
         </w:rPr>
-        <w:t>Demo UI — customer order history with per-order status and one-tap Reorder</w:t>
-      </w:r>
-    </w:p>
-    <w:p>
-      <w:pPr>
-        <w:pStyle w:val="Heading2"/>
-      </w:pPr>
-      <w:bookmarkStart w:id="29" w:name="_Toc239870711"/>
-      <w:r>
-        <w:t>4.12 Module 12 — Store &amp; Delivery Performance Reports</w:t>
-      </w:r>
-      <w:bookmarkEnd w:id="29"/>
-    </w:p>
-    <w:p>
-      <w:pPr>
-        <w:spacing w:after="120"/>
-      </w:pPr>
-      <w:r>
-        <w:t>Admin-only. A single MongoDB aggregation pipeline computes, per store: order volume, delivered/failed counts, average pick time (createdAt -&gt; packedAt), average delivery time (assigned event -&gt; deliveredAt), and revenue (sum of totalAmount for delivered orders) — straight from timestamps already on each order, with no separate reporting table.</w:t>
-      </w:r>
-    </w:p>
-    <w:p>
-      <w:pPr>
-        <w:spacing w:after="120"/>
-      </w:pPr>
-      <w:r>
-        <w:rPr>
-          <w:b/>
-          <w:bCs/>
-        </w:rPr>
-        <w:t>Endpoints:</w:t>
-      </w:r>
-    </w:p>
-    <w:p>
-      <w:pPr>
-        <w:shd w:val="clear" w:color="auto" w:fill="F4F4F4"/>
-        <w:spacing w:after="120"/>
-      </w:pPr>
-      <w:r>
-        <w:rPr>
-          <w:rFonts w:ascii="Consolas" w:eastAsia="Consolas" w:hAnsi="Consolas" w:cs="Consolas"/>
-          <w:sz w:val="18"/>
-          <w:szCs w:val="18"/>
-        </w:rPr>
-        <w:t>GET /api/admin/reports/performance   Admin   Per-store volume, avg pick/delivery time, revenue</w:t>
+        <w:t>Postman — POST /api/orders/:id/reorder -&gt; 201 Order placed successfully (new _id)</w:t>
       </w:r>
     </w:p>
     <w:p>
@@ -12094,10 +12050,10 @@
           <w:noProof/>
         </w:rPr>
         <w:drawing>
-          <wp:inline distT="0" distB="0" distL="0" distR="0" wp14:anchorId="7D10BC6F" wp14:editId="0619ED55">
-            <wp:extent cx="5715000" cy="3105150"/>
+          <wp:inline distT="0" distB="0" distL="0" distR="0" wp14:anchorId="5812C7CA" wp14:editId="63877A1B">
+            <wp:extent cx="5715000" cy="4171950"/>
             <wp:effectExtent l="0" t="0" r="0" b="0"/>
-            <wp:docPr id="466668605" name="Performance report.png" descr="Performance report.png" title="Performance report.png"/>
+            <wp:docPr id="909230571" name="fe-04-customer-orders.png" descr="fe-04-customer-orders.png" title="fe-04-customer-orders.png"/>
             <wp:cNvGraphicFramePr>
               <a:graphicFrameLocks xmlns:a="http://schemas.openxmlformats.org/drawingml/2006/main" noChangeAspect="1"/>
             </wp:cNvGraphicFramePr>
@@ -12120,7 +12076,7 @@
                   <pic:spPr bwMode="auto">
                     <a:xfrm>
                       <a:off x="0" y="0"/>
-                      <a:ext cx="5715000" cy="3105150"/>
+                      <a:ext cx="5715000" cy="4171950"/>
                     </a:xfrm>
                     <a:prstGeom prst="rect">
                       <a:avLst/>
@@ -12146,7 +12102,51 @@
           <w:sz w:val="18"/>
           <w:szCs w:val="18"/>
         </w:rPr>
-        <w:t>Postman — GET /api/admin/reports/performance -&gt; 200 Performance report generated successfully</w:t>
+        <w:t>Demo UI — customer order history with per-order status and one-tap Reorder</w:t>
+      </w:r>
+    </w:p>
+    <w:p>
+      <w:pPr>
+        <w:pStyle w:val="Heading2"/>
+      </w:pPr>
+      <w:bookmarkStart w:id="29" w:name="_Toc239915184"/>
+      <w:r>
+        <w:t>4.12 Module 12 — Store &amp; Delivery Performance Reports</w:t>
+      </w:r>
+      <w:bookmarkEnd w:id="29"/>
+    </w:p>
+    <w:p>
+      <w:pPr>
+        <w:spacing w:after="120"/>
+      </w:pPr>
+      <w:r>
+        <w:t>Admin-only. A single MongoDB aggregation pipeline computes, per store: order volume, delivered/failed counts, average pick time (createdAt -&gt; packedAt), average delivery time (assigned event -&gt; deliveredAt), and revenue (sum of totalAmount for delivered orders) — straight from timestamps already on each order, with no separate reporting table.</w:t>
+      </w:r>
+    </w:p>
+    <w:p>
+      <w:pPr>
+        <w:spacing w:after="120"/>
+      </w:pPr>
+      <w:r>
+        <w:rPr>
+          <w:b/>
+          <w:bCs/>
+        </w:rPr>
+        <w:t>Endpoints:</w:t>
+      </w:r>
+    </w:p>
+    <w:p>
+      <w:pPr>
+        <w:shd w:val="clear" w:color="auto" w:fill="F4F4F4"/>
+        <w:spacing w:after="120"/>
+      </w:pPr>
+      <w:r>
+        <w:rPr>
+          <w:rFonts w:ascii="Consolas" w:eastAsia="Consolas" w:hAnsi="Consolas" w:cs="Consolas"/>
+          <w:sz w:val="18"/>
+          <w:szCs w:val="18"/>
+        </w:rPr>
+        <w:t>GET /api/admin/reports/performance   Admin   Per-store volume, avg pick/delivery time, revenue</w:t>
       </w:r>
     </w:p>
     <w:p>
@@ -12159,10 +12159,10 @@
           <w:noProof/>
         </w:rPr>
         <w:drawing>
-          <wp:inline distT="0" distB="0" distL="0" distR="0" wp14:anchorId="2BB284DC" wp14:editId="7A9FC17D">
-            <wp:extent cx="5715000" cy="4171950"/>
+          <wp:inline distT="0" distB="0" distL="0" distR="0" wp14:anchorId="5F6442F6" wp14:editId="2469B973">
+            <wp:extent cx="5715000" cy="3105150"/>
             <wp:effectExtent l="0" t="0" r="0" b="0"/>
-            <wp:docPr id="1041348796" name="fe-07-admin-report.png" descr="fe-07-admin-report.png" title="fe-07-admin-report.png"/>
+            <wp:docPr id="1749522322" name="Performance report.png" descr="Performance report.png" title="Performance report.png"/>
             <wp:cNvGraphicFramePr>
               <a:graphicFrameLocks xmlns:a="http://schemas.openxmlformats.org/drawingml/2006/main" noChangeAspect="1"/>
             </wp:cNvGraphicFramePr>
@@ -12185,7 +12185,7 @@
                   <pic:spPr bwMode="auto">
                     <a:xfrm>
                       <a:off x="0" y="0"/>
-                      <a:ext cx="5715000" cy="4171950"/>
+                      <a:ext cx="5715000" cy="3105150"/>
                     </a:xfrm>
                     <a:prstGeom prst="rect">
                       <a:avLst/>
@@ -12211,79 +12211,7 @@
           <w:sz w:val="18"/>
           <w:szCs w:val="18"/>
         </w:rPr>
-        <w:t>Demo UI — admin performance report (6 orders, 1 delivered, avg pick 18.1 min, avg delivery 31.8 min, revenue Rs 162)</w:t>
-      </w:r>
-    </w:p>
-    <w:p>
-      <w:pPr>
-        <w:pStyle w:val="Heading2"/>
-      </w:pPr>
-      <w:bookmarkStart w:id="30" w:name="_Toc239870712"/>
-      <w:r>
-        <w:t>4.13 Module 13 — Role-Based Access Control</w:t>
-      </w:r>
-      <w:bookmarkEnd w:id="30"/>
-    </w:p>
-    <w:p>
-      <w:pPr>
-        <w:spacing w:after="120"/>
-      </w:pPr>
-      <w:r>
-        <w:t>Enforced in three layers: (1) middleware/auth.js verifies the JWT and attaches the live user record (so a revoked/deactivated user is rejected even with a valid token); (2) middleware/authorize(...roles) is a per-route role allow-list; (3) record-level checks inside orderController.canAccessOrder restrict each role to the orders it is actually party to. Missing token -&gt; 401; wrong role -&gt; 403.</w:t>
-      </w:r>
-    </w:p>
-    <w:p>
-      <w:pPr>
-        <w:spacing w:after="120"/>
-      </w:pPr>
-      <w:r>
-        <w:rPr>
-          <w:b/>
-          <w:bCs/>
-        </w:rPr>
-        <w:t>Endpoints:</w:t>
-      </w:r>
-    </w:p>
-    <w:p>
-      <w:pPr>
-        <w:shd w:val="clear" w:color="auto" w:fill="F4F4F4"/>
-        <w:spacing w:after="120"/>
-      </w:pPr>
-      <w:r>
-        <w:rPr>
-          <w:rFonts w:ascii="Consolas" w:eastAsia="Consolas" w:hAnsi="Consolas" w:cs="Consolas"/>
-          <w:sz w:val="18"/>
-          <w:szCs w:val="18"/>
-        </w:rPr>
-        <w:t>protect                     -&gt; 401 Authentication required   (no/invalid token)</w:t>
-      </w:r>
-    </w:p>
-    <w:p>
-      <w:pPr>
-        <w:shd w:val="clear" w:color="auto" w:fill="F4F4F4"/>
-        <w:spacing w:after="120"/>
-      </w:pPr>
-      <w:r>
-        <w:rPr>
-          <w:rFonts w:ascii="Consolas" w:eastAsia="Consolas" w:hAnsi="Consolas" w:cs="Consolas"/>
-          <w:sz w:val="18"/>
-          <w:szCs w:val="18"/>
-        </w:rPr>
-        <w:t>authorize('admin', ...)     -&gt; 403 You do not have permission to perform this action</w:t>
-      </w:r>
-    </w:p>
-    <w:p>
-      <w:pPr>
-        <w:shd w:val="clear" w:color="auto" w:fill="F4F4F4"/>
-        <w:spacing w:after="120"/>
-      </w:pPr>
-      <w:r>
-        <w:rPr>
-          <w:rFonts w:ascii="Consolas" w:eastAsia="Consolas" w:hAnsi="Consolas" w:cs="Consolas"/>
-          <w:sz w:val="18"/>
-          <w:szCs w:val="18"/>
-        </w:rPr>
-        <w:t>canAccessOrder(order,user)  -&gt; 403 on another user's order even with a valid token</w:t>
+        <w:t>Postman — GET /api/admin/reports/performance -&gt; 200 Performance report generated successfully</w:t>
       </w:r>
     </w:p>
     <w:p>
@@ -12296,10 +12224,10 @@
           <w:noProof/>
         </w:rPr>
         <w:drawing>
-          <wp:inline distT="0" distB="0" distL="0" distR="0" wp14:anchorId="5DCEC2E2" wp14:editId="60173649">
-            <wp:extent cx="5715000" cy="3086100"/>
+          <wp:inline distT="0" distB="0" distL="0" distR="0" wp14:anchorId="06FC41B4" wp14:editId="16715077">
+            <wp:extent cx="5715000" cy="4171950"/>
             <wp:effectExtent l="0" t="0" r="0" b="0"/>
-            <wp:docPr id="740643134" name="401_No_token.png" descr="401_No_token.png" title="401_No_token.png"/>
+            <wp:docPr id="1757577505" name="fe-07-admin-report.png" descr="fe-07-admin-report.png" title="fe-07-admin-report.png"/>
             <wp:cNvGraphicFramePr>
               <a:graphicFrameLocks xmlns:a="http://schemas.openxmlformats.org/drawingml/2006/main" noChangeAspect="1"/>
             </wp:cNvGraphicFramePr>
@@ -12322,7 +12250,7 @@
                   <pic:spPr bwMode="auto">
                     <a:xfrm>
                       <a:off x="0" y="0"/>
-                      <a:ext cx="5715000" cy="3086100"/>
+                      <a:ext cx="5715000" cy="4171950"/>
                     </a:xfrm>
                     <a:prstGeom prst="rect">
                       <a:avLst/>
@@ -12348,7 +12276,79 @@
           <w:sz w:val="18"/>
           <w:szCs w:val="18"/>
         </w:rPr>
-        <w:t>Postman — protected route with no token -&gt; 401 Authentication required</w:t>
+        <w:t>Demo UI — admin performance report (6 orders, 1 delivered, avg pick 18.1 min, avg delivery 31.8 min, revenue Rs 162)</w:t>
+      </w:r>
+    </w:p>
+    <w:p>
+      <w:pPr>
+        <w:pStyle w:val="Heading2"/>
+      </w:pPr>
+      <w:bookmarkStart w:id="30" w:name="_Toc239915185"/>
+      <w:r>
+        <w:t>4.13 Module 13 — Role-Based Access Control</w:t>
+      </w:r>
+      <w:bookmarkEnd w:id="30"/>
+    </w:p>
+    <w:p>
+      <w:pPr>
+        <w:spacing w:after="120"/>
+      </w:pPr>
+      <w:r>
+        <w:t>Enforced in three layers: (1) middleware/auth.js verifies the JWT and attaches the live user record (so a revoked/deactivated user is rejected even with a valid token); (2) middleware/authorize(...roles) is a per-route role allow-list; (3) record-level checks inside orderController.canAccessOrder restrict each role to the orders it is actually party to. Missing token -&gt; 401; wrong role -&gt; 403.</w:t>
+      </w:r>
+    </w:p>
+    <w:p>
+      <w:pPr>
+        <w:spacing w:after="120"/>
+      </w:pPr>
+      <w:r>
+        <w:rPr>
+          <w:b/>
+          <w:bCs/>
+        </w:rPr>
+        <w:t>Endpoints:</w:t>
+      </w:r>
+    </w:p>
+    <w:p>
+      <w:pPr>
+        <w:shd w:val="clear" w:color="auto" w:fill="F4F4F4"/>
+        <w:spacing w:after="120"/>
+      </w:pPr>
+      <w:r>
+        <w:rPr>
+          <w:rFonts w:ascii="Consolas" w:eastAsia="Consolas" w:hAnsi="Consolas" w:cs="Consolas"/>
+          <w:sz w:val="18"/>
+          <w:szCs w:val="18"/>
+        </w:rPr>
+        <w:t>protect                     -&gt; 401 Authentication required   (no/invalid token)</w:t>
+      </w:r>
+    </w:p>
+    <w:p>
+      <w:pPr>
+        <w:shd w:val="clear" w:color="auto" w:fill="F4F4F4"/>
+        <w:spacing w:after="120"/>
+      </w:pPr>
+      <w:r>
+        <w:rPr>
+          <w:rFonts w:ascii="Consolas" w:eastAsia="Consolas" w:hAnsi="Consolas" w:cs="Consolas"/>
+          <w:sz w:val="18"/>
+          <w:szCs w:val="18"/>
+        </w:rPr>
+        <w:t>authorize('admin', ...)     -&gt; 403 You do not have permission to perform this action</w:t>
+      </w:r>
+    </w:p>
+    <w:p>
+      <w:pPr>
+        <w:shd w:val="clear" w:color="auto" w:fill="F4F4F4"/>
+        <w:spacing w:after="120"/>
+      </w:pPr>
+      <w:r>
+        <w:rPr>
+          <w:rFonts w:ascii="Consolas" w:eastAsia="Consolas" w:hAnsi="Consolas" w:cs="Consolas"/>
+          <w:sz w:val="18"/>
+          <w:szCs w:val="18"/>
+        </w:rPr>
+        <w:t>canAccessOrder(order,user)  -&gt; 403 on another user's order even with a valid token</w:t>
       </w:r>
     </w:p>
     <w:p>
@@ -12361,10 +12361,10 @@
           <w:noProof/>
         </w:rPr>
         <w:drawing>
-          <wp:inline distT="0" distB="0" distL="0" distR="0" wp14:anchorId="758A74B8" wp14:editId="5BACADC1">
-            <wp:extent cx="5715000" cy="3076575"/>
+          <wp:inline distT="0" distB="0" distL="0" distR="0" wp14:anchorId="14288FF1" wp14:editId="7326D88E">
+            <wp:extent cx="5715000" cy="3086100"/>
             <wp:effectExtent l="0" t="0" r="0" b="0"/>
-            <wp:docPr id="466227570" name="403_Customer_calls_admin_report.png" descr="403_Customer_calls_admin_report.png" title="403_Customer_calls_admin_report.png"/>
+            <wp:docPr id="570231053" name="401_No_token.png" descr="401_No_token.png" title="401_No_token.png"/>
             <wp:cNvGraphicFramePr>
               <a:graphicFrameLocks xmlns:a="http://schemas.openxmlformats.org/drawingml/2006/main" noChangeAspect="1"/>
             </wp:cNvGraphicFramePr>
@@ -12387,6 +12387,71 @@
                   <pic:spPr bwMode="auto">
                     <a:xfrm>
                       <a:off x="0" y="0"/>
+                      <a:ext cx="5715000" cy="3086100"/>
+                    </a:xfrm>
+                    <a:prstGeom prst="rect">
+                      <a:avLst/>
+                    </a:prstGeom>
+                  </pic:spPr>
+                </pic:pic>
+              </a:graphicData>
+            </a:graphic>
+          </wp:inline>
+        </w:drawing>
+      </w:r>
+    </w:p>
+    <w:p>
+      <w:pPr>
+        <w:spacing w:after="200"/>
+        <w:jc w:val="center"/>
+      </w:pPr>
+      <w:r>
+        <w:rPr>
+          <w:i/>
+          <w:iCs/>
+          <w:color w:val="555555"/>
+          <w:sz w:val="18"/>
+          <w:szCs w:val="18"/>
+        </w:rPr>
+        <w:t>Postman — protected route with no token -&gt; 401 Authentication required</w:t>
+      </w:r>
+    </w:p>
+    <w:p>
+      <w:pPr>
+        <w:spacing w:before="120" w:after="60"/>
+        <w:jc w:val="center"/>
+      </w:pPr>
+      <w:r>
+        <w:rPr>
+          <w:noProof/>
+        </w:rPr>
+        <w:drawing>
+          <wp:inline distT="0" distB="0" distL="0" distR="0" wp14:anchorId="344EAEC8" wp14:editId="4993F769">
+            <wp:extent cx="5715000" cy="3076575"/>
+            <wp:effectExtent l="0" t="0" r="0" b="0"/>
+            <wp:docPr id="1324185460" name="403_Customer_calls_admin_report.png" descr="403_Customer_calls_admin_report.png" title="403_Customer_calls_admin_report.png"/>
+            <wp:cNvGraphicFramePr>
+              <a:graphicFrameLocks xmlns:a="http://schemas.openxmlformats.org/drawingml/2006/main" noChangeAspect="1"/>
+            </wp:cNvGraphicFramePr>
+            <a:graphic xmlns:a="http://schemas.openxmlformats.org/drawingml/2006/main">
+              <a:graphicData uri="http://schemas.openxmlformats.org/drawingml/2006/picture">
+                <pic:pic xmlns:pic="http://schemas.openxmlformats.org/drawingml/2006/picture">
+                  <pic:nvPicPr>
+                    <pic:cNvPr id="0" name=""/>
+                    <pic:cNvPicPr>
+                      <a:picLocks noChangeAspect="1" noChangeArrowheads="1"/>
+                    </pic:cNvPicPr>
+                  </pic:nvPicPr>
+                  <pic:blipFill>
+                    <a:blip r:embed="rId38"/>
+                    <a:srcRect/>
+                    <a:stretch>
+                      <a:fillRect/>
+                    </a:stretch>
+                  </pic:blipFill>
+                  <pic:spPr bwMode="auto">
+                    <a:xfrm>
+                      <a:off x="0" y="0"/>
                       <a:ext cx="5715000" cy="3076575"/>
                     </a:xfrm>
                     <a:prstGeom prst="rect">
@@ -12425,7 +12490,7 @@
       <w:pPr>
         <w:pStyle w:val="Heading1"/>
       </w:pPr>
-      <w:bookmarkStart w:id="31" w:name="_Toc239870713"/>
+      <w:bookmarkStart w:id="31" w:name="_Toc239915186"/>
       <w:r>
         <w:t>5. Complete API Endpoint Reference</w:t>
       </w:r>
@@ -12435,7 +12500,7 @@
       <w:pPr>
         <w:pStyle w:val="Heading2"/>
       </w:pPr>
-      <w:bookmarkStart w:id="32" w:name="_Toc239870714"/>
+      <w:bookmarkStart w:id="32" w:name="_Toc239915187"/>
       <w:r>
         <w:t>5.1 Auth</w:t>
       </w:r>
@@ -12952,7 +13017,7 @@
       <w:pPr>
         <w:pStyle w:val="Heading2"/>
       </w:pPr>
-      <w:bookmarkStart w:id="33" w:name="_Toc239870715"/>
+      <w:bookmarkStart w:id="33" w:name="_Toc239915188"/>
       <w:r>
         <w:t>5.2 Dark-Stores &amp; Store Stock</w:t>
       </w:r>
@@ -14397,7 +14462,7 @@
       <w:pPr>
         <w:pStyle w:val="Heading2"/>
       </w:pPr>
-      <w:bookmarkStart w:id="34" w:name="_Toc239870716"/>
+      <w:bookmarkStart w:id="34" w:name="_Toc239915189"/>
       <w:r>
         <w:t>5.3 Products</w:t>
       </w:r>
@@ -15146,7 +15211,7 @@
       <w:pPr>
         <w:pStyle w:val="Heading2"/>
       </w:pPr>
-      <w:bookmarkStart w:id="35" w:name="_Toc239870717"/>
+      <w:bookmarkStart w:id="35" w:name="_Toc239915190"/>
       <w:r>
         <w:t>5.4 Orders</w:t>
       </w:r>
@@ -16243,7 +16308,7 @@
       <w:pPr>
         <w:pStyle w:val="Heading2"/>
       </w:pPr>
-      <w:bookmarkStart w:id="36" w:name="_Toc239870718"/>
+      <w:bookmarkStart w:id="36" w:name="_Toc239915191"/>
       <w:r>
         <w:t>5.5 Delivery Partners, Slots &amp; Admin Reports</w:t>
       </w:r>
@@ -16997,7 +17062,7 @@
       <w:pPr>
         <w:pStyle w:val="Heading1"/>
       </w:pPr>
-      <w:bookmarkStart w:id="37" w:name="_Toc239870719"/>
+      <w:bookmarkStart w:id="37" w:name="_Toc239915192"/>
       <w:r>
         <w:t>6. Testing, Validation &amp; Error Handling</w:t>
       </w:r>
@@ -17015,7 +17080,7 @@
       <w:pPr>
         <w:pStyle w:val="Heading2"/>
       </w:pPr>
-      <w:bookmarkStart w:id="38" w:name="_Toc239870720"/>
+      <w:bookmarkStart w:id="38" w:name="_Toc239915193"/>
       <w:r>
         <w:t>6.1 Negative &amp; Edge Cases</w:t>
       </w:r>
@@ -17603,75 +17668,10 @@
           <w:noProof/>
         </w:rPr>
         <w:drawing>
-          <wp:inline distT="0" distB="0" distL="0" distR="0" wp14:anchorId="0A92A925" wp14:editId="376FB6BA">
+          <wp:inline distT="0" distB="0" distL="0" distR="0" wp14:anchorId="4C875F4B" wp14:editId="005FAC86">
             <wp:extent cx="5715000" cy="3124200"/>
             <wp:effectExtent l="0" t="0" r="0" b="0"/>
-            <wp:docPr id="1006290684" name="400_Register _missing_fields.png" descr="400_Register _missing_fields.png" title="400_Register _missing_fields.png"/>
-            <wp:cNvGraphicFramePr>
-              <a:graphicFrameLocks xmlns:a="http://schemas.openxmlformats.org/drawingml/2006/main" noChangeAspect="1"/>
-            </wp:cNvGraphicFramePr>
-            <a:graphic xmlns:a="http://schemas.openxmlformats.org/drawingml/2006/main">
-              <a:graphicData uri="http://schemas.openxmlformats.org/drawingml/2006/picture">
-                <pic:pic xmlns:pic="http://schemas.openxmlformats.org/drawingml/2006/picture">
-                  <pic:nvPicPr>
-                    <pic:cNvPr id="0" name=""/>
-                    <pic:cNvPicPr>
-                      <a:picLocks noChangeAspect="1" noChangeArrowheads="1"/>
-                    </pic:cNvPicPr>
-                  </pic:nvPicPr>
-                  <pic:blipFill>
-                    <a:blip r:embed="rId38"/>
-                    <a:srcRect/>
-                    <a:stretch>
-                      <a:fillRect/>
-                    </a:stretch>
-                  </pic:blipFill>
-                  <pic:spPr bwMode="auto">
-                    <a:xfrm>
-                      <a:off x="0" y="0"/>
-                      <a:ext cx="5715000" cy="3124200"/>
-                    </a:xfrm>
-                    <a:prstGeom prst="rect">
-                      <a:avLst/>
-                    </a:prstGeom>
-                  </pic:spPr>
-                </pic:pic>
-              </a:graphicData>
-            </a:graphic>
-          </wp:inline>
-        </w:drawing>
-      </w:r>
-    </w:p>
-    <w:p>
-      <w:pPr>
-        <w:spacing w:after="200"/>
-        <w:jc w:val="center"/>
-      </w:pPr>
-      <w:r>
-        <w:rPr>
-          <w:i/>
-          <w:iCs/>
-          <w:color w:val="555555"/>
-          <w:sz w:val="18"/>
-          <w:szCs w:val="18"/>
-        </w:rPr>
-        <w:t>400 — validation error, all missing fields reported at once</w:t>
-      </w:r>
-    </w:p>
-    <w:p>
-      <w:pPr>
-        <w:spacing w:before="120" w:after="60"/>
-        <w:jc w:val="center"/>
-      </w:pPr>
-      <w:r>
-        <w:rPr>
-          <w:noProof/>
-        </w:rPr>
-        <w:drawing>
-          <wp:inline distT="0" distB="0" distL="0" distR="0" wp14:anchorId="53C1BF95" wp14:editId="4ADF91F1">
-            <wp:extent cx="5715000" cy="3124200"/>
-            <wp:effectExtent l="0" t="0" r="0" b="0"/>
-            <wp:docPr id="1188773141" name="404_Invalid_ID.png" descr="404_Invalid_ID.png" title="404_Invalid_ID.png"/>
+            <wp:docPr id="1059464160" name="400_Register _missing_fields.png" descr="400_Register _missing_fields.png" title="400_Register _missing_fields.png"/>
             <wp:cNvGraphicFramePr>
               <a:graphicFrameLocks xmlns:a="http://schemas.openxmlformats.org/drawingml/2006/main" noChangeAspect="1"/>
             </wp:cNvGraphicFramePr>
@@ -17720,7 +17720,7 @@
           <w:sz w:val="18"/>
           <w:szCs w:val="18"/>
         </w:rPr>
-        <w:t>404 — order with an invalid / unknown id</w:t>
+        <w:t>400 — validation error, all missing fields reported at once</w:t>
       </w:r>
     </w:p>
     <w:p>
@@ -17733,10 +17733,10 @@
           <w:noProof/>
         </w:rPr>
         <w:drawing>
-          <wp:inline distT="0" distB="0" distL="0" distR="0" wp14:anchorId="7DEEAA15" wp14:editId="47FFD82C">
-            <wp:extent cx="5715000" cy="3095625"/>
+          <wp:inline distT="0" distB="0" distL="0" distR="0" wp14:anchorId="716A2FD9" wp14:editId="11BA8741">
+            <wp:extent cx="5715000" cy="3124200"/>
             <wp:effectExtent l="0" t="0" r="0" b="0"/>
-            <wp:docPr id="246900544" name="409_Out_of_stock.png" descr="409_Out_of_stock.png" title="409_Out_of_stock.png"/>
+            <wp:docPr id="1653369883" name="404_Invalid_ID.png" descr="404_Invalid_ID.png" title="404_Invalid_ID.png"/>
             <wp:cNvGraphicFramePr>
               <a:graphicFrameLocks xmlns:a="http://schemas.openxmlformats.org/drawingml/2006/main" noChangeAspect="1"/>
             </wp:cNvGraphicFramePr>
@@ -17759,6 +17759,71 @@
                   <pic:spPr bwMode="auto">
                     <a:xfrm>
                       <a:off x="0" y="0"/>
+                      <a:ext cx="5715000" cy="3124200"/>
+                    </a:xfrm>
+                    <a:prstGeom prst="rect">
+                      <a:avLst/>
+                    </a:prstGeom>
+                  </pic:spPr>
+                </pic:pic>
+              </a:graphicData>
+            </a:graphic>
+          </wp:inline>
+        </w:drawing>
+      </w:r>
+    </w:p>
+    <w:p>
+      <w:pPr>
+        <w:spacing w:after="200"/>
+        <w:jc w:val="center"/>
+      </w:pPr>
+      <w:r>
+        <w:rPr>
+          <w:i/>
+          <w:iCs/>
+          <w:color w:val="555555"/>
+          <w:sz w:val="18"/>
+          <w:szCs w:val="18"/>
+        </w:rPr>
+        <w:t>404 — order with an invalid / unknown id</w:t>
+      </w:r>
+    </w:p>
+    <w:p>
+      <w:pPr>
+        <w:spacing w:before="120" w:after="60"/>
+        <w:jc w:val="center"/>
+      </w:pPr>
+      <w:r>
+        <w:rPr>
+          <w:noProof/>
+        </w:rPr>
+        <w:drawing>
+          <wp:inline distT="0" distB="0" distL="0" distR="0" wp14:anchorId="3BE38E5F" wp14:editId="23D9B079">
+            <wp:extent cx="5715000" cy="3095625"/>
+            <wp:effectExtent l="0" t="0" r="0" b="0"/>
+            <wp:docPr id="964932019" name="409_Out_of_stock.png" descr="409_Out_of_stock.png" title="409_Out_of_stock.png"/>
+            <wp:cNvGraphicFramePr>
+              <a:graphicFrameLocks xmlns:a="http://schemas.openxmlformats.org/drawingml/2006/main" noChangeAspect="1"/>
+            </wp:cNvGraphicFramePr>
+            <a:graphic xmlns:a="http://schemas.openxmlformats.org/drawingml/2006/main">
+              <a:graphicData uri="http://schemas.openxmlformats.org/drawingml/2006/picture">
+                <pic:pic xmlns:pic="http://schemas.openxmlformats.org/drawingml/2006/picture">
+                  <pic:nvPicPr>
+                    <pic:cNvPr id="0" name=""/>
+                    <pic:cNvPicPr>
+                      <a:picLocks noChangeAspect="1" noChangeArrowheads="1"/>
+                    </pic:cNvPicPr>
+                  </pic:nvPicPr>
+                  <pic:blipFill>
+                    <a:blip r:embed="rId41"/>
+                    <a:srcRect/>
+                    <a:stretch>
+                      <a:fillRect/>
+                    </a:stretch>
+                  </pic:blipFill>
+                  <pic:spPr bwMode="auto">
+                    <a:xfrm>
+                      <a:off x="0" y="0"/>
                       <a:ext cx="5715000" cy="3095625"/>
                     </a:xfrm>
                     <a:prstGeom prst="rect">
@@ -17792,7 +17857,7 @@
       <w:pPr>
         <w:pStyle w:val="Heading2"/>
       </w:pPr>
-      <w:bookmarkStart w:id="39" w:name="_Toc239870721"/>
+      <w:bookmarkStart w:id="39" w:name="_Toc239915194"/>
       <w:r>
         <w:t>6.2 Validation &amp; Error-Handling Design</w:t>
       </w:r>
@@ -17859,7 +17924,7 @@
       <w:pPr>
         <w:pStyle w:val="Heading1"/>
       </w:pPr>
-      <w:bookmarkStart w:id="40" w:name="_Toc239870722"/>
+      <w:bookmarkStart w:id="40" w:name="_Toc239915195"/>
       <w:r>
         <w:t>7. Setup &amp; Run Instructions</w:t>
       </w:r>
@@ -18086,7 +18151,7 @@
       <w:pPr>
         <w:pStyle w:val="Heading2"/>
       </w:pPr>
-      <w:bookmarkStart w:id="41" w:name="_Toc239870723"/>
+      <w:bookmarkStart w:id="41" w:name="_Toc239915196"/>
       <w:r>
         <w:t>7.1 Seed Accounts</w:t>
       </w:r>
@@ -18579,7 +18644,7 @@
       <w:pPr>
         <w:pStyle w:val="Heading1"/>
       </w:pPr>
-      <w:bookmarkStart w:id="42" w:name="_Toc239870724"/>
+      <w:bookmarkStart w:id="42" w:name="_Toc239915197"/>
       <w:r>
         <w:t>8. Known Limitations</w:t>
       </w:r>
@@ -18654,7 +18719,7 @@
       <w:pPr>
         <w:pStyle w:val="Heading1"/>
       </w:pPr>
-      <w:bookmarkStart w:id="43" w:name="_Toc239870725"/>
+      <w:bookmarkStart w:id="43" w:name="_Toc239915198"/>
       <w:r>
         <w:t>9. Learnings &amp; Challenges</w:t>
       </w:r>
@@ -18742,7 +18807,7 @@
       <w:pPr>
         <w:pStyle w:val="Heading1"/>
       </w:pPr>
-      <w:bookmarkStart w:id="44" w:name="_Toc239870726"/>
+      <w:bookmarkStart w:id="44" w:name="_Toc239915199"/>
       <w:r>
         <w:t>10. Conclusion</w:t>
       </w:r>
@@ -18767,7 +18832,7 @@
         </w:rPr>
         <w:t xml:space="preserve">Repository: </w:t>
       </w:r>
-      <w:hyperlink r:id="rId41" w:history="1">
+      <w:hyperlink r:id="rId42" w:history="1">
         <w:r>
           <w:rPr>
             <w:rStyle w:val="Hyperlink"/>
@@ -18777,8 +18842,8 @@
       </w:hyperlink>
     </w:p>
     <w:sectPr>
-      <w:headerReference w:type="default" r:id="rId42"/>
-      <w:footerReference w:type="default" r:id="rId43"/>
+      <w:headerReference w:type="default" r:id="rId43"/>
+      <w:footerReference w:type="default" r:id="rId44"/>
       <w:pgSz w:w="12240" w:h="15840"/>
       <w:pgMar w:top="1440" w:right="1440" w:bottom="1440" w:left="1440" w:header="708" w:footer="708" w:gutter="0"/>
       <w:cols w:space="720"/>
@@ -18958,10 +19023,10 @@
 <file path=word/numbering.xml><?xml version="1.0" encoding="utf-8"?>
 <w:numbering xmlns:wpc="http://schemas.microsoft.com/office/word/2010/wordprocessingCanvas" xmlns:cx="http://schemas.microsoft.com/office/drawing/2014/chartex" xmlns:cx1="http://schemas.microsoft.com/office/drawing/2015/9/8/chartex" xmlns:cx2="http://schemas.microsoft.com/office/drawing/2015/10/21/chartex" xmlns:cx3="http://schemas.microsoft.com/office/drawing/2016/5/9/chartex" xmlns:cx4="http://schemas.microsoft.com/office/drawing/2016/5/10/chartex" xmlns:cx5="http://schemas.microsoft.com/office/drawing/2016/5/11/chartex" xmlns:cx6="http://schemas.microsoft.com/office/drawing/2016/5/12/chartex" xmlns:cx7="http://schemas.microsoft.com/office/drawing/2016/5/13/chartex" xmlns:cx8="http://schemas.microsoft.com/office/drawing/2016/5/14/chartex" xmlns:mc="http://schemas.openxmlformats.org/markup-compatibility/2006" xmlns:aink="http://schemas.microsoft.com/office/drawing/2016/ink" xmlns:am3d="http://schemas.microsoft.com/office/drawing/2017/model3d" xmlns:o="urn:schemas-microsoft-com:office:office" xmlns:oel="http://schemas.microsoft.com/office/2019/extlst" xmlns:r="http://schemas.openxmlformats.org/officeDocument/2006/relationships" xmlns:m="http://schemas.openxmlformats.org/officeDocument/2006/math" xmlns:v="urn:schemas-microsoft-com:vml" xmlns:wp14="http://schemas.microsoft.com/office/word/2010/wordprocessingDrawing" xmlns:wp="http://schemas.openxmlformats.org/drawingml/2006/wordprocessingDrawing" xmlns:w10="urn:schemas-microsoft-com:office:word" xmlns:w="http://schemas.openxmlformats.org/wordprocessingml/2006/main" xmlns:w14="http://schemas.microsoft.com/office/word/2010/wordml" xmlns:w15="http://schemas.microsoft.com/office/word/2012/wordml" xmlns:w16cex="http://schemas.microsoft.com/office/word/2018/wordml/cex" xmlns:w16cid="http://schemas.microsoft.com/office/word/2016/wordml/cid" xmlns:w16="http://schemas.microsoft.com/office/word/2018/wordml" xmlns:w16du="http://schemas.microsoft.com/office/word/2023/wordml/word16du" xmlns:w16sdtdh="http://schemas.microsoft.com/office/word/2020/wordml/sdtdatahash" xmlns:w16sdtfl="http://schemas.microsoft.com/office/word/2024/wordml/sdtformatlock" xmlns:w16se="http://schemas.microsoft.com/office/word/2015/wordml/symex" xmlns:wpg="http://schemas.microsoft.com/office/word/2010/wordprocessingGroup" xmlns:wpi="http://schemas.microsoft.com/office/word/2010/wordprocessingInk" xmlns:wne="http://schemas.microsoft.com/office/word/2006/wordml" xmlns:wps="http://schemas.microsoft.com/office/word/2010/wordprocessingShape" mc:Ignorable="w14 w15 w16se w16cid w16 w16cex w16sdtdh w16sdtfl w16du wp14">
   <w:abstractNum w:abstractNumId="0" w15:restartNumberingAfterBreak="0">
-    <w:nsid w:val="36CF56C6"/>
+    <w:nsid w:val="07EC144B"/>
     <w:multiLevelType w:val="hybridMultilevel"/>
-    <w:tmpl w:val="40A464C0"/>
-    <w:lvl w:ilvl="0" w:tplc="9DF65082">
+    <w:tmpl w:val="4B60286C"/>
+    <w:lvl w:ilvl="0" w:tplc="4190AC04">
       <w:start w:val="1"/>
       <w:numFmt w:val="bullet"/>
       <w:lvlText w:val="●"/>
@@ -18970,7 +19035,7 @@
         <w:ind w:left="720" w:hanging="360"/>
       </w:pPr>
     </w:lvl>
-    <w:lvl w:ilvl="1" w:tplc="D99022D0">
+    <w:lvl w:ilvl="1" w:tplc="BDC850D6">
       <w:start w:val="1"/>
       <w:numFmt w:val="bullet"/>
       <w:lvlText w:val="○"/>
@@ -18979,7 +19044,7 @@
         <w:ind w:left="1440" w:hanging="360"/>
       </w:pPr>
     </w:lvl>
-    <w:lvl w:ilvl="2" w:tplc="F4C6D796">
+    <w:lvl w:ilvl="2" w:tplc="B6B4ADA6">
       <w:start w:val="1"/>
       <w:numFmt w:val="bullet"/>
       <w:lvlText w:val="■"/>
@@ -18988,7 +19053,7 @@
         <w:ind w:left="2160" w:hanging="360"/>
       </w:pPr>
     </w:lvl>
-    <w:lvl w:ilvl="3" w:tplc="3EDA9F4A">
+    <w:lvl w:ilvl="3" w:tplc="5256238E">
       <w:start w:val="1"/>
       <w:numFmt w:val="bullet"/>
       <w:lvlText w:val="●"/>
@@ -18997,7 +19062,7 @@
         <w:ind w:left="2880" w:hanging="360"/>
       </w:pPr>
     </w:lvl>
-    <w:lvl w:ilvl="4" w:tplc="6F76985E">
+    <w:lvl w:ilvl="4" w:tplc="5C2C61E8">
       <w:start w:val="1"/>
       <w:numFmt w:val="bullet"/>
       <w:lvlText w:val="○"/>
@@ -19006,7 +19071,7 @@
         <w:ind w:left="3600" w:hanging="360"/>
       </w:pPr>
     </w:lvl>
-    <w:lvl w:ilvl="5" w:tplc="B874C71A">
+    <w:lvl w:ilvl="5" w:tplc="7D524074">
       <w:start w:val="1"/>
       <w:numFmt w:val="bullet"/>
       <w:lvlText w:val="■"/>
@@ -19015,7 +19080,7 @@
         <w:ind w:left="4320" w:hanging="360"/>
       </w:pPr>
     </w:lvl>
-    <w:lvl w:ilvl="6" w:tplc="AE22C876">
+    <w:lvl w:ilvl="6" w:tplc="0AB8A626">
       <w:start w:val="1"/>
       <w:numFmt w:val="bullet"/>
       <w:lvlText w:val="●"/>
@@ -19024,7 +19089,7 @@
         <w:ind w:left="5040" w:hanging="360"/>
       </w:pPr>
     </w:lvl>
-    <w:lvl w:ilvl="7" w:tplc="D2FE0352">
+    <w:lvl w:ilvl="7" w:tplc="A8FEBC2E">
       <w:start w:val="1"/>
       <w:numFmt w:val="bullet"/>
       <w:lvlText w:val="●"/>
@@ -19033,7 +19098,7 @@
         <w:ind w:left="5760" w:hanging="360"/>
       </w:pPr>
     </w:lvl>
-    <w:lvl w:ilvl="8" w:tplc="D4B84BBE">
+    <w:lvl w:ilvl="8" w:tplc="BD8C50AE">
       <w:start w:val="1"/>
       <w:numFmt w:val="bullet"/>
       <w:lvlText w:val="●"/>
@@ -19044,127 +19109,127 @@
     </w:lvl>
   </w:abstractNum>
   <w:abstractNum w:abstractNumId="1" w15:restartNumberingAfterBreak="0">
-    <w:nsid w:val="53DC5689"/>
+    <w:nsid w:val="39BC2963"/>
     <w:multiLevelType w:val="hybridMultilevel"/>
-    <w:tmpl w:val="224AD3EE"/>
-    <w:lvl w:ilvl="0" w:tplc="D9287CCC">
+    <w:tmpl w:val="F5E6030E"/>
+    <w:lvl w:ilvl="0" w:tplc="8710D2C0">
       <w:start w:val="1"/>
-      <w:numFmt w:val="bullet"/>
-      <w:lvlText w:val="•"/>
+      <w:numFmt w:val="decimal"/>
+      <w:lvlText w:val="%1."/>
       <w:lvlJc w:val="left"/>
       <w:pPr>
         <w:ind w:left="480" w:hanging="280"/>
       </w:pPr>
     </w:lvl>
-    <w:lvl w:ilvl="1" w:tplc="3258C79A">
+    <w:lvl w:ilvl="1" w:tplc="9D2E8458">
       <w:numFmt w:val="decimal"/>
       <w:lvlText w:val=""/>
       <w:lvlJc w:val="left"/>
     </w:lvl>
-    <w:lvl w:ilvl="2" w:tplc="D5F246A8">
+    <w:lvl w:ilvl="2" w:tplc="C4C0818A">
       <w:numFmt w:val="decimal"/>
       <w:lvlText w:val=""/>
       <w:lvlJc w:val="left"/>
     </w:lvl>
-    <w:lvl w:ilvl="3" w:tplc="2564BCA8">
+    <w:lvl w:ilvl="3" w:tplc="1C148C7E">
       <w:numFmt w:val="decimal"/>
       <w:lvlText w:val=""/>
       <w:lvlJc w:val="left"/>
     </w:lvl>
-    <w:lvl w:ilvl="4" w:tplc="30768234">
+    <w:lvl w:ilvl="4" w:tplc="5ED4449E">
       <w:numFmt w:val="decimal"/>
       <w:lvlText w:val=""/>
       <w:lvlJc w:val="left"/>
     </w:lvl>
-    <w:lvl w:ilvl="5" w:tplc="7222F0CC">
+    <w:lvl w:ilvl="5" w:tplc="AF88A90C">
       <w:numFmt w:val="decimal"/>
       <w:lvlText w:val=""/>
       <w:lvlJc w:val="left"/>
     </w:lvl>
-    <w:lvl w:ilvl="6" w:tplc="59AA5E68">
+    <w:lvl w:ilvl="6" w:tplc="9F70F438">
       <w:numFmt w:val="decimal"/>
       <w:lvlText w:val=""/>
       <w:lvlJc w:val="left"/>
     </w:lvl>
-    <w:lvl w:ilvl="7" w:tplc="54501A26">
+    <w:lvl w:ilvl="7" w:tplc="B8F2C97C">
       <w:numFmt w:val="decimal"/>
       <w:lvlText w:val=""/>
       <w:lvlJc w:val="left"/>
     </w:lvl>
-    <w:lvl w:ilvl="8" w:tplc="7C207F72">
+    <w:lvl w:ilvl="8" w:tplc="1898E07C">
       <w:numFmt w:val="decimal"/>
       <w:lvlText w:val=""/>
       <w:lvlJc w:val="left"/>
     </w:lvl>
   </w:abstractNum>
   <w:abstractNum w:abstractNumId="2" w15:restartNumberingAfterBreak="0">
-    <w:nsid w:val="77B233AE"/>
+    <w:nsid w:val="7A222A9D"/>
     <w:multiLevelType w:val="hybridMultilevel"/>
-    <w:tmpl w:val="C27CA794"/>
-    <w:lvl w:ilvl="0" w:tplc="553E7BB0">
+    <w:tmpl w:val="1C265862"/>
+    <w:lvl w:ilvl="0" w:tplc="1ED08E90">
       <w:start w:val="1"/>
-      <w:numFmt w:val="decimal"/>
-      <w:lvlText w:val="%1."/>
+      <w:numFmt w:val="bullet"/>
+      <w:lvlText w:val="•"/>
       <w:lvlJc w:val="left"/>
       <w:pPr>
         <w:ind w:left="480" w:hanging="280"/>
       </w:pPr>
     </w:lvl>
-    <w:lvl w:ilvl="1" w:tplc="6C380B14">
+    <w:lvl w:ilvl="1" w:tplc="9F8C269A">
       <w:numFmt w:val="decimal"/>
       <w:lvlText w:val=""/>
       <w:lvlJc w:val="left"/>
     </w:lvl>
-    <w:lvl w:ilvl="2" w:tplc="5F804680">
+    <w:lvl w:ilvl="2" w:tplc="4E2A2D30">
       <w:numFmt w:val="decimal"/>
       <w:lvlText w:val=""/>
       <w:lvlJc w:val="left"/>
     </w:lvl>
-    <w:lvl w:ilvl="3" w:tplc="1FEC0396">
+    <w:lvl w:ilvl="3" w:tplc="E4040F5A">
       <w:numFmt w:val="decimal"/>
       <w:lvlText w:val=""/>
       <w:lvlJc w:val="left"/>
     </w:lvl>
-    <w:lvl w:ilvl="4" w:tplc="0EFAF350">
+    <w:lvl w:ilvl="4" w:tplc="6E261D62">
       <w:numFmt w:val="decimal"/>
       <w:lvlText w:val=""/>
       <w:lvlJc w:val="left"/>
     </w:lvl>
-    <w:lvl w:ilvl="5" w:tplc="E21CEF8A">
+    <w:lvl w:ilvl="5" w:tplc="A7A4D430">
       <w:numFmt w:val="decimal"/>
       <w:lvlText w:val=""/>
       <w:lvlJc w:val="left"/>
     </w:lvl>
-    <w:lvl w:ilvl="6" w:tplc="08089FA4">
+    <w:lvl w:ilvl="6" w:tplc="C48E3388">
       <w:numFmt w:val="decimal"/>
       <w:lvlText w:val=""/>
       <w:lvlJc w:val="left"/>
     </w:lvl>
-    <w:lvl w:ilvl="7" w:tplc="E11C9DC4">
+    <w:lvl w:ilvl="7" w:tplc="7AAA319E">
       <w:numFmt w:val="decimal"/>
       <w:lvlText w:val=""/>
       <w:lvlJc w:val="left"/>
     </w:lvl>
-    <w:lvl w:ilvl="8" w:tplc="D3B09438">
+    <w:lvl w:ilvl="8" w:tplc="F932B6A8">
       <w:numFmt w:val="decimal"/>
       <w:lvlText w:val=""/>
       <w:lvlJc w:val="left"/>
     </w:lvl>
   </w:abstractNum>
-  <w:num w:numId="1" w16cid:durableId="1967851040">
+  <w:num w:numId="1" w16cid:durableId="673728694">
     <w:abstractNumId w:val="0"/>
     <w:lvlOverride w:ilvl="0">
       <w:startOverride w:val="1"/>
     </w:lvlOverride>
   </w:num>
-  <w:num w:numId="2" w16cid:durableId="462231352">
-    <w:abstractNumId w:val="1"/>
+  <w:num w:numId="2" w16cid:durableId="1134714987">
+    <w:abstractNumId w:val="2"/>
     <w:lvlOverride w:ilvl="0">
       <w:startOverride w:val="1"/>
     </w:lvlOverride>
   </w:num>
-  <w:num w:numId="3" w16cid:durableId="1757285153">
-    <w:abstractNumId w:val="2"/>
+  <w:num w:numId="3" w16cid:durableId="34621171">
+    <w:abstractNumId w:val="1"/>
     <w:lvlOverride w:ilvl="0">
       <w:startOverride w:val="1"/>
     </w:lvlOverride>
@@ -19782,7 +19847,7 @@
     <w:autoRedefine/>
     <w:uiPriority w:val="39"/>
     <w:unhideWhenUsed/>
-    <w:rsid w:val="00FA3192"/>
+    <w:rsid w:val="00BD71AB"/>
     <w:pPr>
       <w:spacing w:after="100"/>
     </w:pPr>
@@ -19794,7 +19859,7 @@
     <w:autoRedefine/>
     <w:uiPriority w:val="39"/>
     <w:unhideWhenUsed/>
-    <w:rsid w:val="00FA3192"/>
+    <w:rsid w:val="00BD71AB"/>
     <w:pPr>
       <w:spacing w:after="100"/>
       <w:ind w:left="220"/>

</xml_diff>

<commit_message>
Replace ER diagram with proper crow's-foot version (all fields commented); refresh report PDF/DOCX and deck
</commit_message>
<xml_diff>
--- a/submission/P19_Team19_5BTCSB.docx
+++ b/submission/P19_Team19_5BTCSB.docx
@@ -1323,7 +1323,7 @@
       <w:pPr>
         <w:pStyle w:val="Heading1"/>
       </w:pPr>
-      <w:bookmarkStart w:id="0" w:name="_Toc239915155"/>
+      <w:bookmarkStart w:id="0" w:name="_Toc239916426"/>
       <w:r>
         <w:t>Table of Contents</w:t>
       </w:r>
@@ -1332,7 +1332,7 @@
     <w:sdt>
       <w:sdtPr>
         <w:alias w:val="Table of Contents"/>
-        <w:id w:val="-1072348088"/>
+        <w:id w:val="1264653292"/>
       </w:sdtPr>
       <w:sdtEndPr/>
       <w:sdtContent>
@@ -1360,7 +1360,7 @@
           <w:r>
             <w:fldChar w:fldCharType="separate"/>
           </w:r>
-          <w:hyperlink w:anchor="_Toc239915155" w:history="1">
+          <w:hyperlink w:anchor="_Toc239916426" w:history="1">
             <w:r>
               <w:rPr>
                 <w:rStyle w:val="Hyperlink"/>
@@ -1384,7 +1384,7 @@
               <w:rPr>
                 <w:noProof/>
               </w:rPr>
-              <w:instrText xml:space="preserve"> PAGEREF _Toc239915155 \h </w:instrText>
+              <w:instrText xml:space="preserve"> PAGEREF _Toc239916426 \h </w:instrText>
             </w:r>
             <w:r>
               <w:rPr>
@@ -1426,7 +1426,7 @@
               <w14:ligatures w14:val="standardContextual"/>
             </w:rPr>
           </w:pPr>
-          <w:hyperlink w:anchor="_Toc239915156" w:history="1">
+          <w:hyperlink w:anchor="_Toc239916427" w:history="1">
             <w:r>
               <w:rPr>
                 <w:rStyle w:val="Hyperlink"/>
@@ -1450,7 +1450,7 @@
               <w:rPr>
                 <w:noProof/>
               </w:rPr>
-              <w:instrText xml:space="preserve"> PAGEREF _Toc239915156 \h </w:instrText>
+              <w:instrText xml:space="preserve"> PAGEREF _Toc239916427 \h </w:instrText>
             </w:r>
             <w:r>
               <w:rPr>
@@ -1492,7 +1492,7 @@
               <w14:ligatures w14:val="standardContextual"/>
             </w:rPr>
           </w:pPr>
-          <w:hyperlink w:anchor="_Toc239915157" w:history="1">
+          <w:hyperlink w:anchor="_Toc239916428" w:history="1">
             <w:r>
               <w:rPr>
                 <w:rStyle w:val="Hyperlink"/>
@@ -1516,7 +1516,7 @@
               <w:rPr>
                 <w:noProof/>
               </w:rPr>
-              <w:instrText xml:space="preserve"> PAGEREF _Toc239915157 \h </w:instrText>
+              <w:instrText xml:space="preserve"> PAGEREF _Toc239916428 \h </w:instrText>
             </w:r>
             <w:r>
               <w:rPr>
@@ -1558,7 +1558,7 @@
               <w14:ligatures w14:val="standardContextual"/>
             </w:rPr>
           </w:pPr>
-          <w:hyperlink w:anchor="_Toc239915158" w:history="1">
+          <w:hyperlink w:anchor="_Toc239916429" w:history="1">
             <w:r>
               <w:rPr>
                 <w:rStyle w:val="Hyperlink"/>
@@ -1582,7 +1582,7 @@
               <w:rPr>
                 <w:noProof/>
               </w:rPr>
-              <w:instrText xml:space="preserve"> PAGEREF _Toc239915158 \h </w:instrText>
+              <w:instrText xml:space="preserve"> PAGEREF _Toc239916429 \h </w:instrText>
             </w:r>
             <w:r>
               <w:rPr>
@@ -1624,7 +1624,7 @@
               <w14:ligatures w14:val="standardContextual"/>
             </w:rPr>
           </w:pPr>
-          <w:hyperlink w:anchor="_Toc239915159" w:history="1">
+          <w:hyperlink w:anchor="_Toc239916430" w:history="1">
             <w:r>
               <w:rPr>
                 <w:rStyle w:val="Hyperlink"/>
@@ -1648,7 +1648,7 @@
               <w:rPr>
                 <w:noProof/>
               </w:rPr>
-              <w:instrText xml:space="preserve"> PAGEREF _Toc239915159 \h </w:instrText>
+              <w:instrText xml:space="preserve"> PAGEREF _Toc239916430 \h </w:instrText>
             </w:r>
             <w:r>
               <w:rPr>
@@ -1690,7 +1690,7 @@
               <w14:ligatures w14:val="standardContextual"/>
             </w:rPr>
           </w:pPr>
-          <w:hyperlink w:anchor="_Toc239915160" w:history="1">
+          <w:hyperlink w:anchor="_Toc239916431" w:history="1">
             <w:r>
               <w:rPr>
                 <w:rStyle w:val="Hyperlink"/>
@@ -1714,7 +1714,7 @@
               <w:rPr>
                 <w:noProof/>
               </w:rPr>
-              <w:instrText xml:space="preserve"> PAGEREF _Toc239915160 \h </w:instrText>
+              <w:instrText xml:space="preserve"> PAGEREF _Toc239916431 \h </w:instrText>
             </w:r>
             <w:r>
               <w:rPr>
@@ -1756,7 +1756,7 @@
               <w14:ligatures w14:val="standardContextual"/>
             </w:rPr>
           </w:pPr>
-          <w:hyperlink w:anchor="_Toc239915161" w:history="1">
+          <w:hyperlink w:anchor="_Toc239916432" w:history="1">
             <w:r>
               <w:rPr>
                 <w:rStyle w:val="Hyperlink"/>
@@ -1780,7 +1780,7 @@
               <w:rPr>
                 <w:noProof/>
               </w:rPr>
-              <w:instrText xml:space="preserve"> PAGEREF _Toc239915161 \h </w:instrText>
+              <w:instrText xml:space="preserve"> PAGEREF _Toc239916432 \h </w:instrText>
             </w:r>
             <w:r>
               <w:rPr>
@@ -1822,7 +1822,7 @@
               <w14:ligatures w14:val="standardContextual"/>
             </w:rPr>
           </w:pPr>
-          <w:hyperlink w:anchor="_Toc239915162" w:history="1">
+          <w:hyperlink w:anchor="_Toc239916433" w:history="1">
             <w:r>
               <w:rPr>
                 <w:rStyle w:val="Hyperlink"/>
@@ -1846,7 +1846,7 @@
               <w:rPr>
                 <w:noProof/>
               </w:rPr>
-              <w:instrText xml:space="preserve"> PAGEREF _Toc239915162 \h </w:instrText>
+              <w:instrText xml:space="preserve"> PAGEREF _Toc239916433 \h </w:instrText>
             </w:r>
             <w:r>
               <w:rPr>
@@ -1888,7 +1888,7 @@
               <w14:ligatures w14:val="standardContextual"/>
             </w:rPr>
           </w:pPr>
-          <w:hyperlink w:anchor="_Toc239915163" w:history="1">
+          <w:hyperlink w:anchor="_Toc239916434" w:history="1">
             <w:r>
               <w:rPr>
                 <w:rStyle w:val="Hyperlink"/>
@@ -1912,7 +1912,7 @@
               <w:rPr>
                 <w:noProof/>
               </w:rPr>
-              <w:instrText xml:space="preserve"> PAGEREF _Toc239915163 \h </w:instrText>
+              <w:instrText xml:space="preserve"> PAGEREF _Toc239916434 \h </w:instrText>
             </w:r>
             <w:r>
               <w:rPr>
@@ -1954,7 +1954,7 @@
               <w14:ligatures w14:val="standardContextual"/>
             </w:rPr>
           </w:pPr>
-          <w:hyperlink w:anchor="_Toc239915164" w:history="1">
+          <w:hyperlink w:anchor="_Toc239916435" w:history="1">
             <w:r>
               <w:rPr>
                 <w:rStyle w:val="Hyperlink"/>
@@ -1978,7 +1978,7 @@
               <w:rPr>
                 <w:noProof/>
               </w:rPr>
-              <w:instrText xml:space="preserve"> PAGEREF _Toc239915164 \h </w:instrText>
+              <w:instrText xml:space="preserve"> PAGEREF _Toc239916435 \h </w:instrText>
             </w:r>
             <w:r>
               <w:rPr>
@@ -2020,7 +2020,7 @@
               <w14:ligatures w14:val="standardContextual"/>
             </w:rPr>
           </w:pPr>
-          <w:hyperlink w:anchor="_Toc239915165" w:history="1">
+          <w:hyperlink w:anchor="_Toc239916436" w:history="1">
             <w:r>
               <w:rPr>
                 <w:rStyle w:val="Hyperlink"/>
@@ -2044,7 +2044,7 @@
               <w:rPr>
                 <w:noProof/>
               </w:rPr>
-              <w:instrText xml:space="preserve"> PAGEREF _Toc239915165 \h </w:instrText>
+              <w:instrText xml:space="preserve"> PAGEREF _Toc239916436 \h </w:instrText>
             </w:r>
             <w:r>
               <w:rPr>
@@ -2086,7 +2086,7 @@
               <w14:ligatures w14:val="standardContextual"/>
             </w:rPr>
           </w:pPr>
-          <w:hyperlink w:anchor="_Toc239915166" w:history="1">
+          <w:hyperlink w:anchor="_Toc239916437" w:history="1">
             <w:r>
               <w:rPr>
                 <w:rStyle w:val="Hyperlink"/>
@@ -2110,7 +2110,7 @@
               <w:rPr>
                 <w:noProof/>
               </w:rPr>
-              <w:instrText xml:space="preserve"> PAGEREF _Toc239915166 \h </w:instrText>
+              <w:instrText xml:space="preserve"> PAGEREF _Toc239916437 \h </w:instrText>
             </w:r>
             <w:r>
               <w:rPr>
@@ -2152,7 +2152,7 @@
               <w14:ligatures w14:val="standardContextual"/>
             </w:rPr>
           </w:pPr>
-          <w:hyperlink w:anchor="_Toc239915167" w:history="1">
+          <w:hyperlink w:anchor="_Toc239916438" w:history="1">
             <w:r>
               <w:rPr>
                 <w:rStyle w:val="Hyperlink"/>
@@ -2176,7 +2176,7 @@
               <w:rPr>
                 <w:noProof/>
               </w:rPr>
-              <w:instrText xml:space="preserve"> PAGEREF _Toc239915167 \h </w:instrText>
+              <w:instrText xml:space="preserve"> PAGEREF _Toc239916438 \h </w:instrText>
             </w:r>
             <w:r>
               <w:rPr>
@@ -2218,7 +2218,7 @@
               <w14:ligatures w14:val="standardContextual"/>
             </w:rPr>
           </w:pPr>
-          <w:hyperlink w:anchor="_Toc239915168" w:history="1">
+          <w:hyperlink w:anchor="_Toc239916439" w:history="1">
             <w:r>
               <w:rPr>
                 <w:rStyle w:val="Hyperlink"/>
@@ -2242,7 +2242,7 @@
               <w:rPr>
                 <w:noProof/>
               </w:rPr>
-              <w:instrText xml:space="preserve"> PAGEREF _Toc239915168 \h </w:instrText>
+              <w:instrText xml:space="preserve"> PAGEREF _Toc239916439 \h </w:instrText>
             </w:r>
             <w:r>
               <w:rPr>
@@ -2259,7 +2259,7 @@
               <w:rPr>
                 <w:noProof/>
               </w:rPr>
-              <w:t>8</w:t>
+              <w:t>7</w:t>
             </w:r>
             <w:r>
               <w:rPr>
@@ -2284,7 +2284,7 @@
               <w14:ligatures w14:val="standardContextual"/>
             </w:rPr>
           </w:pPr>
-          <w:hyperlink w:anchor="_Toc239915169" w:history="1">
+          <w:hyperlink w:anchor="_Toc239916440" w:history="1">
             <w:r>
               <w:rPr>
                 <w:rStyle w:val="Hyperlink"/>
@@ -2308,7 +2308,7 @@
               <w:rPr>
                 <w:noProof/>
               </w:rPr>
-              <w:instrText xml:space="preserve"> PAGEREF _Toc239915169 \h </w:instrText>
+              <w:instrText xml:space="preserve"> PAGEREF _Toc239916440 \h </w:instrText>
             </w:r>
             <w:r>
               <w:rPr>
@@ -2350,7 +2350,7 @@
               <w14:ligatures w14:val="standardContextual"/>
             </w:rPr>
           </w:pPr>
-          <w:hyperlink w:anchor="_Toc239915170" w:history="1">
+          <w:hyperlink w:anchor="_Toc239916441" w:history="1">
             <w:r>
               <w:rPr>
                 <w:rStyle w:val="Hyperlink"/>
@@ -2374,7 +2374,7 @@
               <w:rPr>
                 <w:noProof/>
               </w:rPr>
-              <w:instrText xml:space="preserve"> PAGEREF _Toc239915170 \h </w:instrText>
+              <w:instrText xml:space="preserve"> PAGEREF _Toc239916441 \h </w:instrText>
             </w:r>
             <w:r>
               <w:rPr>
@@ -2416,7 +2416,7 @@
               <w14:ligatures w14:val="standardContextual"/>
             </w:rPr>
           </w:pPr>
-          <w:hyperlink w:anchor="_Toc239915171" w:history="1">
+          <w:hyperlink w:anchor="_Toc239916442" w:history="1">
             <w:r>
               <w:rPr>
                 <w:rStyle w:val="Hyperlink"/>
@@ -2440,7 +2440,7 @@
               <w:rPr>
                 <w:noProof/>
               </w:rPr>
-              <w:instrText xml:space="preserve"> PAGEREF _Toc239915171 \h </w:instrText>
+              <w:instrText xml:space="preserve"> PAGEREF _Toc239916442 \h </w:instrText>
             </w:r>
             <w:r>
               <w:rPr>
@@ -2482,7 +2482,7 @@
               <w14:ligatures w14:val="standardContextual"/>
             </w:rPr>
           </w:pPr>
-          <w:hyperlink w:anchor="_Toc239915172" w:history="1">
+          <w:hyperlink w:anchor="_Toc239916443" w:history="1">
             <w:r>
               <w:rPr>
                 <w:rStyle w:val="Hyperlink"/>
@@ -2506,7 +2506,7 @@
               <w:rPr>
                 <w:noProof/>
               </w:rPr>
-              <w:instrText xml:space="preserve"> PAGEREF _Toc239915172 \h </w:instrText>
+              <w:instrText xml:space="preserve"> PAGEREF _Toc239916443 \h </w:instrText>
             </w:r>
             <w:r>
               <w:rPr>
@@ -2548,7 +2548,7 @@
               <w14:ligatures w14:val="standardContextual"/>
             </w:rPr>
           </w:pPr>
-          <w:hyperlink w:anchor="_Toc239915173" w:history="1">
+          <w:hyperlink w:anchor="_Toc239916444" w:history="1">
             <w:r>
               <w:rPr>
                 <w:rStyle w:val="Hyperlink"/>
@@ -2572,7 +2572,7 @@
               <w:rPr>
                 <w:noProof/>
               </w:rPr>
-              <w:instrText xml:space="preserve"> PAGEREF _Toc239915173 \h </w:instrText>
+              <w:instrText xml:space="preserve"> PAGEREF _Toc239916444 \h </w:instrText>
             </w:r>
             <w:r>
               <w:rPr>
@@ -2614,7 +2614,7 @@
               <w14:ligatures w14:val="standardContextual"/>
             </w:rPr>
           </w:pPr>
-          <w:hyperlink w:anchor="_Toc239915174" w:history="1">
+          <w:hyperlink w:anchor="_Toc239916445" w:history="1">
             <w:r>
               <w:rPr>
                 <w:rStyle w:val="Hyperlink"/>
@@ -2638,7 +2638,7 @@
               <w:rPr>
                 <w:noProof/>
               </w:rPr>
-              <w:instrText xml:space="preserve"> PAGEREF _Toc239915174 \h </w:instrText>
+              <w:instrText xml:space="preserve"> PAGEREF _Toc239916445 \h </w:instrText>
             </w:r>
             <w:r>
               <w:rPr>
@@ -2680,7 +2680,7 @@
               <w14:ligatures w14:val="standardContextual"/>
             </w:rPr>
           </w:pPr>
-          <w:hyperlink w:anchor="_Toc239915175" w:history="1">
+          <w:hyperlink w:anchor="_Toc239916446" w:history="1">
             <w:r>
               <w:rPr>
                 <w:rStyle w:val="Hyperlink"/>
@@ -2704,7 +2704,7 @@
               <w:rPr>
                 <w:noProof/>
               </w:rPr>
-              <w:instrText xml:space="preserve"> PAGEREF _Toc239915175 \h </w:instrText>
+              <w:instrText xml:space="preserve"> PAGEREF _Toc239916446 \h </w:instrText>
             </w:r>
             <w:r>
               <w:rPr>
@@ -2746,7 +2746,7 @@
               <w14:ligatures w14:val="standardContextual"/>
             </w:rPr>
           </w:pPr>
-          <w:hyperlink w:anchor="_Toc239915176" w:history="1">
+          <w:hyperlink w:anchor="_Toc239916447" w:history="1">
             <w:r>
               <w:rPr>
                 <w:rStyle w:val="Hyperlink"/>
@@ -2770,7 +2770,7 @@
               <w:rPr>
                 <w:noProof/>
               </w:rPr>
-              <w:instrText xml:space="preserve"> PAGEREF _Toc239915176 \h </w:instrText>
+              <w:instrText xml:space="preserve"> PAGEREF _Toc239916447 \h </w:instrText>
             </w:r>
             <w:r>
               <w:rPr>
@@ -2812,7 +2812,7 @@
               <w14:ligatures w14:val="standardContextual"/>
             </w:rPr>
           </w:pPr>
-          <w:hyperlink w:anchor="_Toc239915177" w:history="1">
+          <w:hyperlink w:anchor="_Toc239916448" w:history="1">
             <w:r>
               <w:rPr>
                 <w:rStyle w:val="Hyperlink"/>
@@ -2836,7 +2836,7 @@
               <w:rPr>
                 <w:noProof/>
               </w:rPr>
-              <w:instrText xml:space="preserve"> PAGEREF _Toc239915177 \h </w:instrText>
+              <w:instrText xml:space="preserve"> PAGEREF _Toc239916448 \h </w:instrText>
             </w:r>
             <w:r>
               <w:rPr>
@@ -2878,7 +2878,7 @@
               <w14:ligatures w14:val="standardContextual"/>
             </w:rPr>
           </w:pPr>
-          <w:hyperlink w:anchor="_Toc239915178" w:history="1">
+          <w:hyperlink w:anchor="_Toc239916449" w:history="1">
             <w:r>
               <w:rPr>
                 <w:rStyle w:val="Hyperlink"/>
@@ -2902,7 +2902,7 @@
               <w:rPr>
                 <w:noProof/>
               </w:rPr>
-              <w:instrText xml:space="preserve"> PAGEREF _Toc239915178 \h </w:instrText>
+              <w:instrText xml:space="preserve"> PAGEREF _Toc239916449 \h </w:instrText>
             </w:r>
             <w:r>
               <w:rPr>
@@ -2944,7 +2944,7 @@
               <w14:ligatures w14:val="standardContextual"/>
             </w:rPr>
           </w:pPr>
-          <w:hyperlink w:anchor="_Toc239915179" w:history="1">
+          <w:hyperlink w:anchor="_Toc239916450" w:history="1">
             <w:r>
               <w:rPr>
                 <w:rStyle w:val="Hyperlink"/>
@@ -2968,7 +2968,7 @@
               <w:rPr>
                 <w:noProof/>
               </w:rPr>
-              <w:instrText xml:space="preserve"> PAGEREF _Toc239915179 \h </w:instrText>
+              <w:instrText xml:space="preserve"> PAGEREF _Toc239916450 \h </w:instrText>
             </w:r>
             <w:r>
               <w:rPr>
@@ -3010,7 +3010,7 @@
               <w14:ligatures w14:val="standardContextual"/>
             </w:rPr>
           </w:pPr>
-          <w:hyperlink w:anchor="_Toc239915180" w:history="1">
+          <w:hyperlink w:anchor="_Toc239916451" w:history="1">
             <w:r>
               <w:rPr>
                 <w:rStyle w:val="Hyperlink"/>
@@ -3034,7 +3034,7 @@
               <w:rPr>
                 <w:noProof/>
               </w:rPr>
-              <w:instrText xml:space="preserve"> PAGEREF _Toc239915180 \h </w:instrText>
+              <w:instrText xml:space="preserve"> PAGEREF _Toc239916451 \h </w:instrText>
             </w:r>
             <w:r>
               <w:rPr>
@@ -3076,7 +3076,7 @@
               <w14:ligatures w14:val="standardContextual"/>
             </w:rPr>
           </w:pPr>
-          <w:hyperlink w:anchor="_Toc239915181" w:history="1">
+          <w:hyperlink w:anchor="_Toc239916452" w:history="1">
             <w:r>
               <w:rPr>
                 <w:rStyle w:val="Hyperlink"/>
@@ -3100,7 +3100,7 @@
               <w:rPr>
                 <w:noProof/>
               </w:rPr>
-              <w:instrText xml:space="preserve"> PAGEREF _Toc239915181 \h </w:instrText>
+              <w:instrText xml:space="preserve"> PAGEREF _Toc239916452 \h </w:instrText>
             </w:r>
             <w:r>
               <w:rPr>
@@ -3142,7 +3142,7 @@
               <w14:ligatures w14:val="standardContextual"/>
             </w:rPr>
           </w:pPr>
-          <w:hyperlink w:anchor="_Toc239915182" w:history="1">
+          <w:hyperlink w:anchor="_Toc239916453" w:history="1">
             <w:r>
               <w:rPr>
                 <w:rStyle w:val="Hyperlink"/>
@@ -3166,7 +3166,7 @@
               <w:rPr>
                 <w:noProof/>
               </w:rPr>
-              <w:instrText xml:space="preserve"> PAGEREF _Toc239915182 \h </w:instrText>
+              <w:instrText xml:space="preserve"> PAGEREF _Toc239916453 \h </w:instrText>
             </w:r>
             <w:r>
               <w:rPr>
@@ -3208,7 +3208,7 @@
               <w14:ligatures w14:val="standardContextual"/>
             </w:rPr>
           </w:pPr>
-          <w:hyperlink w:anchor="_Toc239915183" w:history="1">
+          <w:hyperlink w:anchor="_Toc239916454" w:history="1">
             <w:r>
               <w:rPr>
                 <w:rStyle w:val="Hyperlink"/>
@@ -3232,7 +3232,7 @@
               <w:rPr>
                 <w:noProof/>
               </w:rPr>
-              <w:instrText xml:space="preserve"> PAGEREF _Toc239915183 \h </w:instrText>
+              <w:instrText xml:space="preserve"> PAGEREF _Toc239916454 \h </w:instrText>
             </w:r>
             <w:r>
               <w:rPr>
@@ -3274,7 +3274,7 @@
               <w14:ligatures w14:val="standardContextual"/>
             </w:rPr>
           </w:pPr>
-          <w:hyperlink w:anchor="_Toc239915184" w:history="1">
+          <w:hyperlink w:anchor="_Toc239916455" w:history="1">
             <w:r>
               <w:rPr>
                 <w:rStyle w:val="Hyperlink"/>
@@ -3298,7 +3298,7 @@
               <w:rPr>
                 <w:noProof/>
               </w:rPr>
-              <w:instrText xml:space="preserve"> PAGEREF _Toc239915184 \h </w:instrText>
+              <w:instrText xml:space="preserve"> PAGEREF _Toc239916455 \h </w:instrText>
             </w:r>
             <w:r>
               <w:rPr>
@@ -3340,7 +3340,7 @@
               <w14:ligatures w14:val="standardContextual"/>
             </w:rPr>
           </w:pPr>
-          <w:hyperlink w:anchor="_Toc239915185" w:history="1">
+          <w:hyperlink w:anchor="_Toc239916456" w:history="1">
             <w:r>
               <w:rPr>
                 <w:rStyle w:val="Hyperlink"/>
@@ -3364,7 +3364,7 @@
               <w:rPr>
                 <w:noProof/>
               </w:rPr>
-              <w:instrText xml:space="preserve"> PAGEREF _Toc239915185 \h </w:instrText>
+              <w:instrText xml:space="preserve"> PAGEREF _Toc239916456 \h </w:instrText>
             </w:r>
             <w:r>
               <w:rPr>
@@ -3406,7 +3406,7 @@
               <w14:ligatures w14:val="standardContextual"/>
             </w:rPr>
           </w:pPr>
-          <w:hyperlink w:anchor="_Toc239915186" w:history="1">
+          <w:hyperlink w:anchor="_Toc239916457" w:history="1">
             <w:r>
               <w:rPr>
                 <w:rStyle w:val="Hyperlink"/>
@@ -3430,7 +3430,7 @@
               <w:rPr>
                 <w:noProof/>
               </w:rPr>
-              <w:instrText xml:space="preserve"> PAGEREF _Toc239915186 \h </w:instrText>
+              <w:instrText xml:space="preserve"> PAGEREF _Toc239916457 \h </w:instrText>
             </w:r>
             <w:r>
               <w:rPr>
@@ -3472,7 +3472,7 @@
               <w14:ligatures w14:val="standardContextual"/>
             </w:rPr>
           </w:pPr>
-          <w:hyperlink w:anchor="_Toc239915187" w:history="1">
+          <w:hyperlink w:anchor="_Toc239916458" w:history="1">
             <w:r>
               <w:rPr>
                 <w:rStyle w:val="Hyperlink"/>
@@ -3496,7 +3496,7 @@
               <w:rPr>
                 <w:noProof/>
               </w:rPr>
-              <w:instrText xml:space="preserve"> PAGEREF _Toc239915187 \h </w:instrText>
+              <w:instrText xml:space="preserve"> PAGEREF _Toc239916458 \h </w:instrText>
             </w:r>
             <w:r>
               <w:rPr>
@@ -3538,7 +3538,7 @@
               <w14:ligatures w14:val="standardContextual"/>
             </w:rPr>
           </w:pPr>
-          <w:hyperlink w:anchor="_Toc239915188" w:history="1">
+          <w:hyperlink w:anchor="_Toc239916459" w:history="1">
             <w:r>
               <w:rPr>
                 <w:rStyle w:val="Hyperlink"/>
@@ -3562,7 +3562,7 @@
               <w:rPr>
                 <w:noProof/>
               </w:rPr>
-              <w:instrText xml:space="preserve"> PAGEREF _Toc239915188 \h </w:instrText>
+              <w:instrText xml:space="preserve"> PAGEREF _Toc239916459 \h </w:instrText>
             </w:r>
             <w:r>
               <w:rPr>
@@ -3604,7 +3604,7 @@
               <w14:ligatures w14:val="standardContextual"/>
             </w:rPr>
           </w:pPr>
-          <w:hyperlink w:anchor="_Toc239915189" w:history="1">
+          <w:hyperlink w:anchor="_Toc239916460" w:history="1">
             <w:r>
               <w:rPr>
                 <w:rStyle w:val="Hyperlink"/>
@@ -3628,7 +3628,7 @@
               <w:rPr>
                 <w:noProof/>
               </w:rPr>
-              <w:instrText xml:space="preserve"> PAGEREF _Toc239915189 \h </w:instrText>
+              <w:instrText xml:space="preserve"> PAGEREF _Toc239916460 \h </w:instrText>
             </w:r>
             <w:r>
               <w:rPr>
@@ -3670,7 +3670,7 @@
               <w14:ligatures w14:val="standardContextual"/>
             </w:rPr>
           </w:pPr>
-          <w:hyperlink w:anchor="_Toc239915190" w:history="1">
+          <w:hyperlink w:anchor="_Toc239916461" w:history="1">
             <w:r>
               <w:rPr>
                 <w:rStyle w:val="Hyperlink"/>
@@ -3694,7 +3694,7 @@
               <w:rPr>
                 <w:noProof/>
               </w:rPr>
-              <w:instrText xml:space="preserve"> PAGEREF _Toc239915190 \h </w:instrText>
+              <w:instrText xml:space="preserve"> PAGEREF _Toc239916461 \h </w:instrText>
             </w:r>
             <w:r>
               <w:rPr>
@@ -3736,7 +3736,7 @@
               <w14:ligatures w14:val="standardContextual"/>
             </w:rPr>
           </w:pPr>
-          <w:hyperlink w:anchor="_Toc239915191" w:history="1">
+          <w:hyperlink w:anchor="_Toc239916462" w:history="1">
             <w:r>
               <w:rPr>
                 <w:rStyle w:val="Hyperlink"/>
@@ -3760,7 +3760,7 @@
               <w:rPr>
                 <w:noProof/>
               </w:rPr>
-              <w:instrText xml:space="preserve"> PAGEREF _Toc239915191 \h </w:instrText>
+              <w:instrText xml:space="preserve"> PAGEREF _Toc239916462 \h </w:instrText>
             </w:r>
             <w:r>
               <w:rPr>
@@ -3802,7 +3802,7 @@
               <w14:ligatures w14:val="standardContextual"/>
             </w:rPr>
           </w:pPr>
-          <w:hyperlink w:anchor="_Toc239915192" w:history="1">
+          <w:hyperlink w:anchor="_Toc239916463" w:history="1">
             <w:r>
               <w:rPr>
                 <w:rStyle w:val="Hyperlink"/>
@@ -3826,7 +3826,7 @@
               <w:rPr>
                 <w:noProof/>
               </w:rPr>
-              <w:instrText xml:space="preserve"> PAGEREF _Toc239915192 \h </w:instrText>
+              <w:instrText xml:space="preserve"> PAGEREF _Toc239916463 \h </w:instrText>
             </w:r>
             <w:r>
               <w:rPr>
@@ -3868,7 +3868,7 @@
               <w14:ligatures w14:val="standardContextual"/>
             </w:rPr>
           </w:pPr>
-          <w:hyperlink w:anchor="_Toc239915193" w:history="1">
+          <w:hyperlink w:anchor="_Toc239916464" w:history="1">
             <w:r>
               <w:rPr>
                 <w:rStyle w:val="Hyperlink"/>
@@ -3892,7 +3892,7 @@
               <w:rPr>
                 <w:noProof/>
               </w:rPr>
-              <w:instrText xml:space="preserve"> PAGEREF _Toc239915193 \h </w:instrText>
+              <w:instrText xml:space="preserve"> PAGEREF _Toc239916464 \h </w:instrText>
             </w:r>
             <w:r>
               <w:rPr>
@@ -3934,7 +3934,7 @@
               <w14:ligatures w14:val="standardContextual"/>
             </w:rPr>
           </w:pPr>
-          <w:hyperlink w:anchor="_Toc239915194" w:history="1">
+          <w:hyperlink w:anchor="_Toc239916465" w:history="1">
             <w:r>
               <w:rPr>
                 <w:rStyle w:val="Hyperlink"/>
@@ -3958,7 +3958,7 @@
               <w:rPr>
                 <w:noProof/>
               </w:rPr>
-              <w:instrText xml:space="preserve"> PAGEREF _Toc239915194 \h </w:instrText>
+              <w:instrText xml:space="preserve"> PAGEREF _Toc239916465 \h </w:instrText>
             </w:r>
             <w:r>
               <w:rPr>
@@ -4000,7 +4000,7 @@
               <w14:ligatures w14:val="standardContextual"/>
             </w:rPr>
           </w:pPr>
-          <w:hyperlink w:anchor="_Toc239915195" w:history="1">
+          <w:hyperlink w:anchor="_Toc239916466" w:history="1">
             <w:r>
               <w:rPr>
                 <w:rStyle w:val="Hyperlink"/>
@@ -4024,7 +4024,7 @@
               <w:rPr>
                 <w:noProof/>
               </w:rPr>
-              <w:instrText xml:space="preserve"> PAGEREF _Toc239915195 \h </w:instrText>
+              <w:instrText xml:space="preserve"> PAGEREF _Toc239916466 \h </w:instrText>
             </w:r>
             <w:r>
               <w:rPr>
@@ -4066,7 +4066,7 @@
               <w14:ligatures w14:val="standardContextual"/>
             </w:rPr>
           </w:pPr>
-          <w:hyperlink w:anchor="_Toc239915196" w:history="1">
+          <w:hyperlink w:anchor="_Toc239916467" w:history="1">
             <w:r>
               <w:rPr>
                 <w:rStyle w:val="Hyperlink"/>
@@ -4090,7 +4090,7 @@
               <w:rPr>
                 <w:noProof/>
               </w:rPr>
-              <w:instrText xml:space="preserve"> PAGEREF _Toc239915196 \h </w:instrText>
+              <w:instrText xml:space="preserve"> PAGEREF _Toc239916467 \h </w:instrText>
             </w:r>
             <w:r>
               <w:rPr>
@@ -4132,7 +4132,7 @@
               <w14:ligatures w14:val="standardContextual"/>
             </w:rPr>
           </w:pPr>
-          <w:hyperlink w:anchor="_Toc239915197" w:history="1">
+          <w:hyperlink w:anchor="_Toc239916468" w:history="1">
             <w:r>
               <w:rPr>
                 <w:rStyle w:val="Hyperlink"/>
@@ -4156,7 +4156,7 @@
               <w:rPr>
                 <w:noProof/>
               </w:rPr>
-              <w:instrText xml:space="preserve"> PAGEREF _Toc239915197 \h </w:instrText>
+              <w:instrText xml:space="preserve"> PAGEREF _Toc239916468 \h </w:instrText>
             </w:r>
             <w:r>
               <w:rPr>
@@ -4198,7 +4198,7 @@
               <w14:ligatures w14:val="standardContextual"/>
             </w:rPr>
           </w:pPr>
-          <w:hyperlink w:anchor="_Toc239915198" w:history="1">
+          <w:hyperlink w:anchor="_Toc239916469" w:history="1">
             <w:r>
               <w:rPr>
                 <w:rStyle w:val="Hyperlink"/>
@@ -4222,7 +4222,7 @@
               <w:rPr>
                 <w:noProof/>
               </w:rPr>
-              <w:instrText xml:space="preserve"> PAGEREF _Toc239915198 \h </w:instrText>
+              <w:instrText xml:space="preserve"> PAGEREF _Toc239916469 \h </w:instrText>
             </w:r>
             <w:r>
               <w:rPr>
@@ -4264,7 +4264,7 @@
               <w14:ligatures w14:val="standardContextual"/>
             </w:rPr>
           </w:pPr>
-          <w:hyperlink w:anchor="_Toc239915199" w:history="1">
+          <w:hyperlink w:anchor="_Toc239916470" w:history="1">
             <w:r>
               <w:rPr>
                 <w:rStyle w:val="Hyperlink"/>
@@ -4288,7 +4288,7 @@
               <w:rPr>
                 <w:noProof/>
               </w:rPr>
-              <w:instrText xml:space="preserve"> PAGEREF _Toc239915199 \h </w:instrText>
+              <w:instrText xml:space="preserve"> PAGEREF _Toc239916470 \h </w:instrText>
             </w:r>
             <w:r>
               <w:rPr>
@@ -4331,7 +4331,7 @@
       <w:pPr>
         <w:pStyle w:val="Heading1"/>
       </w:pPr>
-      <w:bookmarkStart w:id="1" w:name="_Toc239915156"/>
+      <w:bookmarkStart w:id="1" w:name="_Toc239916427"/>
       <w:r>
         <w:t>1. Project Overview</w:t>
       </w:r>
@@ -4357,7 +4357,7 @@
       <w:pPr>
         <w:pStyle w:val="Heading2"/>
       </w:pPr>
-      <w:bookmarkStart w:id="2" w:name="_Toc239915157"/>
+      <w:bookmarkStart w:id="2" w:name="_Toc239916428"/>
       <w:r>
         <w:t>1.1 Problem Statement</w:t>
       </w:r>
@@ -4375,7 +4375,7 @@
       <w:pPr>
         <w:pStyle w:val="Heading2"/>
       </w:pPr>
-      <w:bookmarkStart w:id="3" w:name="_Toc239915158"/>
+      <w:bookmarkStart w:id="3" w:name="_Toc239916429"/>
       <w:r>
         <w:t>1.2 Objectives</w:t>
       </w:r>
@@ -4489,7 +4489,7 @@
       <w:pPr>
         <w:pStyle w:val="Heading2"/>
       </w:pPr>
-      <w:bookmarkStart w:id="4" w:name="_Toc239915159"/>
+      <w:bookmarkStart w:id="4" w:name="_Toc239916430"/>
       <w:r>
         <w:t>1.3 Scope &amp; Boundaries</w:t>
       </w:r>
@@ -4507,7 +4507,7 @@
       <w:pPr>
         <w:pStyle w:val="Heading2"/>
       </w:pPr>
-      <w:bookmarkStart w:id="5" w:name="_Toc239915160"/>
+      <w:bookmarkStart w:id="5" w:name="_Toc239916431"/>
       <w:r>
         <w:t>1.4 Technology Stack</w:t>
       </w:r>
@@ -5046,7 +5046,7 @@
       <w:pPr>
         <w:pStyle w:val="Heading2"/>
       </w:pPr>
-      <w:bookmarkStart w:id="6" w:name="_Toc239915161"/>
+      <w:bookmarkStart w:id="6" w:name="_Toc239916432"/>
       <w:r>
         <w:t>1.5 Summary of Implemented Modules</w:t>
       </w:r>
@@ -6353,7 +6353,7 @@
       <w:pPr>
         <w:pStyle w:val="Heading1"/>
       </w:pPr>
-      <w:bookmarkStart w:id="7" w:name="_Toc239915162"/>
+      <w:bookmarkStart w:id="7" w:name="_Toc239916433"/>
       <w:r>
         <w:t>2. System Architecture</w:t>
       </w:r>
@@ -6371,7 +6371,7 @@
       <w:pPr>
         <w:pStyle w:val="Heading2"/>
       </w:pPr>
-      <w:bookmarkStart w:id="8" w:name="_Toc239915163"/>
+      <w:bookmarkStart w:id="8" w:name="_Toc239916434"/>
       <w:r>
         <w:t>2.1 Request Pipeline</w:t>
       </w:r>
@@ -6483,7 +6483,7 @@
       <w:pPr>
         <w:pStyle w:val="Heading2"/>
       </w:pPr>
-      <w:bookmarkStart w:id="9" w:name="_Toc239915164"/>
+      <w:bookmarkStart w:id="9" w:name="_Toc239916435"/>
       <w:r>
         <w:t>2.2 Project Structure</w:t>
       </w:r>
@@ -6622,7 +6622,7 @@
       <w:pPr>
         <w:pStyle w:val="Heading2"/>
       </w:pPr>
-      <w:bookmarkStart w:id="10" w:name="_Toc239915165"/>
+      <w:bookmarkStart w:id="10" w:name="_Toc239916436"/>
       <w:r>
         <w:t>2.3 Response Envelope</w:t>
       </w:r>
@@ -6675,7 +6675,7 @@
       <w:pPr>
         <w:pStyle w:val="Heading1"/>
       </w:pPr>
-      <w:bookmarkStart w:id="11" w:name="_Toc239915166"/>
+      <w:bookmarkStart w:id="11" w:name="_Toc239916437"/>
       <w:r>
         <w:t>3. Database Design</w:t>
       </w:r>
@@ -6699,8 +6699,8 @@
           <w:noProof/>
         </w:rPr>
         <w:drawing>
-          <wp:inline distT="0" distB="0" distL="0" distR="0" wp14:anchorId="67403E81" wp14:editId="26AAD779">
-            <wp:extent cx="6191250" cy="3533775"/>
+          <wp:inline distT="0" distB="0" distL="0" distR="0" wp14:anchorId="4B68E648" wp14:editId="125725EF">
+            <wp:extent cx="6191250" cy="2562225"/>
             <wp:effectExtent l="0" t="0" r="0" b="0"/>
             <wp:docPr id="1" name="er-diagram.png" descr="er-diagram.png" title="er-diagram.png"/>
             <wp:cNvGraphicFramePr>
@@ -6725,7 +6725,7 @@
                   <pic:spPr bwMode="auto">
                     <a:xfrm>
                       <a:off x="0" y="0"/>
-                      <a:ext cx="6191250" cy="3533775"/>
+                      <a:ext cx="6191250" cy="2562225"/>
                     </a:xfrm>
                     <a:prstGeom prst="rect">
                       <a:avLst/>
@@ -6758,7 +6758,7 @@
       <w:pPr>
         <w:pStyle w:val="Heading2"/>
       </w:pPr>
-      <w:bookmarkStart w:id="12" w:name="_Toc239915167"/>
+      <w:bookmarkStart w:id="12" w:name="_Toc239916438"/>
       <w:r>
         <w:t>3.1 Collections</w:t>
       </w:r>
@@ -7429,7 +7429,7 @@
       <w:pPr>
         <w:pStyle w:val="Heading2"/>
       </w:pPr>
-      <w:bookmarkStart w:id="13" w:name="_Toc239915168"/>
+      <w:bookmarkStart w:id="13" w:name="_Toc239916439"/>
       <w:r>
         <w:t>3.2 Reference vs. Embed Reasoning</w:t>
       </w:r>
@@ -8278,7 +8278,7 @@
       <w:pPr>
         <w:pStyle w:val="Heading2"/>
       </w:pPr>
-      <w:bookmarkStart w:id="14" w:name="_Toc239915169"/>
+      <w:bookmarkStart w:id="14" w:name="_Toc239916440"/>
       <w:r>
         <w:t>3.3 Indexes</w:t>
       </w:r>
@@ -9483,7 +9483,7 @@
       <w:pPr>
         <w:pStyle w:val="Heading2"/>
       </w:pPr>
-      <w:bookmarkStart w:id="15" w:name="_Toc239915170"/>
+      <w:bookmarkStart w:id="15" w:name="_Toc239916441"/>
       <w:r>
         <w:t>3.4 Entity Relationships</w:t>
       </w:r>
@@ -9594,7 +9594,7 @@
       <w:pPr>
         <w:pStyle w:val="Heading2"/>
       </w:pPr>
-      <w:bookmarkStart w:id="16" w:name="_Toc239915171"/>
+      <w:bookmarkStart w:id="16" w:name="_Toc239916442"/>
       <w:r>
         <w:t>3.5 Order Status State Machine</w:t>
       </w:r>
@@ -9676,7 +9676,7 @@
       <w:pPr>
         <w:pStyle w:val="Heading1"/>
       </w:pPr>
-      <w:bookmarkStart w:id="17" w:name="_Toc239915172"/>
+      <w:bookmarkStart w:id="17" w:name="_Toc239916443"/>
       <w:r>
         <w:t>4. Functional Modules &amp; Evidence</w:t>
       </w:r>
@@ -9694,7 +9694,7 @@
       <w:pPr>
         <w:pStyle w:val="Heading2"/>
       </w:pPr>
-      <w:bookmarkStart w:id="18" w:name="_Toc239915173"/>
+      <w:bookmarkStart w:id="18" w:name="_Toc239916444"/>
       <w:r>
         <w:t>4.1 Module 1 — User Registration &amp; Authentication</w:t>
       </w:r>
@@ -9772,10 +9772,10 @@
           <w:noProof/>
         </w:rPr>
         <w:drawing>
-          <wp:inline distT="0" distB="0" distL="0" distR="0" wp14:anchorId="0318F30F" wp14:editId="6F313F78">
+          <wp:inline distT="0" distB="0" distL="0" distR="0" wp14:anchorId="34570A22" wp14:editId="0A2C78B2">
             <wp:extent cx="5715000" cy="3038475"/>
             <wp:effectExtent l="0" t="0" r="0" b="0"/>
-            <wp:docPr id="737057182" name="Auth_register.png" descr="Auth_register.png" title="Auth_register.png"/>
+            <wp:docPr id="872275357" name="Auth_register.png" descr="Auth_register.png" title="Auth_register.png"/>
             <wp:cNvGraphicFramePr>
               <a:graphicFrameLocks xmlns:a="http://schemas.openxmlformats.org/drawingml/2006/main" noChangeAspect="1"/>
             </wp:cNvGraphicFramePr>
@@ -9837,10 +9837,10 @@
           <w:noProof/>
         </w:rPr>
         <w:drawing>
-          <wp:inline distT="0" distB="0" distL="0" distR="0" wp14:anchorId="4F5CC133" wp14:editId="346CB3F2">
+          <wp:inline distT="0" distB="0" distL="0" distR="0" wp14:anchorId="671EFCEF" wp14:editId="2ADA467A">
             <wp:extent cx="5715000" cy="3105150"/>
             <wp:effectExtent l="0" t="0" r="0" b="0"/>
-            <wp:docPr id="338352173" name="Auth_login.png" descr="Auth_login.png" title="Auth_login.png"/>
+            <wp:docPr id="485816956" name="Auth_login.png" descr="Auth_login.png" title="Auth_login.png"/>
             <wp:cNvGraphicFramePr>
               <a:graphicFrameLocks xmlns:a="http://schemas.openxmlformats.org/drawingml/2006/main" noChangeAspect="1"/>
             </wp:cNvGraphicFramePr>
@@ -9902,10 +9902,10 @@
           <w:noProof/>
         </w:rPr>
         <w:drawing>
-          <wp:inline distT="0" distB="0" distL="0" distR="0" wp14:anchorId="49400C67" wp14:editId="39289BD1">
+          <wp:inline distT="0" distB="0" distL="0" distR="0" wp14:anchorId="12CE6E25" wp14:editId="14644149">
             <wp:extent cx="5334000" cy="3895725"/>
             <wp:effectExtent l="0" t="0" r="0" b="0"/>
-            <wp:docPr id="1438998550" name="fe-01-login.png" descr="fe-01-login.png" title="fe-01-login.png"/>
+            <wp:docPr id="234623570" name="fe-01-login.png" descr="fe-01-login.png" title="fe-01-login.png"/>
             <wp:cNvGraphicFramePr>
               <a:graphicFrameLocks xmlns:a="http://schemas.openxmlformats.org/drawingml/2006/main" noChangeAspect="1"/>
             </wp:cNvGraphicFramePr>
@@ -9967,10 +9967,10 @@
           <w:noProof/>
         </w:rPr>
         <w:drawing>
-          <wp:inline distT="0" distB="0" distL="0" distR="0" wp14:anchorId="65EE76F1" wp14:editId="0855E979">
+          <wp:inline distT="0" distB="0" distL="0" distR="0" wp14:anchorId="652937B4" wp14:editId="794AD857">
             <wp:extent cx="5334000" cy="3895725"/>
             <wp:effectExtent l="0" t="0" r="0" b="0"/>
-            <wp:docPr id="1427131530" name="fe-02-register.png" descr="fe-02-register.png" title="fe-02-register.png"/>
+            <wp:docPr id="665499447" name="fe-02-register.png" descr="fe-02-register.png" title="fe-02-register.png"/>
             <wp:cNvGraphicFramePr>
               <a:graphicFrameLocks xmlns:a="http://schemas.openxmlformats.org/drawingml/2006/main" noChangeAspect="1"/>
             </wp:cNvGraphicFramePr>
@@ -10032,10 +10032,10 @@
           <w:noProof/>
         </w:rPr>
         <w:drawing>
-          <wp:inline distT="0" distB="0" distL="0" distR="0" wp14:anchorId="62EA8C57" wp14:editId="5B16C716">
+          <wp:inline distT="0" distB="0" distL="0" distR="0" wp14:anchorId="475A8DA5" wp14:editId="77F8DF82">
             <wp:extent cx="5715000" cy="3105150"/>
             <wp:effectExtent l="0" t="0" r="0" b="0"/>
-            <wp:docPr id="1040008753" name="Current_user.png" descr="Current_user.png" title="Current_user.png"/>
+            <wp:docPr id="45949257" name="Current_user.png" descr="Current_user.png" title="Current_user.png"/>
             <wp:cNvGraphicFramePr>
               <a:graphicFrameLocks xmlns:a="http://schemas.openxmlformats.org/drawingml/2006/main" noChangeAspect="1"/>
             </wp:cNvGraphicFramePr>
@@ -10091,7 +10091,7 @@
       <w:pPr>
         <w:pStyle w:val="Heading2"/>
       </w:pPr>
-      <w:bookmarkStart w:id="19" w:name="_Toc239915174"/>
+      <w:bookmarkStart w:id="19" w:name="_Toc239916445"/>
       <w:r>
         <w:t>4.2 Module 2 — Dark-Store Management</w:t>
       </w:r>
@@ -10211,10 +10211,10 @@
           <w:noProof/>
         </w:rPr>
         <w:drawing>
-          <wp:inline distT="0" distB="0" distL="0" distR="0" wp14:anchorId="13E07CE6" wp14:editId="2624383B">
+          <wp:inline distT="0" distB="0" distL="0" distR="0" wp14:anchorId="21A38600" wp14:editId="19586693">
             <wp:extent cx="5715000" cy="3076575"/>
             <wp:effectExtent l="0" t="0" r="0" b="0"/>
-            <wp:docPr id="276890320" name="List_store_1.png" descr="List_store_1.png" title="List_store_1.png"/>
+            <wp:docPr id="219635283" name="List_store_1.png" descr="List_store_1.png" title="List_store_1.png"/>
             <wp:cNvGraphicFramePr>
               <a:graphicFrameLocks xmlns:a="http://schemas.openxmlformats.org/drawingml/2006/main" noChangeAspect="1"/>
             </wp:cNvGraphicFramePr>
@@ -10270,7 +10270,7 @@
       <w:pPr>
         <w:pStyle w:val="Heading2"/>
       </w:pPr>
-      <w:bookmarkStart w:id="20" w:name="_Toc239915175"/>
+      <w:bookmarkStart w:id="20" w:name="_Toc239916446"/>
       <w:r>
         <w:t>4.3 Module 3 — Product Catalog &amp; Store-Wise Stock</w:t>
       </w:r>
@@ -10376,10 +10376,10 @@
           <w:noProof/>
         </w:rPr>
         <w:drawing>
-          <wp:inline distT="0" distB="0" distL="0" distR="0" wp14:anchorId="568DFD82" wp14:editId="20434868">
+          <wp:inline distT="0" distB="0" distL="0" distR="0" wp14:anchorId="6F63CE32" wp14:editId="62EA483A">
             <wp:extent cx="5715000" cy="3048000"/>
             <wp:effectExtent l="0" t="0" r="0" b="0"/>
-            <wp:docPr id="1557916720" name="List_products.png" descr="List_products.png" title="List_products.png"/>
+            <wp:docPr id="674043725" name="List_products.png" descr="List_products.png" title="List_products.png"/>
             <wp:cNvGraphicFramePr>
               <a:graphicFrameLocks xmlns:a="http://schemas.openxmlformats.org/drawingml/2006/main" noChangeAspect="1"/>
             </wp:cNvGraphicFramePr>
@@ -10441,10 +10441,10 @@
           <w:noProof/>
         </w:rPr>
         <w:drawing>
-          <wp:inline distT="0" distB="0" distL="0" distR="0" wp14:anchorId="503D9200" wp14:editId="6516EA22">
+          <wp:inline distT="0" distB="0" distL="0" distR="0" wp14:anchorId="50E1C0D8" wp14:editId="7FB00E42">
             <wp:extent cx="5715000" cy="3124200"/>
             <wp:effectExtent l="0" t="0" r="0" b="0"/>
-            <wp:docPr id="2064652117" name="List_store_stock_1 (1).png" descr="List_store_stock_1 (1).png" title="List_store_stock_1 (1).png"/>
+            <wp:docPr id="1981177482" name="List_store_stock_1 (1).png" descr="List_store_stock_1 (1).png" title="List_store_stock_1 (1).png"/>
             <wp:cNvGraphicFramePr>
               <a:graphicFrameLocks xmlns:a="http://schemas.openxmlformats.org/drawingml/2006/main" noChangeAspect="1"/>
             </wp:cNvGraphicFramePr>
@@ -10500,7 +10500,7 @@
       <w:pPr>
         <w:pStyle w:val="Heading2"/>
       </w:pPr>
-      <w:bookmarkStart w:id="21" w:name="_Toc239915176"/>
+      <w:bookmarkStart w:id="21" w:name="_Toc239916447"/>
       <w:r>
         <w:t>4.4 Module 4 — Order Placement with Nearest-Store Check</w:t>
       </w:r>
@@ -10553,10 +10553,10 @@
           <w:noProof/>
         </w:rPr>
         <w:drawing>
-          <wp:inline distT="0" distB="0" distL="0" distR="0" wp14:anchorId="3B20F5EA" wp14:editId="7A86EA7F">
+          <wp:inline distT="0" distB="0" distL="0" distR="0" wp14:anchorId="201FFA7B" wp14:editId="05D907F2">
             <wp:extent cx="5715000" cy="3105150"/>
             <wp:effectExtent l="0" t="0" r="0" b="0"/>
-            <wp:docPr id="1927153509" name="Place_order_1.png" descr="Place_order_1.png" title="Place_order_1.png"/>
+            <wp:docPr id="1964989127" name="Place_order_1.png" descr="Place_order_1.png" title="Place_order_1.png"/>
             <wp:cNvGraphicFramePr>
               <a:graphicFrameLocks xmlns:a="http://schemas.openxmlformats.org/drawingml/2006/main" noChangeAspect="1"/>
             </wp:cNvGraphicFramePr>
@@ -10618,10 +10618,10 @@
           <w:noProof/>
         </w:rPr>
         <w:drawing>
-          <wp:inline distT="0" distB="0" distL="0" distR="0" wp14:anchorId="24DEF7D5" wp14:editId="18D67D39">
+          <wp:inline distT="0" distB="0" distL="0" distR="0" wp14:anchorId="7212786C" wp14:editId="49A2B933">
             <wp:extent cx="5715000" cy="4171950"/>
             <wp:effectExtent l="0" t="0" r="0" b="0"/>
-            <wp:docPr id="2109177000" name="fe-03-customer-browse.png" descr="fe-03-customer-browse.png" title="fe-03-customer-browse.png"/>
+            <wp:docPr id="1043006210" name="fe-03-customer-browse.png" descr="fe-03-customer-browse.png" title="fe-03-customer-browse.png"/>
             <wp:cNvGraphicFramePr>
               <a:graphicFrameLocks xmlns:a="http://schemas.openxmlformats.org/drawingml/2006/main" noChangeAspect="1"/>
             </wp:cNvGraphicFramePr>
@@ -10677,7 +10677,7 @@
       <w:pPr>
         <w:pStyle w:val="Heading2"/>
       </w:pPr>
-      <w:bookmarkStart w:id="22" w:name="_Toc239915177"/>
+      <w:bookmarkStart w:id="22" w:name="_Toc239916448"/>
       <w:r>
         <w:t>4.5 Module 5 — Order Picking &amp; Packing Workflow</w:t>
       </w:r>
@@ -10755,10 +10755,10 @@
           <w:noProof/>
         </w:rPr>
         <w:drawing>
-          <wp:inline distT="0" distB="0" distL="0" distR="0" wp14:anchorId="778EBB30" wp14:editId="39B00537">
+          <wp:inline distT="0" distB="0" distL="0" distR="0" wp14:anchorId="02A7BE03" wp14:editId="78311C74">
             <wp:extent cx="5715000" cy="3133725"/>
             <wp:effectExtent l="0" t="0" r="0" b="0"/>
-            <wp:docPr id="742001866" name="Pick_order_1 (1).png" descr="Pick_order_1 (1).png" title="Pick_order_1 (1).png"/>
+            <wp:docPr id="1695262303" name="Pick_order_1 (1).png" descr="Pick_order_1 (1).png" title="Pick_order_1 (1).png"/>
             <wp:cNvGraphicFramePr>
               <a:graphicFrameLocks xmlns:a="http://schemas.openxmlformats.org/drawingml/2006/main" noChangeAspect="1"/>
             </wp:cNvGraphicFramePr>
@@ -10820,10 +10820,10 @@
           <w:noProof/>
         </w:rPr>
         <w:drawing>
-          <wp:inline distT="0" distB="0" distL="0" distR="0" wp14:anchorId="30C4F4A9" wp14:editId="0EEABD88">
+          <wp:inline distT="0" distB="0" distL="0" distR="0" wp14:anchorId="0F1D8429" wp14:editId="7A63C03B">
             <wp:extent cx="5715000" cy="3105150"/>
             <wp:effectExtent l="0" t="0" r="0" b="0"/>
-            <wp:docPr id="1448608347" name="Pack_order_1 (1).png" descr="Pack_order_1 (1).png" title="Pack_order_1 (1).png"/>
+            <wp:docPr id="2134378507" name="Pack_order_1 (1).png" descr="Pack_order_1 (1).png" title="Pack_order_1 (1).png"/>
             <wp:cNvGraphicFramePr>
               <a:graphicFrameLocks xmlns:a="http://schemas.openxmlformats.org/drawingml/2006/main" noChangeAspect="1"/>
             </wp:cNvGraphicFramePr>
@@ -10885,10 +10885,10 @@
           <w:noProof/>
         </w:rPr>
         <w:drawing>
-          <wp:inline distT="0" distB="0" distL="0" distR="0" wp14:anchorId="5E75BE7B" wp14:editId="661957BD">
+          <wp:inline distT="0" distB="0" distL="0" distR="0" wp14:anchorId="5FD27F22" wp14:editId="2964242E">
             <wp:extent cx="5715000" cy="4171950"/>
             <wp:effectExtent l="0" t="0" r="0" b="0"/>
-            <wp:docPr id="139290963" name="fe-05-staff-queue.png" descr="fe-05-staff-queue.png" title="fe-05-staff-queue.png"/>
+            <wp:docPr id="521631409" name="fe-05-staff-queue.png" descr="fe-05-staff-queue.png" title="fe-05-staff-queue.png"/>
             <wp:cNvGraphicFramePr>
               <a:graphicFrameLocks xmlns:a="http://schemas.openxmlformats.org/drawingml/2006/main" noChangeAspect="1"/>
             </wp:cNvGraphicFramePr>
@@ -10944,7 +10944,7 @@
       <w:pPr>
         <w:pStyle w:val="Heading2"/>
       </w:pPr>
-      <w:bookmarkStart w:id="23" w:name="_Toc239915178"/>
+      <w:bookmarkStart w:id="23" w:name="_Toc239916449"/>
       <w:r>
         <w:t>4.6 Module 6 — Delivery Partner Assignment</w:t>
       </w:r>
@@ -11036,10 +11036,10 @@
           <w:noProof/>
         </w:rPr>
         <w:drawing>
-          <wp:inline distT="0" distB="0" distL="0" distR="0" wp14:anchorId="7547CC71" wp14:editId="5E7B02A3">
+          <wp:inline distT="0" distB="0" distL="0" distR="0" wp14:anchorId="01CCB09D" wp14:editId="24A0177B">
             <wp:extent cx="5715000" cy="3086100"/>
             <wp:effectExtent l="0" t="0" r="0" b="0"/>
-            <wp:docPr id="406327876" name="Assign_partner_1 (1).png" descr="Assign_partner_1 (1).png" title="Assign_partner_1 (1).png"/>
+            <wp:docPr id="1301323223" name="Assign_partner_1 (1).png" descr="Assign_partner_1 (1).png" title="Assign_partner_1 (1).png"/>
             <wp:cNvGraphicFramePr>
               <a:graphicFrameLocks xmlns:a="http://schemas.openxmlformats.org/drawingml/2006/main" noChangeAspect="1"/>
             </wp:cNvGraphicFramePr>
@@ -11095,7 +11095,7 @@
       <w:pPr>
         <w:pStyle w:val="Heading2"/>
       </w:pPr>
-      <w:bookmarkStart w:id="24" w:name="_Toc239915179"/>
+      <w:bookmarkStart w:id="24" w:name="_Toc239916450"/>
       <w:r>
         <w:t>4.7 Module 7 — Delivery Status Tracking</w:t>
       </w:r>
@@ -11145,10 +11145,10 @@
           <w:noProof/>
         </w:rPr>
         <w:drawing>
-          <wp:inline distT="0" distB="0" distL="0" distR="0" wp14:anchorId="3020FD29" wp14:editId="7C9CCE7B">
+          <wp:inline distT="0" distB="0" distL="0" distR="0" wp14:anchorId="2CB1961D" wp14:editId="33D8AB81">
             <wp:extent cx="5715000" cy="3028950"/>
             <wp:effectExtent l="0" t="0" r="0" b="0"/>
-            <wp:docPr id="1046644098" name="Out_for_delivery_1.png" descr="Out_for_delivery_1.png" title="Out_for_delivery_1.png"/>
+            <wp:docPr id="765706332" name="Out_for_delivery_1.png" descr="Out_for_delivery_1.png" title="Out_for_delivery_1.png"/>
             <wp:cNvGraphicFramePr>
               <a:graphicFrameLocks xmlns:a="http://schemas.openxmlformats.org/drawingml/2006/main" noChangeAspect="1"/>
             </wp:cNvGraphicFramePr>
@@ -11210,10 +11210,10 @@
           <w:noProof/>
         </w:rPr>
         <w:drawing>
-          <wp:inline distT="0" distB="0" distL="0" distR="0" wp14:anchorId="26AA348E" wp14:editId="6AAEE667">
+          <wp:inline distT="0" distB="0" distL="0" distR="0" wp14:anchorId="1A384CF5" wp14:editId="7CED055A">
             <wp:extent cx="5715000" cy="3105150"/>
             <wp:effectExtent l="0" t="0" r="0" b="0"/>
-            <wp:docPr id="98540901" name="Delivered_1 (1).png" descr="Delivered_1 (1).png" title="Delivered_1 (1).png"/>
+            <wp:docPr id="923973009" name="Delivered_1 (1).png" descr="Delivered_1 (1).png" title="Delivered_1 (1).png"/>
             <wp:cNvGraphicFramePr>
               <a:graphicFrameLocks xmlns:a="http://schemas.openxmlformats.org/drawingml/2006/main" noChangeAspect="1"/>
             </wp:cNvGraphicFramePr>
@@ -11275,10 +11275,10 @@
           <w:noProof/>
         </w:rPr>
         <w:drawing>
-          <wp:inline distT="0" distB="0" distL="0" distR="0" wp14:anchorId="52C9EDCF" wp14:editId="27B509B9">
+          <wp:inline distT="0" distB="0" distL="0" distR="0" wp14:anchorId="2BF3504C" wp14:editId="305C3E2A">
             <wp:extent cx="5715000" cy="4171950"/>
             <wp:effectExtent l="0" t="0" r="0" b="0"/>
-            <wp:docPr id="1599746134" name="fe-06-partner.png" descr="fe-06-partner.png" title="fe-06-partner.png"/>
+            <wp:docPr id="1581078779" name="fe-06-partner.png" descr="fe-06-partner.png" title="fe-06-partner.png"/>
             <wp:cNvGraphicFramePr>
               <a:graphicFrameLocks xmlns:a="http://schemas.openxmlformats.org/drawingml/2006/main" noChangeAspect="1"/>
             </wp:cNvGraphicFramePr>
@@ -11334,7 +11334,7 @@
       <w:pPr>
         <w:pStyle w:val="Heading2"/>
       </w:pPr>
-      <w:bookmarkStart w:id="25" w:name="_Toc239915180"/>
+      <w:bookmarkStart w:id="25" w:name="_Toc239916451"/>
       <w:r>
         <w:t>4.8 Module 8 — Real-Time Order Status for Customer</w:t>
       </w:r>
@@ -11384,10 +11384,10 @@
           <w:noProof/>
         </w:rPr>
         <w:drawing>
-          <wp:inline distT="0" distB="0" distL="0" distR="0" wp14:anchorId="6742CAC8" wp14:editId="086A4CED">
+          <wp:inline distT="0" distB="0" distL="0" distR="0" wp14:anchorId="5DC9A0D5" wp14:editId="1B2BE179">
             <wp:extent cx="5715000" cy="3067050"/>
             <wp:effectExtent l="0" t="0" r="0" b="0"/>
-            <wp:docPr id="1472268356" name="Get_order_1.png" descr="Get_order_1.png" title="Get_order_1.png"/>
+            <wp:docPr id="248520466" name="Get_order_1.png" descr="Get_order_1.png" title="Get_order_1.png"/>
             <wp:cNvGraphicFramePr>
               <a:graphicFrameLocks xmlns:a="http://schemas.openxmlformats.org/drawingml/2006/main" noChangeAspect="1"/>
             </wp:cNvGraphicFramePr>
@@ -11449,10 +11449,10 @@
           <w:noProof/>
         </w:rPr>
         <w:drawing>
-          <wp:inline distT="0" distB="0" distL="0" distR="0" wp14:anchorId="7115D3A5" wp14:editId="6D655FF1">
+          <wp:inline distT="0" distB="0" distL="0" distR="0" wp14:anchorId="7D75AD7A" wp14:editId="268D2F50">
             <wp:extent cx="5715000" cy="3076575"/>
             <wp:effectExtent l="0" t="0" r="0" b="0"/>
-            <wp:docPr id="1349464573" name="Get_order_2.png" descr="Get_order_2.png" title="Get_order_2.png"/>
+            <wp:docPr id="1105566639" name="Get_order_2.png" descr="Get_order_2.png" title="Get_order_2.png"/>
             <wp:cNvGraphicFramePr>
               <a:graphicFrameLocks xmlns:a="http://schemas.openxmlformats.org/drawingml/2006/main" noChangeAspect="1"/>
             </wp:cNvGraphicFramePr>
@@ -11514,10 +11514,10 @@
           <w:noProof/>
         </w:rPr>
         <w:drawing>
-          <wp:inline distT="0" distB="0" distL="0" distR="0" wp14:anchorId="651E9C41" wp14:editId="625D659E">
+          <wp:inline distT="0" distB="0" distL="0" distR="0" wp14:anchorId="115CCBA2" wp14:editId="2FFCC8D7">
             <wp:extent cx="5715000" cy="3105150"/>
             <wp:effectExtent l="0" t="0" r="0" b="0"/>
-            <wp:docPr id="515004343" name="Get_order_3.png" descr="Get_order_3.png" title="Get_order_3.png"/>
+            <wp:docPr id="658855973" name="Get_order_3.png" descr="Get_order_3.png" title="Get_order_3.png"/>
             <wp:cNvGraphicFramePr>
               <a:graphicFrameLocks xmlns:a="http://schemas.openxmlformats.org/drawingml/2006/main" noChangeAspect="1"/>
             </wp:cNvGraphicFramePr>
@@ -11579,10 +11579,10 @@
           <w:noProof/>
         </w:rPr>
         <w:drawing>
-          <wp:inline distT="0" distB="0" distL="0" distR="0" wp14:anchorId="34104FD7" wp14:editId="70D3C517">
+          <wp:inline distT="0" distB="0" distL="0" distR="0" wp14:anchorId="0FB1A26C" wp14:editId="2CB0B332">
             <wp:extent cx="5715000" cy="3067050"/>
             <wp:effectExtent l="0" t="0" r="0" b="0"/>
-            <wp:docPr id="1949305494" name="Get_order_4.png" descr="Get_order_4.png" title="Get_order_4.png"/>
+            <wp:docPr id="371472995" name="Get_order_4.png" descr="Get_order_4.png" title="Get_order_4.png"/>
             <wp:cNvGraphicFramePr>
               <a:graphicFrameLocks xmlns:a="http://schemas.openxmlformats.org/drawingml/2006/main" noChangeAspect="1"/>
             </wp:cNvGraphicFramePr>
@@ -11638,7 +11638,7 @@
       <w:pPr>
         <w:pStyle w:val="Heading2"/>
       </w:pPr>
-      <w:bookmarkStart w:id="26" w:name="_Toc239915181"/>
+      <w:bookmarkStart w:id="26" w:name="_Toc239916452"/>
       <w:r>
         <w:t>4.9 Module 9 — Stock Replenishment Alerts</w:t>
       </w:r>
@@ -11688,10 +11688,10 @@
           <w:noProof/>
         </w:rPr>
         <w:drawing>
-          <wp:inline distT="0" distB="0" distL="0" distR="0" wp14:anchorId="073D0955" wp14:editId="4B9BACAA">
+          <wp:inline distT="0" distB="0" distL="0" distR="0" wp14:anchorId="11D75437" wp14:editId="0CC68DA9">
             <wp:extent cx="5715000" cy="3086100"/>
             <wp:effectExtent l="0" t="0" r="0" b="0"/>
-            <wp:docPr id="689492721" name="Stock_replenishment_alert.png" descr="Stock_replenishment_alert.png" title="Stock_replenishment_alert.png"/>
+            <wp:docPr id="16524331" name="Stock_replenishment_alert.png" descr="Stock_replenishment_alert.png" title="Stock_replenishment_alert.png"/>
             <wp:cNvGraphicFramePr>
               <a:graphicFrameLocks xmlns:a="http://schemas.openxmlformats.org/drawingml/2006/main" noChangeAspect="1"/>
             </wp:cNvGraphicFramePr>
@@ -11747,7 +11747,7 @@
       <w:pPr>
         <w:pStyle w:val="Heading2"/>
       </w:pPr>
-      <w:bookmarkStart w:id="27" w:name="_Toc239915182"/>
+      <w:bookmarkStart w:id="27" w:name="_Toc239916453"/>
       <w:r>
         <w:t>4.10 Module 10 — Delivery Time Slot Selection</w:t>
       </w:r>
@@ -11797,10 +11797,10 @@
           <w:noProof/>
         </w:rPr>
         <w:drawing>
-          <wp:inline distT="0" distB="0" distL="0" distR="0" wp14:anchorId="2E3BC4BC" wp14:editId="45F72502">
+          <wp:inline distT="0" distB="0" distL="0" distR="0" wp14:anchorId="38355167" wp14:editId="7080C16B">
             <wp:extent cx="5715000" cy="3114675"/>
             <wp:effectExtent l="0" t="0" r="0" b="0"/>
-            <wp:docPr id="1922507266" name="Delivery_slots_1.png" descr="Delivery_slots_1.png" title="Delivery_slots_1.png"/>
+            <wp:docPr id="2063841273" name="Delivery_slots_1.png" descr="Delivery_slots_1.png" title="Delivery_slots_1.png"/>
             <wp:cNvGraphicFramePr>
               <a:graphicFrameLocks xmlns:a="http://schemas.openxmlformats.org/drawingml/2006/main" noChangeAspect="1"/>
             </wp:cNvGraphicFramePr>
@@ -11856,7 +11856,7 @@
       <w:pPr>
         <w:pStyle w:val="Heading2"/>
       </w:pPr>
-      <w:bookmarkStart w:id="28" w:name="_Toc239915183"/>
+      <w:bookmarkStart w:id="28" w:name="_Toc239916454"/>
       <w:r>
         <w:t>4.11 Module 11 — Customer Order History &amp; Reorder</w:t>
       </w:r>
@@ -11920,10 +11920,10 @@
           <w:noProof/>
         </w:rPr>
         <w:drawing>
-          <wp:inline distT="0" distB="0" distL="0" distR="0" wp14:anchorId="355386DC" wp14:editId="60696430">
+          <wp:inline distT="0" distB="0" distL="0" distR="0" wp14:anchorId="16892062" wp14:editId="25AC027B">
             <wp:extent cx="5715000" cy="3105150"/>
             <wp:effectExtent l="0" t="0" r="0" b="0"/>
-            <wp:docPr id="1449631830" name="Order_history_1.png" descr="Order_history_1.png" title="Order_history_1.png"/>
+            <wp:docPr id="1552038277" name="Order_history_1.png" descr="Order_history_1.png" title="Order_history_1.png"/>
             <wp:cNvGraphicFramePr>
               <a:graphicFrameLocks xmlns:a="http://schemas.openxmlformats.org/drawingml/2006/main" noChangeAspect="1"/>
             </wp:cNvGraphicFramePr>
@@ -11985,10 +11985,10 @@
           <w:noProof/>
         </w:rPr>
         <w:drawing>
-          <wp:inline distT="0" distB="0" distL="0" distR="0" wp14:anchorId="46355D1B" wp14:editId="08419C38">
+          <wp:inline distT="0" distB="0" distL="0" distR="0" wp14:anchorId="52E7E8F9" wp14:editId="25E16C74">
             <wp:extent cx="5715000" cy="3114675"/>
             <wp:effectExtent l="0" t="0" r="0" b="0"/>
-            <wp:docPr id="801471259" name="Reorder_1.png" descr="Reorder_1.png" title="Reorder_1.png"/>
+            <wp:docPr id="576899623" name="Reorder_1.png" descr="Reorder_1.png" title="Reorder_1.png"/>
             <wp:cNvGraphicFramePr>
               <a:graphicFrameLocks xmlns:a="http://schemas.openxmlformats.org/drawingml/2006/main" noChangeAspect="1"/>
             </wp:cNvGraphicFramePr>
@@ -12050,10 +12050,10 @@
           <w:noProof/>
         </w:rPr>
         <w:drawing>
-          <wp:inline distT="0" distB="0" distL="0" distR="0" wp14:anchorId="5812C7CA" wp14:editId="63877A1B">
+          <wp:inline distT="0" distB="0" distL="0" distR="0" wp14:anchorId="540A695E" wp14:editId="2E792313">
             <wp:extent cx="5715000" cy="4171950"/>
             <wp:effectExtent l="0" t="0" r="0" b="0"/>
-            <wp:docPr id="909230571" name="fe-04-customer-orders.png" descr="fe-04-customer-orders.png" title="fe-04-customer-orders.png"/>
+            <wp:docPr id="1070447787" name="fe-04-customer-orders.png" descr="fe-04-customer-orders.png" title="fe-04-customer-orders.png"/>
             <wp:cNvGraphicFramePr>
               <a:graphicFrameLocks xmlns:a="http://schemas.openxmlformats.org/drawingml/2006/main" noChangeAspect="1"/>
             </wp:cNvGraphicFramePr>
@@ -12109,7 +12109,7 @@
       <w:pPr>
         <w:pStyle w:val="Heading2"/>
       </w:pPr>
-      <w:bookmarkStart w:id="29" w:name="_Toc239915184"/>
+      <w:bookmarkStart w:id="29" w:name="_Toc239916455"/>
       <w:r>
         <w:t>4.12 Module 12 — Store &amp; Delivery Performance Reports</w:t>
       </w:r>
@@ -12159,10 +12159,10 @@
           <w:noProof/>
         </w:rPr>
         <w:drawing>
-          <wp:inline distT="0" distB="0" distL="0" distR="0" wp14:anchorId="5F6442F6" wp14:editId="2469B973">
+          <wp:inline distT="0" distB="0" distL="0" distR="0" wp14:anchorId="78436744" wp14:editId="4CDD93F6">
             <wp:extent cx="5715000" cy="3105150"/>
             <wp:effectExtent l="0" t="0" r="0" b="0"/>
-            <wp:docPr id="1749522322" name="Performance report.png" descr="Performance report.png" title="Performance report.png"/>
+            <wp:docPr id="1245260198" name="Performance report.png" descr="Performance report.png" title="Performance report.png"/>
             <wp:cNvGraphicFramePr>
               <a:graphicFrameLocks xmlns:a="http://schemas.openxmlformats.org/drawingml/2006/main" noChangeAspect="1"/>
             </wp:cNvGraphicFramePr>
@@ -12224,10 +12224,10 @@
           <w:noProof/>
         </w:rPr>
         <w:drawing>
-          <wp:inline distT="0" distB="0" distL="0" distR="0" wp14:anchorId="06FC41B4" wp14:editId="16715077">
+          <wp:inline distT="0" distB="0" distL="0" distR="0" wp14:anchorId="6B8232BC" wp14:editId="7CE1457D">
             <wp:extent cx="5715000" cy="4171950"/>
             <wp:effectExtent l="0" t="0" r="0" b="0"/>
-            <wp:docPr id="1757577505" name="fe-07-admin-report.png" descr="fe-07-admin-report.png" title="fe-07-admin-report.png"/>
+            <wp:docPr id="1839397741" name="fe-07-admin-report.png" descr="fe-07-admin-report.png" title="fe-07-admin-report.png"/>
             <wp:cNvGraphicFramePr>
               <a:graphicFrameLocks xmlns:a="http://schemas.openxmlformats.org/drawingml/2006/main" noChangeAspect="1"/>
             </wp:cNvGraphicFramePr>
@@ -12283,7 +12283,7 @@
       <w:pPr>
         <w:pStyle w:val="Heading2"/>
       </w:pPr>
-      <w:bookmarkStart w:id="30" w:name="_Toc239915185"/>
+      <w:bookmarkStart w:id="30" w:name="_Toc239916456"/>
       <w:r>
         <w:t>4.13 Module 13 — Role-Based Access Control</w:t>
       </w:r>
@@ -12361,10 +12361,10 @@
           <w:noProof/>
         </w:rPr>
         <w:drawing>
-          <wp:inline distT="0" distB="0" distL="0" distR="0" wp14:anchorId="14288FF1" wp14:editId="7326D88E">
+          <wp:inline distT="0" distB="0" distL="0" distR="0" wp14:anchorId="6933BB87" wp14:editId="00AE1246">
             <wp:extent cx="5715000" cy="3086100"/>
             <wp:effectExtent l="0" t="0" r="0" b="0"/>
-            <wp:docPr id="570231053" name="401_No_token.png" descr="401_No_token.png" title="401_No_token.png"/>
+            <wp:docPr id="1032301021" name="401_No_token.png" descr="401_No_token.png" title="401_No_token.png"/>
             <wp:cNvGraphicFramePr>
               <a:graphicFrameLocks xmlns:a="http://schemas.openxmlformats.org/drawingml/2006/main" noChangeAspect="1"/>
             </wp:cNvGraphicFramePr>
@@ -12426,10 +12426,10 @@
           <w:noProof/>
         </w:rPr>
         <w:drawing>
-          <wp:inline distT="0" distB="0" distL="0" distR="0" wp14:anchorId="344EAEC8" wp14:editId="4993F769">
+          <wp:inline distT="0" distB="0" distL="0" distR="0" wp14:anchorId="30FFADF2" wp14:editId="5BC0DE54">
             <wp:extent cx="5715000" cy="3076575"/>
             <wp:effectExtent l="0" t="0" r="0" b="0"/>
-            <wp:docPr id="1324185460" name="403_Customer_calls_admin_report.png" descr="403_Customer_calls_admin_report.png" title="403_Customer_calls_admin_report.png"/>
+            <wp:docPr id="262634036" name="403_Customer_calls_admin_report.png" descr="403_Customer_calls_admin_report.png" title="403_Customer_calls_admin_report.png"/>
             <wp:cNvGraphicFramePr>
               <a:graphicFrameLocks xmlns:a="http://schemas.openxmlformats.org/drawingml/2006/main" noChangeAspect="1"/>
             </wp:cNvGraphicFramePr>
@@ -12490,7 +12490,7 @@
       <w:pPr>
         <w:pStyle w:val="Heading1"/>
       </w:pPr>
-      <w:bookmarkStart w:id="31" w:name="_Toc239915186"/>
+      <w:bookmarkStart w:id="31" w:name="_Toc239916457"/>
       <w:r>
         <w:t>5. Complete API Endpoint Reference</w:t>
       </w:r>
@@ -12500,7 +12500,7 @@
       <w:pPr>
         <w:pStyle w:val="Heading2"/>
       </w:pPr>
-      <w:bookmarkStart w:id="32" w:name="_Toc239915187"/>
+      <w:bookmarkStart w:id="32" w:name="_Toc239916458"/>
       <w:r>
         <w:t>5.1 Auth</w:t>
       </w:r>
@@ -13017,7 +13017,7 @@
       <w:pPr>
         <w:pStyle w:val="Heading2"/>
       </w:pPr>
-      <w:bookmarkStart w:id="33" w:name="_Toc239915188"/>
+      <w:bookmarkStart w:id="33" w:name="_Toc239916459"/>
       <w:r>
         <w:t>5.2 Dark-Stores &amp; Store Stock</w:t>
       </w:r>
@@ -14462,7 +14462,7 @@
       <w:pPr>
         <w:pStyle w:val="Heading2"/>
       </w:pPr>
-      <w:bookmarkStart w:id="34" w:name="_Toc239915189"/>
+      <w:bookmarkStart w:id="34" w:name="_Toc239916460"/>
       <w:r>
         <w:t>5.3 Products</w:t>
       </w:r>
@@ -15211,7 +15211,7 @@
       <w:pPr>
         <w:pStyle w:val="Heading2"/>
       </w:pPr>
-      <w:bookmarkStart w:id="35" w:name="_Toc239915190"/>
+      <w:bookmarkStart w:id="35" w:name="_Toc239916461"/>
       <w:r>
         <w:t>5.4 Orders</w:t>
       </w:r>
@@ -16308,7 +16308,7 @@
       <w:pPr>
         <w:pStyle w:val="Heading2"/>
       </w:pPr>
-      <w:bookmarkStart w:id="36" w:name="_Toc239915191"/>
+      <w:bookmarkStart w:id="36" w:name="_Toc239916462"/>
       <w:r>
         <w:t>5.5 Delivery Partners, Slots &amp; Admin Reports</w:t>
       </w:r>
@@ -17062,7 +17062,7 @@
       <w:pPr>
         <w:pStyle w:val="Heading1"/>
       </w:pPr>
-      <w:bookmarkStart w:id="37" w:name="_Toc239915192"/>
+      <w:bookmarkStart w:id="37" w:name="_Toc239916463"/>
       <w:r>
         <w:t>6. Testing, Validation &amp; Error Handling</w:t>
       </w:r>
@@ -17080,7 +17080,7 @@
       <w:pPr>
         <w:pStyle w:val="Heading2"/>
       </w:pPr>
-      <w:bookmarkStart w:id="38" w:name="_Toc239915193"/>
+      <w:bookmarkStart w:id="38" w:name="_Toc239916464"/>
       <w:r>
         <w:t>6.1 Negative &amp; Edge Cases</w:t>
       </w:r>
@@ -17668,10 +17668,10 @@
           <w:noProof/>
         </w:rPr>
         <w:drawing>
-          <wp:inline distT="0" distB="0" distL="0" distR="0" wp14:anchorId="4C875F4B" wp14:editId="005FAC86">
+          <wp:inline distT="0" distB="0" distL="0" distR="0" wp14:anchorId="111E1173" wp14:editId="49902B2A">
             <wp:extent cx="5715000" cy="3124200"/>
             <wp:effectExtent l="0" t="0" r="0" b="0"/>
-            <wp:docPr id="1059464160" name="400_Register _missing_fields.png" descr="400_Register _missing_fields.png" title="400_Register _missing_fields.png"/>
+            <wp:docPr id="628679438" name="400_Register _missing_fields.png" descr="400_Register _missing_fields.png" title="400_Register _missing_fields.png"/>
             <wp:cNvGraphicFramePr>
               <a:graphicFrameLocks xmlns:a="http://schemas.openxmlformats.org/drawingml/2006/main" noChangeAspect="1"/>
             </wp:cNvGraphicFramePr>
@@ -17733,10 +17733,10 @@
           <w:noProof/>
         </w:rPr>
         <w:drawing>
-          <wp:inline distT="0" distB="0" distL="0" distR="0" wp14:anchorId="716A2FD9" wp14:editId="11BA8741">
+          <wp:inline distT="0" distB="0" distL="0" distR="0" wp14:anchorId="3AD4C18D" wp14:editId="0F120927">
             <wp:extent cx="5715000" cy="3124200"/>
             <wp:effectExtent l="0" t="0" r="0" b="0"/>
-            <wp:docPr id="1653369883" name="404_Invalid_ID.png" descr="404_Invalid_ID.png" title="404_Invalid_ID.png"/>
+            <wp:docPr id="1109426473" name="404_Invalid_ID.png" descr="404_Invalid_ID.png" title="404_Invalid_ID.png"/>
             <wp:cNvGraphicFramePr>
               <a:graphicFrameLocks xmlns:a="http://schemas.openxmlformats.org/drawingml/2006/main" noChangeAspect="1"/>
             </wp:cNvGraphicFramePr>
@@ -17798,10 +17798,10 @@
           <w:noProof/>
         </w:rPr>
         <w:drawing>
-          <wp:inline distT="0" distB="0" distL="0" distR="0" wp14:anchorId="3BE38E5F" wp14:editId="23D9B079">
+          <wp:inline distT="0" distB="0" distL="0" distR="0" wp14:anchorId="41F5E938" wp14:editId="1200F133">
             <wp:extent cx="5715000" cy="3095625"/>
             <wp:effectExtent l="0" t="0" r="0" b="0"/>
-            <wp:docPr id="964932019" name="409_Out_of_stock.png" descr="409_Out_of_stock.png" title="409_Out_of_stock.png"/>
+            <wp:docPr id="956374691" name="409_Out_of_stock.png" descr="409_Out_of_stock.png" title="409_Out_of_stock.png"/>
             <wp:cNvGraphicFramePr>
               <a:graphicFrameLocks xmlns:a="http://schemas.openxmlformats.org/drawingml/2006/main" noChangeAspect="1"/>
             </wp:cNvGraphicFramePr>
@@ -17857,7 +17857,7 @@
       <w:pPr>
         <w:pStyle w:val="Heading2"/>
       </w:pPr>
-      <w:bookmarkStart w:id="39" w:name="_Toc239915194"/>
+      <w:bookmarkStart w:id="39" w:name="_Toc239916465"/>
       <w:r>
         <w:t>6.2 Validation &amp; Error-Handling Design</w:t>
       </w:r>
@@ -17924,7 +17924,7 @@
       <w:pPr>
         <w:pStyle w:val="Heading1"/>
       </w:pPr>
-      <w:bookmarkStart w:id="40" w:name="_Toc239915195"/>
+      <w:bookmarkStart w:id="40" w:name="_Toc239916466"/>
       <w:r>
         <w:t>7. Setup &amp; Run Instructions</w:t>
       </w:r>
@@ -18151,7 +18151,7 @@
       <w:pPr>
         <w:pStyle w:val="Heading2"/>
       </w:pPr>
-      <w:bookmarkStart w:id="41" w:name="_Toc239915196"/>
+      <w:bookmarkStart w:id="41" w:name="_Toc239916467"/>
       <w:r>
         <w:t>7.1 Seed Accounts</w:t>
       </w:r>
@@ -18644,7 +18644,7 @@
       <w:pPr>
         <w:pStyle w:val="Heading1"/>
       </w:pPr>
-      <w:bookmarkStart w:id="42" w:name="_Toc239915197"/>
+      <w:bookmarkStart w:id="42" w:name="_Toc239916468"/>
       <w:r>
         <w:t>8. Known Limitations</w:t>
       </w:r>
@@ -18719,7 +18719,7 @@
       <w:pPr>
         <w:pStyle w:val="Heading1"/>
       </w:pPr>
-      <w:bookmarkStart w:id="43" w:name="_Toc239915198"/>
+      <w:bookmarkStart w:id="43" w:name="_Toc239916469"/>
       <w:r>
         <w:t>9. Learnings &amp; Challenges</w:t>
       </w:r>
@@ -18807,7 +18807,7 @@
       <w:pPr>
         <w:pStyle w:val="Heading1"/>
       </w:pPr>
-      <w:bookmarkStart w:id="44" w:name="_Toc239915199"/>
+      <w:bookmarkStart w:id="44" w:name="_Toc239916470"/>
       <w:r>
         <w:t>10. Conclusion</w:t>
       </w:r>
@@ -19023,10 +19023,10 @@
 <file path=word/numbering.xml><?xml version="1.0" encoding="utf-8"?>
 <w:numbering xmlns:wpc="http://schemas.microsoft.com/office/word/2010/wordprocessingCanvas" xmlns:cx="http://schemas.microsoft.com/office/drawing/2014/chartex" xmlns:cx1="http://schemas.microsoft.com/office/drawing/2015/9/8/chartex" xmlns:cx2="http://schemas.microsoft.com/office/drawing/2015/10/21/chartex" xmlns:cx3="http://schemas.microsoft.com/office/drawing/2016/5/9/chartex" xmlns:cx4="http://schemas.microsoft.com/office/drawing/2016/5/10/chartex" xmlns:cx5="http://schemas.microsoft.com/office/drawing/2016/5/11/chartex" xmlns:cx6="http://schemas.microsoft.com/office/drawing/2016/5/12/chartex" xmlns:cx7="http://schemas.microsoft.com/office/drawing/2016/5/13/chartex" xmlns:cx8="http://schemas.microsoft.com/office/drawing/2016/5/14/chartex" xmlns:mc="http://schemas.openxmlformats.org/markup-compatibility/2006" xmlns:aink="http://schemas.microsoft.com/office/drawing/2016/ink" xmlns:am3d="http://schemas.microsoft.com/office/drawing/2017/model3d" xmlns:o="urn:schemas-microsoft-com:office:office" xmlns:oel="http://schemas.microsoft.com/office/2019/extlst" xmlns:r="http://schemas.openxmlformats.org/officeDocument/2006/relationships" xmlns:m="http://schemas.openxmlformats.org/officeDocument/2006/math" xmlns:v="urn:schemas-microsoft-com:vml" xmlns:wp14="http://schemas.microsoft.com/office/word/2010/wordprocessingDrawing" xmlns:wp="http://schemas.openxmlformats.org/drawingml/2006/wordprocessingDrawing" xmlns:w10="urn:schemas-microsoft-com:office:word" xmlns:w="http://schemas.openxmlformats.org/wordprocessingml/2006/main" xmlns:w14="http://schemas.microsoft.com/office/word/2010/wordml" xmlns:w15="http://schemas.microsoft.com/office/word/2012/wordml" xmlns:w16cex="http://schemas.microsoft.com/office/word/2018/wordml/cex" xmlns:w16cid="http://schemas.microsoft.com/office/word/2016/wordml/cid" xmlns:w16="http://schemas.microsoft.com/office/word/2018/wordml" xmlns:w16du="http://schemas.microsoft.com/office/word/2023/wordml/word16du" xmlns:w16sdtdh="http://schemas.microsoft.com/office/word/2020/wordml/sdtdatahash" xmlns:w16sdtfl="http://schemas.microsoft.com/office/word/2024/wordml/sdtformatlock" xmlns:w16se="http://schemas.microsoft.com/office/word/2015/wordml/symex" xmlns:wpg="http://schemas.microsoft.com/office/word/2010/wordprocessingGroup" xmlns:wpi="http://schemas.microsoft.com/office/word/2010/wordprocessingInk" xmlns:wne="http://schemas.microsoft.com/office/word/2006/wordml" xmlns:wps="http://schemas.microsoft.com/office/word/2010/wordprocessingShape" mc:Ignorable="w14 w15 w16se w16cid w16 w16cex w16sdtdh w16sdtfl w16du wp14">
   <w:abstractNum w:abstractNumId="0" w15:restartNumberingAfterBreak="0">
-    <w:nsid w:val="07EC144B"/>
+    <w:nsid w:val="45F33614"/>
     <w:multiLevelType w:val="hybridMultilevel"/>
-    <w:tmpl w:val="4B60286C"/>
-    <w:lvl w:ilvl="0" w:tplc="4190AC04">
+    <w:tmpl w:val="625E4464"/>
+    <w:lvl w:ilvl="0" w:tplc="3AE6DA0C">
       <w:start w:val="1"/>
       <w:numFmt w:val="bullet"/>
       <w:lvlText w:val="●"/>
@@ -19035,7 +19035,7 @@
         <w:ind w:left="720" w:hanging="360"/>
       </w:pPr>
     </w:lvl>
-    <w:lvl w:ilvl="1" w:tplc="BDC850D6">
+    <w:lvl w:ilvl="1" w:tplc="ABF689BA">
       <w:start w:val="1"/>
       <w:numFmt w:val="bullet"/>
       <w:lvlText w:val="○"/>
@@ -19044,7 +19044,7 @@
         <w:ind w:left="1440" w:hanging="360"/>
       </w:pPr>
     </w:lvl>
-    <w:lvl w:ilvl="2" w:tplc="B6B4ADA6">
+    <w:lvl w:ilvl="2" w:tplc="06DA20BC">
       <w:start w:val="1"/>
       <w:numFmt w:val="bullet"/>
       <w:lvlText w:val="■"/>
@@ -19053,7 +19053,7 @@
         <w:ind w:left="2160" w:hanging="360"/>
       </w:pPr>
     </w:lvl>
-    <w:lvl w:ilvl="3" w:tplc="5256238E">
+    <w:lvl w:ilvl="3" w:tplc="2FD0CE64">
       <w:start w:val="1"/>
       <w:numFmt w:val="bullet"/>
       <w:lvlText w:val="●"/>
@@ -19062,7 +19062,7 @@
         <w:ind w:left="2880" w:hanging="360"/>
       </w:pPr>
     </w:lvl>
-    <w:lvl w:ilvl="4" w:tplc="5C2C61E8">
+    <w:lvl w:ilvl="4" w:tplc="55CE215C">
       <w:start w:val="1"/>
       <w:numFmt w:val="bullet"/>
       <w:lvlText w:val="○"/>
@@ -19071,7 +19071,7 @@
         <w:ind w:left="3600" w:hanging="360"/>
       </w:pPr>
     </w:lvl>
-    <w:lvl w:ilvl="5" w:tplc="7D524074">
+    <w:lvl w:ilvl="5" w:tplc="365255F2">
       <w:start w:val="1"/>
       <w:numFmt w:val="bullet"/>
       <w:lvlText w:val="■"/>
@@ -19080,7 +19080,7 @@
         <w:ind w:left="4320" w:hanging="360"/>
       </w:pPr>
     </w:lvl>
-    <w:lvl w:ilvl="6" w:tplc="0AB8A626">
+    <w:lvl w:ilvl="6" w:tplc="863E71AC">
       <w:start w:val="1"/>
       <w:numFmt w:val="bullet"/>
       <w:lvlText w:val="●"/>
@@ -19089,7 +19089,7 @@
         <w:ind w:left="5040" w:hanging="360"/>
       </w:pPr>
     </w:lvl>
-    <w:lvl w:ilvl="7" w:tplc="A8FEBC2E">
+    <w:lvl w:ilvl="7" w:tplc="59F0E70C">
       <w:start w:val="1"/>
       <w:numFmt w:val="bullet"/>
       <w:lvlText w:val="●"/>
@@ -19098,7 +19098,7 @@
         <w:ind w:left="5760" w:hanging="360"/>
       </w:pPr>
     </w:lvl>
-    <w:lvl w:ilvl="8" w:tplc="BD8C50AE">
+    <w:lvl w:ilvl="8" w:tplc="42922722">
       <w:start w:val="1"/>
       <w:numFmt w:val="bullet"/>
       <w:lvlText w:val="●"/>
@@ -19109,127 +19109,127 @@
     </w:lvl>
   </w:abstractNum>
   <w:abstractNum w:abstractNumId="1" w15:restartNumberingAfterBreak="0">
-    <w:nsid w:val="39BC2963"/>
+    <w:nsid w:val="465855AB"/>
     <w:multiLevelType w:val="hybridMultilevel"/>
-    <w:tmpl w:val="F5E6030E"/>
-    <w:lvl w:ilvl="0" w:tplc="8710D2C0">
+    <w:tmpl w:val="8146B89E"/>
+    <w:lvl w:ilvl="0" w:tplc="153E35BA">
       <w:start w:val="1"/>
-      <w:numFmt w:val="decimal"/>
-      <w:lvlText w:val="%1."/>
+      <w:numFmt w:val="bullet"/>
+      <w:lvlText w:val="•"/>
       <w:lvlJc w:val="left"/>
       <w:pPr>
         <w:ind w:left="480" w:hanging="280"/>
       </w:pPr>
     </w:lvl>
-    <w:lvl w:ilvl="1" w:tplc="9D2E8458">
+    <w:lvl w:ilvl="1" w:tplc="A57C2404">
       <w:numFmt w:val="decimal"/>
       <w:lvlText w:val=""/>
       <w:lvlJc w:val="left"/>
     </w:lvl>
-    <w:lvl w:ilvl="2" w:tplc="C4C0818A">
+    <w:lvl w:ilvl="2" w:tplc="0E8ED01E">
       <w:numFmt w:val="decimal"/>
       <w:lvlText w:val=""/>
       <w:lvlJc w:val="left"/>
     </w:lvl>
-    <w:lvl w:ilvl="3" w:tplc="1C148C7E">
+    <w:lvl w:ilvl="3" w:tplc="A4E8D202">
       <w:numFmt w:val="decimal"/>
       <w:lvlText w:val=""/>
       <w:lvlJc w:val="left"/>
     </w:lvl>
-    <w:lvl w:ilvl="4" w:tplc="5ED4449E">
+    <w:lvl w:ilvl="4" w:tplc="3814C5BA">
       <w:numFmt w:val="decimal"/>
       <w:lvlText w:val=""/>
       <w:lvlJc w:val="left"/>
     </w:lvl>
-    <w:lvl w:ilvl="5" w:tplc="AF88A90C">
+    <w:lvl w:ilvl="5" w:tplc="070CBC9C">
       <w:numFmt w:val="decimal"/>
       <w:lvlText w:val=""/>
       <w:lvlJc w:val="left"/>
     </w:lvl>
-    <w:lvl w:ilvl="6" w:tplc="9F70F438">
+    <w:lvl w:ilvl="6" w:tplc="2010907A">
       <w:numFmt w:val="decimal"/>
       <w:lvlText w:val=""/>
       <w:lvlJc w:val="left"/>
     </w:lvl>
-    <w:lvl w:ilvl="7" w:tplc="B8F2C97C">
+    <w:lvl w:ilvl="7" w:tplc="26D29EFC">
       <w:numFmt w:val="decimal"/>
       <w:lvlText w:val=""/>
       <w:lvlJc w:val="left"/>
     </w:lvl>
-    <w:lvl w:ilvl="8" w:tplc="1898E07C">
+    <w:lvl w:ilvl="8" w:tplc="9EC0C0AC">
       <w:numFmt w:val="decimal"/>
       <w:lvlText w:val=""/>
       <w:lvlJc w:val="left"/>
     </w:lvl>
   </w:abstractNum>
   <w:abstractNum w:abstractNumId="2" w15:restartNumberingAfterBreak="0">
-    <w:nsid w:val="7A222A9D"/>
+    <w:nsid w:val="4BAE1BB0"/>
     <w:multiLevelType w:val="hybridMultilevel"/>
-    <w:tmpl w:val="1C265862"/>
-    <w:lvl w:ilvl="0" w:tplc="1ED08E90">
+    <w:tmpl w:val="B06E168C"/>
+    <w:lvl w:ilvl="0" w:tplc="58949C08">
       <w:start w:val="1"/>
-      <w:numFmt w:val="bullet"/>
-      <w:lvlText w:val="•"/>
+      <w:numFmt w:val="decimal"/>
+      <w:lvlText w:val="%1."/>
       <w:lvlJc w:val="left"/>
       <w:pPr>
         <w:ind w:left="480" w:hanging="280"/>
       </w:pPr>
     </w:lvl>
-    <w:lvl w:ilvl="1" w:tplc="9F8C269A">
+    <w:lvl w:ilvl="1" w:tplc="6E90E6AA">
       <w:numFmt w:val="decimal"/>
       <w:lvlText w:val=""/>
       <w:lvlJc w:val="left"/>
     </w:lvl>
-    <w:lvl w:ilvl="2" w:tplc="4E2A2D30">
+    <w:lvl w:ilvl="2" w:tplc="C7687A44">
       <w:numFmt w:val="decimal"/>
       <w:lvlText w:val=""/>
       <w:lvlJc w:val="left"/>
     </w:lvl>
-    <w:lvl w:ilvl="3" w:tplc="E4040F5A">
+    <w:lvl w:ilvl="3" w:tplc="2290656A">
       <w:numFmt w:val="decimal"/>
       <w:lvlText w:val=""/>
       <w:lvlJc w:val="left"/>
     </w:lvl>
-    <w:lvl w:ilvl="4" w:tplc="6E261D62">
+    <w:lvl w:ilvl="4" w:tplc="14902CC4">
       <w:numFmt w:val="decimal"/>
       <w:lvlText w:val=""/>
       <w:lvlJc w:val="left"/>
     </w:lvl>
-    <w:lvl w:ilvl="5" w:tplc="A7A4D430">
+    <w:lvl w:ilvl="5" w:tplc="E624AC8E">
       <w:numFmt w:val="decimal"/>
       <w:lvlText w:val=""/>
       <w:lvlJc w:val="left"/>
     </w:lvl>
-    <w:lvl w:ilvl="6" w:tplc="C48E3388">
+    <w:lvl w:ilvl="6" w:tplc="55B2E6C0">
       <w:numFmt w:val="decimal"/>
       <w:lvlText w:val=""/>
       <w:lvlJc w:val="left"/>
     </w:lvl>
-    <w:lvl w:ilvl="7" w:tplc="7AAA319E">
+    <w:lvl w:ilvl="7" w:tplc="FF24A526">
       <w:numFmt w:val="decimal"/>
       <w:lvlText w:val=""/>
       <w:lvlJc w:val="left"/>
     </w:lvl>
-    <w:lvl w:ilvl="8" w:tplc="F932B6A8">
+    <w:lvl w:ilvl="8" w:tplc="468A7AC8">
       <w:numFmt w:val="decimal"/>
       <w:lvlText w:val=""/>
       <w:lvlJc w:val="left"/>
     </w:lvl>
   </w:abstractNum>
-  <w:num w:numId="1" w16cid:durableId="673728694">
+  <w:num w:numId="1" w16cid:durableId="499276572">
     <w:abstractNumId w:val="0"/>
     <w:lvlOverride w:ilvl="0">
       <w:startOverride w:val="1"/>
     </w:lvlOverride>
   </w:num>
-  <w:num w:numId="2" w16cid:durableId="1134714987">
-    <w:abstractNumId w:val="2"/>
+  <w:num w:numId="2" w16cid:durableId="360981348">
+    <w:abstractNumId w:val="1"/>
     <w:lvlOverride w:ilvl="0">
       <w:startOverride w:val="1"/>
     </w:lvlOverride>
   </w:num>
-  <w:num w:numId="3" w16cid:durableId="34621171">
-    <w:abstractNumId w:val="1"/>
+  <w:num w:numId="3" w16cid:durableId="2040467014">
+    <w:abstractNumId w:val="2"/>
     <w:lvlOverride w:ilvl="0">
       <w:startOverride w:val="1"/>
     </w:lvlOverride>
@@ -19847,7 +19847,7 @@
     <w:autoRedefine/>
     <w:uiPriority w:val="39"/>
     <w:unhideWhenUsed/>
-    <w:rsid w:val="00BD71AB"/>
+    <w:rsid w:val="001A6619"/>
     <w:pPr>
       <w:spacing w:after="100"/>
     </w:pPr>
@@ -19859,7 +19859,7 @@
     <w:autoRedefine/>
     <w:uiPriority w:val="39"/>
     <w:unhideWhenUsed/>
-    <w:rsid w:val="00BD71AB"/>
+    <w:rsid w:val="001A6619"/>
     <w:pPr>
       <w:spacing w:after="100"/>
       <w:ind w:left="220"/>

</xml_diff>